<commit_message>
Fix repo links and make zone-matching text match the code
- Point README badge, report header and slides at tgup0010-bot/MMA3001_FINAL
- Report Section 6, README and slide 5 now describe the lagged-correlation
  method in occupancy.sensor_matching, with its actual results; the weekend
  single-zone numbers had no code behind them
- Restore occupancy.rooms (sensor_matching_analysis.py failed to import it)
- Add a reproducible chart script for the sensor-matching results
- Restore preprocessing/rooms/evaluation tests; test regression metrics
  instead of the unused classification metric (54 tests)
- Regenerate API docs, test report and report .docx
</commit_message>
<xml_diff>
--- a/docs/report/MMA3001_Project_Report.docx
+++ b/docs/report/MMA3001_Project_Report.docx
@@ -2,7 +2,7 @@
 <file path=word/document.xml><?xml version="1.0" encoding="utf-8"?>
 <w:document xmlns:w="http://schemas.openxmlformats.org/wordprocessingml/2006/main" xmlns:m="http://schemas.openxmlformats.org/officeDocument/2006/math" xmlns:r="http://schemas.openxmlformats.org/officeDocument/2006/relationships" xmlns:o="urn:schemas-microsoft-com:office:office" xmlns:v="urn:schemas-microsoft-com:vml" xmlns:w10="urn:schemas-microsoft-com:office:word" xmlns:a="http://schemas.openxmlformats.org/drawingml/2006/main" xmlns:pic="http://schemas.openxmlformats.org/drawingml/2006/picture" xmlns:wp="http://schemas.openxmlformats.org/drawingml/2006/wordprocessingDrawing">
   <w:body>
-    <w:bookmarkStart w:id="65" w:name="Xb2a4a157712687ea76caa24e9e6d630db0597d8"/>
+    <w:bookmarkStart w:id="68" w:name="Xb2a4a157712687ea76caa24e9e6d630db0597d8"/>
     <w:p>
       <w:pPr>
         <w:pStyle w:val="Heading1"/>
@@ -52,7 +52,7 @@
         <w:t xml:space="preserve"> </w:t>
       </w:r>
       <w:r>
-        <w:t xml:space="preserve">https://github.com/tgup0010-bot/MMA_Final</w:t>
+        <w:t xml:space="preserve">https://github.com/tgup0010-bot/MMA3001_FINAL</w:t>
       </w:r>
     </w:p>
     <w:p>
@@ -3624,7 +3624,7 @@
         <w:pStyle w:val="BodyText"/>
       </w:pPr>
       <w:r>
-        <w:t xml:space="preserve">Adding building occupancy as a feature provides no measurable improvement for any model. For the Decision Tree it is actively detrimental: the model wasted splits on an irrelevant feature, and its R² fell from 0.331 to 0.191. The reason is not that occupancy is irrelevant to CO₂ in principle — the mass-balance equation establishes that it is not — but that this sensor is not co-located with any of the five monitored occupancy zones (established in Section 6). The building-level occupancy count carries no information about what is happening in this particular room.</w:t>
+        <w:t xml:space="preserve">Adding building occupancy as a feature provides no measurable improvement for any model. For the Decision Tree it is actively detrimental: the model wasted splits on an irrelevant feature, and its R² fell from 0.331 to 0.191. The reason is not that occupancy is irrelevant to CO₂ in principle — the mass-balance equation establishes that it is not — but that there is no evidence linking this sensor to any of the five monitored occupancy zones (Section 6). The building-level occupancy count carries no information about what is happening in this particular room.</w:t>
       </w:r>
     </w:p>
     <w:p>
@@ -6424,7 +6424,7 @@
     </w:p>
     <w:bookmarkEnd w:id="60"/>
     <w:bookmarkEnd w:id="61"/>
-    <w:bookmarkStart w:id="62" w:name="limitations-and-known-failure-modes"/>
+    <w:bookmarkStart w:id="65" w:name="limitations-and-known-failure-modes"/>
     <w:p>
       <w:pPr>
         <w:pStyle w:val="Heading2"/>
@@ -6463,7 +6463,241 @@
         <w:t xml:space="preserve"> </w:t>
       </w:r>
       <w:r>
-        <w:t xml:space="preserve">does not appear in the Sensor ID and Locations spreadsheet provided with the dataset. As a result, there is no way to determine which room it monitors or which occupancy zone covers that room. A zone-matching analysis was performed: for each sensor–zone pair, weekend bins where exactly one zone was occupied were isolated, and the mean CO₂ difference between occupied and unoccupied bins was computed. The expected signal for a co-located sensor–zone pair is a CO₂ increase of 50–200 ppm; the largest measured difference across all pairs was below 7 ppm. All five Pearson correlations between zone occupancy and sensor CO₂ were negative (−0.14 to −0.17), consistent with a building-wide HVAC dilution effect rather than a room-level occupancy signal. This is a property of the dataset, not a failure of the modelling approach.</w:t>
+        <w:t xml:space="preserve">does not appear in the Sensor ID and Locations spreadsheet provided with the dataset, so there is no way to determine from metadata which room it monitors or which occupancy zone covers that room. Instead, a data-driven sensor-matching analysis was run (</w:t>
+      </w:r>
+      <w:r>
+        <w:rPr>
+          <w:rStyle w:val="VerbatimChar"/>
+        </w:rPr>
+        <w:t xml:space="preserve">occupancy.sensor_matching</w:t>
+      </w:r>
+      <w:r>
+        <w:t xml:space="preserve">,</w:t>
+      </w:r>
+      <w:r>
+        <w:t xml:space="preserve"> </w:t>
+      </w:r>
+      <w:r>
+        <w:rPr>
+          <w:rStyle w:val="VerbatimChar"/>
+        </w:rPr>
+        <w:t xml:space="preserve">scripts/sensor_matching_analysis.py</w:t>
+      </w:r>
+      <w:r>
+        <w:t xml:space="preserve">). For every zone–sensor pair, the zone’s binary occupancy and the sensor’s reading were resampled to 15-minute bins, and Pearson’s</w:t>
+      </w:r>
+      <w:r>
+        <w:t xml:space="preserve"> </w:t>
+      </w:r>
+      <m:oMath>
+        <m:r>
+          <m:t>r</m:t>
+        </m:r>
+      </m:oMath>
+      <w:r>
+        <w:t xml:space="preserve"> </w:t>
+      </w:r>
+      <w:r>
+        <w:t xml:space="preserve">was computed between occupancy and the</w:t>
+      </w:r>
+      <w:r>
+        <w:t xml:space="preserve"> </w:t>
+      </w:r>
+      <w:r>
+        <w:rPr>
+          <w:iCs/>
+          <w:i/>
+        </w:rPr>
+        <w:t xml:space="preserve">change</w:t>
+      </w:r>
+      <w:r>
+        <w:t xml:space="preserve"> </w:t>
+      </w:r>
+      <w:r>
+        <w:t xml:space="preserve">in the reading from one bin to the next (its first difference). Using the change rather than the level matters: every room’s CO₂ and temperature follow the same working-day cycle, so correlating raw levels would make every pair look related. Lags of up to ±4 bins (±1 hour) were searched and the strongest absolute correlation kept. The test was repeated for CO₂, temperature and humidity (results in</w:t>
+      </w:r>
+      <w:r>
+        <w:t xml:space="preserve"> </w:t>
+      </w:r>
+      <w:r>
+        <w:rPr>
+          <w:rStyle w:val="VerbatimChar"/>
+        </w:rPr>
+        <w:t xml:space="preserve">reports/sensor_matching_results.json</w:t>
+      </w:r>
+      <w:r>
+        <w:t xml:space="preserve">).</w:t>
+      </w:r>
+    </w:p>
+    <w:p>
+      <w:pPr>
+        <w:pStyle w:val="CaptionedFigure"/>
+      </w:pPr>
+      <w:r>
+        <w:drawing>
+          <wp:inline>
+            <wp:extent cx="5486400" cy="2422927"/>
+            <wp:effectExtent b="0" l="0" r="0" t="0"/>
+            <wp:docPr descr="Best-lag correlation between each zone’s occupancy and the 15-minute change in each sensor’s reading" title="" id="63" name="Picture"/>
+            <a:graphic>
+              <a:graphicData uri="http://schemas.openxmlformats.org/drawingml/2006/picture">
+                <pic:pic>
+                  <pic:nvPicPr>
+                    <pic:cNvPr descr="chart10_zone_matching.png" id="64" name="Picture"/>
+                    <pic:cNvPicPr>
+                      <a:picLocks noChangeArrowheads="1" noChangeAspect="1"/>
+                    </pic:cNvPicPr>
+                  </pic:nvPicPr>
+                  <pic:blipFill>
+                    <a:blip r:embed="rId62"/>
+                    <a:stretch>
+                      <a:fillRect/>
+                    </a:stretch>
+                  </pic:blipFill>
+                  <pic:spPr bwMode="auto">
+                    <a:xfrm>
+                      <a:off x="0" y="0"/>
+                      <a:ext cx="5486400" cy="2422927"/>
+                    </a:xfrm>
+                    <a:prstGeom prst="rect">
+                      <a:avLst/>
+                    </a:prstGeom>
+                    <a:noFill/>
+                    <a:ln w="9525">
+                      <a:noFill/>
+                      <a:headEnd/>
+                      <a:tailEnd/>
+                    </a:ln>
+                  </pic:spPr>
+                </pic:pic>
+              </a:graphicData>
+            </a:graphic>
+          </wp:inline>
+        </w:drawing>
+      </w:r>
+    </w:p>
+    <w:p>
+      <w:pPr>
+        <w:pStyle w:val="ImageCaption"/>
+      </w:pPr>
+      <w:r>
+        <w:t xml:space="preserve">Best-lag correlation between each zone’s occupancy and the 15-minute change in each sensor’s reading</w:t>
+      </w:r>
+    </w:p>
+    <w:p>
+      <w:pPr>
+        <w:pStyle w:val="BodyText"/>
+      </w:pPr>
+      <w:r>
+        <w:t xml:space="preserve">For CO₂, sensor</w:t>
+      </w:r>
+      <w:r>
+        <w:t xml:space="preserve"> </w:t>
+      </w:r>
+      <w:r>
+        <w:rPr>
+          <w:rStyle w:val="VerbatimChar"/>
+        </w:rPr>
+        <w:t xml:space="preserve">6012002000326</w:t>
+      </w:r>
+      <w:r>
+        <w:t xml:space="preserve"> </w:t>
+      </w:r>
+      <w:r>
+        <w:t xml:space="preserve">shows essentially no relationship with any zone:</w:t>
+      </w:r>
+      <w:r>
+        <w:t xml:space="preserve"> </w:t>
+      </w:r>
+      <m:oMath>
+        <m:d>
+          <m:dPr>
+            <m:begChr m:val="|"/>
+            <m:endChr m:val="|"/>
+            <m:sepChr m:val=""/>
+            <m:grow/>
+          </m:dPr>
+          <m:e>
+            <m:r>
+              <m:t>r</m:t>
+            </m:r>
+          </m:e>
+        </m:d>
+        <m:r>
+          <m:rPr>
+            <m:sty m:val="p"/>
+          </m:rPr>
+          <m:t>≤</m:t>
+        </m:r>
+        <m:r>
+          <m:t>0.03</m:t>
+        </m:r>
+      </m:oMath>
+      <w:r>
+        <w:t xml:space="preserve"> </w:t>
+      </w:r>
+      <w:r>
+        <w:t xml:space="preserve">for all four zones with overlapping data (the fifth zone has no overlap with this sensor’s genuine readings). No sensor exceeds</w:t>
+      </w:r>
+      <w:r>
+        <w:t xml:space="preserve"> </w:t>
+      </w:r>
+      <m:oMath>
+        <m:d>
+          <m:dPr>
+            <m:begChr m:val="|"/>
+            <m:endChr m:val="|"/>
+            <m:sepChr m:val=""/>
+            <m:grow/>
+          </m:dPr>
+          <m:e>
+            <m:r>
+              <m:t>r</m:t>
+            </m:r>
+          </m:e>
+        </m:d>
+        <m:r>
+          <m:rPr>
+            <m:sty m:val="p"/>
+          </m:rPr>
+          <m:t>=</m:t>
+        </m:r>
+        <m:r>
+          <m:t>0.06</m:t>
+        </m:r>
+      </m:oMath>
+      <w:r>
+        <w:t xml:space="preserve"> </w:t>
+      </w:r>
+      <w:r>
+        <w:t xml:space="preserve">for CO₂. Temperature shows weak positive correlations for this sensor (</w:t>
+      </w:r>
+      <m:oMath>
+        <m:r>
+          <m:t>r</m:t>
+        </m:r>
+      </m:oMath>
+      <w:r>
+        <w:t xml:space="preserve"> </w:t>
+      </w:r>
+      <w:r>
+        <w:t xml:space="preserve">up to 0.27), but at a lag of −3 to −4 bins: the temperature rise</w:t>
+      </w:r>
+      <w:r>
+        <w:t xml:space="preserve"> </w:t>
+      </w:r>
+      <w:r>
+        <w:rPr>
+          <w:iCs/>
+          <w:i/>
+        </w:rPr>
+        <w:t xml:space="preserve">precedes</w:t>
+      </w:r>
+      <w:r>
+        <w:t xml:space="preserve"> </w:t>
+      </w:r>
+      <w:r>
+        <w:t xml:space="preserve">occupancy by 45–60 minutes, which points to a building-wide morning HVAC warm-up rather than to people in a shared room. A correlation search of this kind cannot prove that the sensor is outside every zone, but it finds no evidence linking it to any of them. This is a property of the dataset, not a failure of the modelling approach.</w:t>
       </w:r>
     </w:p>
     <w:p>
@@ -6641,8 +6875,8 @@
         </w:pict>
       </w:r>
     </w:p>
-    <w:bookmarkEnd w:id="62"/>
-    <w:bookmarkStart w:id="63" w:name="ai-use-and-critical-reflection"/>
+    <w:bookmarkEnd w:id="65"/>
+    <w:bookmarkStart w:id="66" w:name="ai-use-and-critical-reflection"/>
     <w:p>
       <w:pPr>
         <w:pStyle w:val="Heading2"/>
@@ -6674,7 +6908,7 @@
         <w:t xml:space="preserve"> </w:t>
       </w:r>
       <w:r>
-        <w:t xml:space="preserve">Setting up the package structure, writing the scikit-learn pipeline code, running the four-model comparison, performing the integration analysis, implementing the zone-matching validation, and producing drafts of this report. Claude also proposed the zone-matching method as a principled way to test whether the sensor is co-located with a monitored occupancy zone.</w:t>
+        <w:t xml:space="preserve">Setting up the package structure, writing the scikit-learn pipeline code, running the four-model comparison, performing the integration analysis, implementing the sensor-matching analysis (a lagged correlation search, following Keenan Granland’s EdStem suggestion to look for a sensor–zone link in the data itself), and producing drafts of this report.</w:t>
       </w:r>
     </w:p>
     <w:p>
@@ -6810,8 +7044,8 @@
         </w:pict>
       </w:r>
     </w:p>
-    <w:bookmarkEnd w:id="63"/>
-    <w:bookmarkStart w:id="64" w:name="references"/>
+    <w:bookmarkEnd w:id="66"/>
+    <w:bookmarkStart w:id="67" w:name="references"/>
     <w:p>
       <w:pPr>
         <w:pStyle w:val="Heading2"/>
@@ -6904,8 +7138,8 @@
         <w:t xml:space="preserve">scikit-learn documentation: LinearRegression, DecisionTreeRegressor, SVR, MLPRegressor, StandardScaler, Pipeline. https://scikit-learn.org/</w:t>
       </w:r>
     </w:p>
-    <w:bookmarkEnd w:id="64"/>
-    <w:bookmarkEnd w:id="65"/>
+    <w:bookmarkEnd w:id="67"/>
+    <w:bookmarkEnd w:id="68"/>
     <w:sectPr>
       <w:pgSz w:h="16838" w:w="11906"/>
       <w:pgMar w:bottom="1080" w:footer="720" w:gutter="0" w:header="720" w:left="1080" w:right="1080" w:top="1080"/>

</xml_diff>

<commit_message>
Bring report within page limit and tidy docs
- Move diagnostic plots to Appendix A and shrink wide figures, so the main
  report text fits in 10 pages; renumber Section 4.2 -> 4.1
- Add repository-maintenance line to the AI reflection (matches README)
- Remove nine unused charts left over from before the CO2 pivot
</commit_message>
<xml_diff>
--- a/docs/report/MMA3001_Project_Report.docx
+++ b/docs/report/MMA3001_Project_Report.docx
@@ -445,7 +445,7 @@
         <w:pStyle w:val="BodyText"/>
       </w:pPr>
       <w:r>
-        <w:t xml:space="preserve">Section 4.2 then extends the analysis to every sensor: each sensor’s record is cut into unbroken intervals, and every interval long enough to form a training example is used. This adds a second sensor (</w:t>
+        <w:t xml:space="preserve">Section 4.1 then extends the analysis to every sensor: each sensor’s record is cut into unbroken intervals, and every interval long enough to form a training example is used. This adds a second sensor (</w:t>
       </w:r>
       <w:r>
         <w:rPr>
@@ -1759,7 +1759,7 @@
         <w:t xml:space="preserve"> </w:t>
       </w:r>
       <w:r>
-        <w:t xml:space="preserve">there are 649 such intervals covering 4,978 hours. Section 4.2 applies the same rule to every sensor.</w:t>
+        <w:t xml:space="preserve">there are 649 such intervals covering 4,978 hours. Section 4.1 applies the same rule to every sensor.</w:t>
       </w:r>
     </w:p>
     <w:bookmarkEnd w:id="29"/>
@@ -2831,7 +2831,7 @@
     </w:p>
     <w:bookmarkEnd w:id="34"/>
     <w:bookmarkEnd w:id="35"/>
-    <w:bookmarkStart w:id="53" w:name="alternative-solutions-and-comparison"/>
+    <w:bookmarkStart w:id="43" w:name="alternative-solutions-and-comparison"/>
     <w:p>
       <w:pPr>
         <w:pStyle w:val="Heading2"/>
@@ -3628,218 +3628,20 @@
       </w:r>
     </w:p>
     <w:p>
-      <w:r>
-        <w:pict>
-          <v:rect style="width:0;height:1.5pt" o:hralign="center" o:hrstd="t" o:hr="t"/>
-        </w:pict>
-      </w:r>
-    </w:p>
-    <w:bookmarkStart w:id="45" w:name="diagnostic-plots"/>
+      <w:pPr>
+        <w:pStyle w:val="BodyText"/>
+      </w:pPr>
+      <w:r>
+        <w:t xml:space="preserve">Row-by-row diagnostic plots (predictions over time, predicted vs. actual, and residuals) are given in Appendix A.</w:t>
+      </w:r>
+    </w:p>
+    <w:bookmarkStart w:id="42" w:name="Xf965eae6f400442b87f8df1b02fb52bece3b127"/>
     <w:p>
       <w:pPr>
         <w:pStyle w:val="Heading3"/>
       </w:pPr>
       <w:r>
-        <w:t xml:space="preserve">4.1 Diagnostic plots</w:t>
-      </w:r>
-    </w:p>
-    <w:p>
-      <w:pPr>
-        <w:pStyle w:val="FirstParagraph"/>
-      </w:pPr>
-      <w:r>
-        <w:t xml:space="preserve">The comparison table above is aggregate; the plots below show what it looks like row by row.</w:t>
-      </w:r>
-    </w:p>
-    <w:p>
-      <w:pPr>
-        <w:pStyle w:val="CaptionedFigure"/>
-      </w:pPr>
-      <w:r>
-        <w:drawing>
-          <wp:inline>
-            <wp:extent cx="3931919" cy="2948940"/>
-            <wp:effectExtent b="0" l="0" r="0" t="0"/>
-            <wp:docPr descr="Ground truth CO2 vs. all four models’ predictions — full test set (daily mean) and a representative 5-day detail window at native 15-minute resolution" title="" id="37" name="Picture"/>
-            <a:graphic>
-              <a:graphicData uri="http://schemas.openxmlformats.org/drawingml/2006/picture">
-                <pic:pic>
-                  <pic:nvPicPr>
-                    <pic:cNvPr descr="chart11_predictions_timeseries.png" id="38" name="Picture"/>
-                    <pic:cNvPicPr>
-                      <a:picLocks noChangeArrowheads="1" noChangeAspect="1"/>
-                    </pic:cNvPicPr>
-                  </pic:nvPicPr>
-                  <pic:blipFill>
-                    <a:blip r:embed="rId36"/>
-                    <a:stretch>
-                      <a:fillRect/>
-                    </a:stretch>
-                  </pic:blipFill>
-                  <pic:spPr bwMode="auto">
-                    <a:xfrm>
-                      <a:off x="0" y="0"/>
-                      <a:ext cx="3931919" cy="2948940"/>
-                    </a:xfrm>
-                    <a:prstGeom prst="rect">
-                      <a:avLst/>
-                    </a:prstGeom>
-                    <a:noFill/>
-                    <a:ln w="9525">
-                      <a:noFill/>
-                      <a:headEnd/>
-                      <a:tailEnd/>
-                    </a:ln>
-                  </pic:spPr>
-                </pic:pic>
-              </a:graphicData>
-            </a:graphic>
-          </wp:inline>
-        </w:drawing>
-      </w:r>
-    </w:p>
-    <w:p>
-      <w:pPr>
-        <w:pStyle w:val="ImageCaption"/>
-      </w:pPr>
-      <w:r>
-        <w:t xml:space="preserve">Ground truth CO2 vs. all four models’ predictions — full test set (daily mean) and a representative 5-day detail window at native 15-minute resolution</w:t>
-      </w:r>
-    </w:p>
-    <w:p>
-      <w:pPr>
-        <w:pStyle w:val="BodyText"/>
-      </w:pPr>
-      <w:r>
-        <w:t xml:space="preserve">All four track the everyday CO2 trend closely; they diverge at the sharp spikes in the detail panel (14-19 March), where every model lags or flattens the peak — the Decision Tree even overshoots into a spike the sensor never reached (15 March), a symptom of its piecewise-constant leaves extrapolating from a small high-CO2 training leaf.</w:t>
-      </w:r>
-    </w:p>
-    <w:p>
-      <w:pPr>
-        <w:pStyle w:val="CaptionedFigure"/>
-      </w:pPr>
-      <w:r>
-        <w:drawing>
-          <wp:inline>
-            <wp:extent cx="3931919" cy="3931919"/>
-            <wp:effectExtent b="0" l="0" r="0" t="0"/>
-            <wp:docPr descr="Predicted vs. actual CO2 for each model on the held-out test set, with a y=x reference line" title="" id="40" name="Picture"/>
-            <a:graphic>
-              <a:graphicData uri="http://schemas.openxmlformats.org/drawingml/2006/picture">
-                <pic:pic>
-                  <pic:nvPicPr>
-                    <pic:cNvPr descr="chart12_predicted_vs_actual.png" id="41" name="Picture"/>
-                    <pic:cNvPicPr>
-                      <a:picLocks noChangeArrowheads="1" noChangeAspect="1"/>
-                    </pic:cNvPicPr>
-                  </pic:nvPicPr>
-                  <pic:blipFill>
-                    <a:blip r:embed="rId39"/>
-                    <a:stretch>
-                      <a:fillRect/>
-                    </a:stretch>
-                  </pic:blipFill>
-                  <pic:spPr bwMode="auto">
-                    <a:xfrm>
-                      <a:off x="0" y="0"/>
-                      <a:ext cx="3931919" cy="3931919"/>
-                    </a:xfrm>
-                    <a:prstGeom prst="rect">
-                      <a:avLst/>
-                    </a:prstGeom>
-                    <a:noFill/>
-                    <a:ln w="9525">
-                      <a:noFill/>
-                      <a:headEnd/>
-                      <a:tailEnd/>
-                    </a:ln>
-                  </pic:spPr>
-                </pic:pic>
-              </a:graphicData>
-            </a:graphic>
-          </wp:inline>
-        </w:drawing>
-      </w:r>
-    </w:p>
-    <w:p>
-      <w:pPr>
-        <w:pStyle w:val="ImageCaption"/>
-      </w:pPr>
-      <w:r>
-        <w:t xml:space="preserve">Predicted vs. actual CO2 for each model on the held-out test set, with a y=x reference line</w:t>
-      </w:r>
-    </w:p>
-    <w:p>
-      <w:pPr>
-        <w:pStyle w:val="CaptionedFigure"/>
-      </w:pPr>
-      <w:r>
-        <w:drawing>
-          <wp:inline>
-            <wp:extent cx="3931919" cy="3538727"/>
-            <wp:effectExtent b="0" l="0" r="0" t="0"/>
-            <wp:docPr descr="Residual (predicted minus actual) vs. predicted CO2 for each model" title="" id="43" name="Picture"/>
-            <a:graphic>
-              <a:graphicData uri="http://schemas.openxmlformats.org/drawingml/2006/picture">
-                <pic:pic>
-                  <pic:nvPicPr>
-                    <pic:cNvPr descr="chart13_residuals.png" id="44" name="Picture"/>
-                    <pic:cNvPicPr>
-                      <a:picLocks noChangeArrowheads="1" noChangeAspect="1"/>
-                    </pic:cNvPicPr>
-                  </pic:nvPicPr>
-                  <pic:blipFill>
-                    <a:blip r:embed="rId42"/>
-                    <a:stretch>
-                      <a:fillRect/>
-                    </a:stretch>
-                  </pic:blipFill>
-                  <pic:spPr bwMode="auto">
-                    <a:xfrm>
-                      <a:off x="0" y="0"/>
-                      <a:ext cx="3931919" cy="3538727"/>
-                    </a:xfrm>
-                    <a:prstGeom prst="rect">
-                      <a:avLst/>
-                    </a:prstGeom>
-                    <a:noFill/>
-                    <a:ln w="9525">
-                      <a:noFill/>
-                      <a:headEnd/>
-                      <a:tailEnd/>
-                    </a:ln>
-                  </pic:spPr>
-                </pic:pic>
-              </a:graphicData>
-            </a:graphic>
-          </wp:inline>
-        </w:drawing>
-      </w:r>
-    </w:p>
-    <w:p>
-      <w:pPr>
-        <w:pStyle w:val="ImageCaption"/>
-      </w:pPr>
-      <w:r>
-        <w:t xml:space="preserve">Residual (predicted minus actual) vs. predicted CO2 for each model</w:t>
-      </w:r>
-    </w:p>
-    <w:p>
-      <w:pPr>
-        <w:pStyle w:val="BodyText"/>
-      </w:pPr>
-      <w:r>
-        <w:t xml:space="preserve">Predicted-vs-actual makes the R² numbers concrete: all four point clouds hug y=x below 550 ppm, then fall well short of it as actual CO2 rises past 600 ppm. The residual plots show the same effect directionally: residuals sit near zero typically but turn increasingly negative as predicted CO2 rises, rather than scattering symmetrically — a model under-responding to its most extreme inputs, consistent with the training data being dominated by the 400-550 ppm range (Section 2.3).</w:t>
-      </w:r>
-    </w:p>
-    <w:bookmarkEnd w:id="45"/>
-    <w:bookmarkStart w:id="52" w:name="Xf965eae6f400442b87f8df1b02fb52bece3b127"/>
-    <w:p>
-      <w:pPr>
-        <w:pStyle w:val="Heading3"/>
-      </w:pPr>
-      <w:r>
-        <w:t xml:space="preserve">4.2 Using every usable interval from all sensors</w:t>
+        <w:t xml:space="preserve">4.1 Using every usable interval from all sensors</w:t>
       </w:r>
     </w:p>
     <w:p>
@@ -4408,20 +4210,20 @@
       <w:r>
         <w:drawing>
           <wp:inline>
-            <wp:extent cx="5486400" cy="1772529"/>
+            <wp:extent cx="4754880" cy="1536192"/>
             <wp:effectExtent b="0" l="0" r="0" t="0"/>
-            <wp:docPr descr="Usable unbroken intervals (green) and re-transmitted stale packets (grey) for each sensor" title="" id="47" name="Picture"/>
+            <wp:docPr descr="Usable unbroken intervals (green) and re-transmitted stale packets (grey) for each sensor" title="" id="37" name="Picture"/>
             <a:graphic>
               <a:graphicData uri="http://schemas.openxmlformats.org/drawingml/2006/picture">
                 <pic:pic>
                   <pic:nvPicPr>
-                    <pic:cNvPr descr="chart15_sensor_intervals.png" id="48" name="Picture"/>
+                    <pic:cNvPr descr="chart15_sensor_intervals.png" id="38" name="Picture"/>
                     <pic:cNvPicPr>
                       <a:picLocks noChangeArrowheads="1" noChangeAspect="1"/>
                     </pic:cNvPicPr>
                   </pic:nvPicPr>
                   <pic:blipFill>
-                    <a:blip r:embed="rId46"/>
+                    <a:blip r:embed="rId36"/>
                     <a:stretch>
                       <a:fillRect/>
                     </a:stretch>
@@ -4429,7 +4231,7 @@
                   <pic:spPr bwMode="auto">
                     <a:xfrm>
                       <a:off x="0" y="0"/>
-                      <a:ext cx="5486400" cy="1772529"/>
+                      <a:ext cx="4754880" cy="1536192"/>
                     </a:xfrm>
                     <a:prstGeom prst="rect">
                       <a:avLst/>
@@ -5301,20 +5103,20 @@
       <w:r>
         <w:drawing>
           <wp:inline>
-            <wp:extent cx="5486400" cy="1941341"/>
+            <wp:extent cx="4754880" cy="1682496"/>
             <wp:effectExtent b="0" l="0" r="0" t="0"/>
-            <wp:docPr descr="MAE for Experiment A (left) and Experiment B (right)" title="" id="50" name="Picture"/>
+            <wp:docPr descr="MAE for Experiment A (left) and Experiment B (right)" title="" id="40" name="Picture"/>
             <a:graphic>
               <a:graphicData uri="http://schemas.openxmlformats.org/drawingml/2006/picture">
                 <pic:pic>
                   <pic:nvPicPr>
-                    <pic:cNvPr descr="chart16_multi_sensor_results.png" id="51" name="Picture"/>
+                    <pic:cNvPr descr="chart16_multi_sensor_results.png" id="41" name="Picture"/>
                     <pic:cNvPicPr>
                       <a:picLocks noChangeArrowheads="1" noChangeAspect="1"/>
                     </pic:cNvPicPr>
                   </pic:nvPicPr>
                   <pic:blipFill>
-                    <a:blip r:embed="rId49"/>
+                    <a:blip r:embed="rId39"/>
                     <a:stretch>
                       <a:fillRect/>
                     </a:stretch>
@@ -5322,7 +5124,7 @@
                   <pic:spPr bwMode="auto">
                     <a:xfrm>
                       <a:off x="0" y="0"/>
-                      <a:ext cx="5486400" cy="1941341"/>
+                      <a:ext cx="4754880" cy="1682496"/>
                     </a:xfrm>
                     <a:prstGeom prst="rect">
                       <a:avLst/>
@@ -5370,9 +5172,9 @@
         <w:t xml:space="preserve">. The models learn room-specific behaviour — the typical CO₂ level each room settles to and how quickly it returns there — so a model from one room pulls its forecasts toward the wrong baseline in another. The practical conclusion is that a forecaster of this kind must be trained per room (or per sensor); it cannot simply be copied between rooms.</w:t>
       </w:r>
     </w:p>
-    <w:bookmarkEnd w:id="52"/>
-    <w:bookmarkEnd w:id="53"/>
-    <w:bookmarkStart w:id="61" w:name="validation"/>
+    <w:bookmarkEnd w:id="42"/>
+    <w:bookmarkEnd w:id="43"/>
+    <w:bookmarkStart w:id="51" w:name="validation"/>
     <w:p>
       <w:pPr>
         <w:pStyle w:val="Heading2"/>
@@ -5381,7 +5183,7 @@
         <w:t xml:space="preserve">5. Validation</w:t>
       </w:r>
     </w:p>
-    <w:bookmarkStart w:id="57" w:name="traintest-split"/>
+    <w:bookmarkStart w:id="47" w:name="traintest-split"/>
     <w:p>
       <w:pPr>
         <w:pStyle w:val="Heading3"/>
@@ -5415,18 +5217,18 @@
           <wp:inline>
             <wp:extent cx="3931919" cy="967857"/>
             <wp:effectExtent b="0" l="0" r="0" t="0"/>
-            <wp:docPr descr="Chronological train/test split over the full sensor history for sensor 6012002000326" title="" id="55" name="Picture"/>
+            <wp:docPr descr="Chronological train/test split over the full sensor history for sensor 6012002000326" title="" id="45" name="Picture"/>
             <a:graphic>
               <a:graphicData uri="http://schemas.openxmlformats.org/drawingml/2006/picture">
                 <pic:pic>
                   <pic:nvPicPr>
-                    <pic:cNvPr descr="chart14_train_test_split.png" id="56" name="Picture"/>
+                    <pic:cNvPr descr="chart14_train_test_split.png" id="46" name="Picture"/>
                     <pic:cNvPicPr>
                       <a:picLocks noChangeArrowheads="1" noChangeAspect="1"/>
                     </pic:cNvPicPr>
                   </pic:nvPicPr>
                   <pic:blipFill>
-                    <a:blip r:embed="rId54"/>
+                    <a:blip r:embed="rId44"/>
                     <a:stretch>
                       <a:fillRect/>
                     </a:stretch>
@@ -5461,8 +5263,8 @@
         <w:t xml:space="preserve">Chronological train/test split over the full sensor history for sensor 6012002000326</w:t>
       </w:r>
     </w:p>
-    <w:bookmarkEnd w:id="57"/>
-    <w:bookmarkStart w:id="58" w:name="evaluation-metrics"/>
+    <w:bookmarkEnd w:id="47"/>
+    <w:bookmarkStart w:id="48" w:name="evaluation-metrics"/>
     <w:p>
       <w:pPr>
         <w:pStyle w:val="Heading3"/>
@@ -5989,8 +5791,8 @@
         <w:t xml:space="preserve">The proportion of variance in the target explained by the model. R² = 1 is a perfect fit; R² = 0 means the model does no better than always predicting the mean. All four models achieve R² in the range 0.19–0.36, indicating they explain approximately one third of the variance in next-15-minute CO₂ readings. The remaining variance is driven by factors not captured in the dataset: HVAC switching events, doors and windows, equipment, and the occupants of this particular room.</w:t>
       </w:r>
     </w:p>
-    <w:bookmarkEnd w:id="58"/>
-    <w:bookmarkStart w:id="59" w:name="Xd8f2789288cdc47fb919a2a3d44a84a474eb10b"/>
+    <w:bookmarkEnd w:id="48"/>
+    <w:bookmarkStart w:id="49" w:name="Xd8f2789288cdc47fb919a2a3d44a84a474eb10b"/>
     <w:p>
       <w:pPr>
         <w:pStyle w:val="Heading3"/>
@@ -6123,8 +5925,8 @@
         <w:t xml:space="preserve">is physically working and measuring real environmental conditions, even without a documented room label.</w:t>
       </w:r>
     </w:p>
-    <w:bookmarkEnd w:id="59"/>
-    <w:bookmarkStart w:id="60" w:name="numerical-integration-convergence"/>
+    <w:bookmarkEnd w:id="49"/>
+    <w:bookmarkStart w:id="50" w:name="numerical-integration-convergence"/>
     <w:p>
       <w:pPr>
         <w:pStyle w:val="Heading3"/>
@@ -6422,9 +6224,9 @@
         </w:pict>
       </w:r>
     </w:p>
-    <w:bookmarkEnd w:id="60"/>
-    <w:bookmarkEnd w:id="61"/>
-    <w:bookmarkStart w:id="65" w:name="limitations-and-known-failure-modes"/>
+    <w:bookmarkEnd w:id="50"/>
+    <w:bookmarkEnd w:id="51"/>
+    <w:bookmarkStart w:id="55" w:name="limitations-and-known-failure-modes"/>
     <w:p>
       <w:pPr>
         <w:pStyle w:val="Heading2"/>
@@ -6536,20 +6338,20 @@
       <w:r>
         <w:drawing>
           <wp:inline>
-            <wp:extent cx="5486400" cy="2422927"/>
+            <wp:extent cx="4754880" cy="2099870"/>
             <wp:effectExtent b="0" l="0" r="0" t="0"/>
-            <wp:docPr descr="Best-lag correlation between each zone’s occupancy and the 15-minute change in each sensor’s reading" title="" id="63" name="Picture"/>
+            <wp:docPr descr="Best-lag correlation between each zone’s occupancy and the 15-minute change in each sensor’s reading" title="" id="53" name="Picture"/>
             <a:graphic>
               <a:graphicData uri="http://schemas.openxmlformats.org/drawingml/2006/picture">
                 <pic:pic>
                   <pic:nvPicPr>
-                    <pic:cNvPr descr="chart10_zone_matching.png" id="64" name="Picture"/>
+                    <pic:cNvPr descr="chart10_zone_matching.png" id="54" name="Picture"/>
                     <pic:cNvPicPr>
                       <a:picLocks noChangeArrowheads="1" noChangeAspect="1"/>
                     </pic:cNvPicPr>
                   </pic:nvPicPr>
                   <pic:blipFill>
-                    <a:blip r:embed="rId62"/>
+                    <a:blip r:embed="rId52"/>
                     <a:stretch>
                       <a:fillRect/>
                     </a:stretch>
@@ -6557,7 +6359,7 @@
                   <pic:spPr bwMode="auto">
                     <a:xfrm>
                       <a:off x="0" y="0"/>
-                      <a:ext cx="5486400" cy="2422927"/>
+                      <a:ext cx="4754880" cy="2099870"/>
                     </a:xfrm>
                     <a:prstGeom prst="rect">
                       <a:avLst/>
@@ -6778,7 +6580,7 @@
         <w:t xml:space="preserve">6012002000227</w:t>
       </w:r>
       <w:r>
-        <w:t xml:space="preserve">). No interval of any length can be formed, so these sensors cannot contribute data under any policy. The same fault affects the two usable sensors outside their genuine periods (Section 4.2). Sensor</w:t>
+        <w:t xml:space="preserve">). No interval of any length can be formed, so these sensors cannot contribute data under any policy. The same fault affects the two usable sensors outside their genuine periods (Section 4.1). Sensor</w:t>
       </w:r>
       <w:r>
         <w:t xml:space="preserve"> </w:t>
@@ -6793,7 +6595,7 @@
         <w:t xml:space="preserve"> </w:t>
       </w:r>
       <w:r>
-        <w:t xml:space="preserve">has only three and a half months of genuine data, which is why it was not used for the main analysis; it is used for the pooled and cross-sensor experiments in Section 4.2. None of these issues is documented in the dataset description; they were identified by inspecting the raw timestamps and values.</w:t>
+        <w:t xml:space="preserve">has only three and a half months of genuine data, which is why it was not used for the main analysis; it is used for the pooled and cross-sensor experiments in Section 4.1. None of these issues is documented in the dataset description; they were identified by inspecting the raw timestamps and values.</w:t>
       </w:r>
     </w:p>
     <w:p>
@@ -6811,7 +6613,7 @@
         <w:t xml:space="preserve"> </w:t>
       </w:r>
       <w:r>
-        <w:t xml:space="preserve">A 636-day gap in genuine readings reduces the usable dataset from 84,576 candidate rows to 17,010 (20.1%). This is a direct consequence of the sensor fault and the correct handling of missing data; imputing values across a gap of this length would produce a fabricated dataset with no physical basis. Adding every usable interval from a second sensor raises the training set by 56% but does not measurably improve accuracy (Section 4.2).</w:t>
+        <w:t xml:space="preserve">A 636-day gap in genuine readings reduces the usable dataset from 84,576 candidate rows to 17,010 (20.1%). This is a direct consequence of the sensor fault and the correct handling of missing data; imputing values across a gap of this length would produce a fabricated dataset with no physical basis. Adding every usable interval from a second sensor raises the training set by 56% but does not measurably improve accuracy (Section 4.1).</w:t>
       </w:r>
     </w:p>
     <w:p>
@@ -6829,7 +6631,7 @@
         <w:t xml:space="preserve"> </w:t>
       </w:r>
       <w:r>
-        <w:t xml:space="preserve">A model trained on one sensor performs worse than a naive persistence forecast on another (Section 4.2). Each room needs its own training data.</w:t>
+        <w:t xml:space="preserve">A model trained on one sensor performs worse than a naive persistence forecast on another (Section 4.1). Each room needs its own training data.</w:t>
       </w:r>
     </w:p>
     <w:p>
@@ -6875,8 +6677,8 @@
         </w:pict>
       </w:r>
     </w:p>
-    <w:bookmarkEnd w:id="65"/>
-    <w:bookmarkStart w:id="66" w:name="ai-use-and-critical-reflection"/>
+    <w:bookmarkEnd w:id="55"/>
+    <w:bookmarkStart w:id="56" w:name="ai-use-and-critical-reflection"/>
     <w:p>
       <w:pPr>
         <w:pStyle w:val="Heading2"/>
@@ -6944,7 +6746,7 @@
         <w:t xml:space="preserve"> </w:t>
       </w:r>
       <w:r>
-        <w:t xml:space="preserve">After discussing the project with the teaching team, I was advised to use the valid time intervals from the other sensors instead of discarding them entirely. I brought this feedback to Claude and asked for it to be applied. Claude proposed and implemented the interval audit, the pooled and cross-sensor experiments and the bootstrap significance check (Section 4.2), and found, by comparing the</w:t>
+        <w:t xml:space="preserve">After discussing the project with the teaching team, I was advised to use the valid time intervals from the other sensors instead of discarding them entirely. I brought this feedback to Claude and asked for it to be applied. Claude proposed and implemented the interval audit, the pooled and cross-sensor experiments and the bootstrap significance check (Section 4.1), and found, by comparing the</w:t>
       </w:r>
       <w:r>
         <w:t xml:space="preserve"> </w:t>
@@ -6978,6 +6780,36 @@
       </w:r>
       <w:r>
         <w:t xml:space="preserve">sensors were re-sending a single stale packet. I approved the experiments and the decision to report the non-significant pooling result and the negative cross-sensor result as they are.</w:t>
+      </w:r>
+    </w:p>
+    <w:p>
+      <w:pPr>
+        <w:pStyle w:val="BodyText"/>
+      </w:pPr>
+      <w:r>
+        <w:rPr>
+          <w:bCs/>
+          <w:b/>
+        </w:rPr>
+        <w:t xml:space="preserve">Repository maintenance:</w:t>
+      </w:r>
+      <w:r>
+        <w:t xml:space="preserve"> </w:t>
+      </w:r>
+      <w:r>
+        <w:t xml:space="preserve">Claude also restored a module and tests that an earlier cleanup had deleted, regenerated the API documentation and test report, and corrected this report’s description of the zone-matching analysis so that it matches the code in</w:t>
+      </w:r>
+      <w:r>
+        <w:t xml:space="preserve"> </w:t>
+      </w:r>
+      <w:r>
+        <w:rPr>
+          <w:rStyle w:val="VerbatimChar"/>
+        </w:rPr>
+        <w:t xml:space="preserve">occupancy.sensor_matching</w:t>
+      </w:r>
+      <w:r>
+        <w:t xml:space="preserve">.</w:t>
       </w:r>
     </w:p>
     <w:p>
@@ -7016,6 +6848,18 @@
         <w:t xml:space="preserve">reports/multi_sensor_results.json</w:t>
       </w:r>
       <w:r>
+        <w:t xml:space="preserve">,</w:t>
+      </w:r>
+      <w:r>
+        <w:t xml:space="preserve"> </w:t>
+      </w:r>
+      <w:r>
+        <w:rPr>
+          <w:rStyle w:val="VerbatimChar"/>
+        </w:rPr>
+        <w:t xml:space="preserve">reports/sensor_matching_results.json</w:t>
+      </w:r>
+      <w:r>
         <w:t xml:space="preserve">) before being recorded here. The integration estimates and convergence results come from scripts that can be rerun to reproduce the same outputs.</w:t>
       </w:r>
     </w:p>
@@ -7044,8 +6888,8 @@
         </w:pict>
       </w:r>
     </w:p>
-    <w:bookmarkEnd w:id="66"/>
-    <w:bookmarkStart w:id="67" w:name="references"/>
+    <w:bookmarkEnd w:id="56"/>
+    <w:bookmarkStart w:id="57" w:name="references"/>
     <w:p>
       <w:pPr>
         <w:pStyle w:val="Heading2"/>
@@ -7136,6 +6980,212 @@
       </w:pPr>
       <w:r>
         <w:t xml:space="preserve">scikit-learn documentation: LinearRegression, DecisionTreeRegressor, SVR, MLPRegressor, StandardScaler, Pipeline. https://scikit-learn.org/</w:t>
+      </w:r>
+    </w:p>
+    <w:p>
+      <w:r>
+        <w:pict>
+          <v:rect style="width:0;height:1.5pt" o:hralign="center" o:hrstd="t" o:hr="t"/>
+        </w:pict>
+      </w:r>
+    </w:p>
+    <w:bookmarkEnd w:id="57"/>
+    <w:bookmarkStart w:id="67" w:name="appendix-a-diagnostic-plots"/>
+    <w:p>
+      <w:pPr>
+        <w:pStyle w:val="Heading2"/>
+      </w:pPr>
+      <w:r>
+        <w:t xml:space="preserve">Appendix A: Diagnostic Plots</w:t>
+      </w:r>
+    </w:p>
+    <w:p>
+      <w:pPr>
+        <w:pStyle w:val="FirstParagraph"/>
+      </w:pPr>
+      <w:r>
+        <w:t xml:space="preserve">The comparison table in Section 4 is aggregate; the plots below show what it looks like row by row (Linear Regression, Decision Tree, SVR and Neural Network, with occupancy, on the 0326 test set).</w:t>
+      </w:r>
+    </w:p>
+    <w:p>
+      <w:pPr>
+        <w:pStyle w:val="CaptionedFigure"/>
+      </w:pPr>
+      <w:r>
+        <w:drawing>
+          <wp:inline>
+            <wp:extent cx="3931919" cy="2948940"/>
+            <wp:effectExtent b="0" l="0" r="0" t="0"/>
+            <wp:docPr descr="Ground truth CO2 vs. all four models’ predictions — full test set (daily mean) and a representative 5-day detail window at native 15-minute resolution" title="" id="59" name="Picture"/>
+            <a:graphic>
+              <a:graphicData uri="http://schemas.openxmlformats.org/drawingml/2006/picture">
+                <pic:pic>
+                  <pic:nvPicPr>
+                    <pic:cNvPr descr="chart11_predictions_timeseries.png" id="60" name="Picture"/>
+                    <pic:cNvPicPr>
+                      <a:picLocks noChangeArrowheads="1" noChangeAspect="1"/>
+                    </pic:cNvPicPr>
+                  </pic:nvPicPr>
+                  <pic:blipFill>
+                    <a:blip r:embed="rId58"/>
+                    <a:stretch>
+                      <a:fillRect/>
+                    </a:stretch>
+                  </pic:blipFill>
+                  <pic:spPr bwMode="auto">
+                    <a:xfrm>
+                      <a:off x="0" y="0"/>
+                      <a:ext cx="3931919" cy="2948940"/>
+                    </a:xfrm>
+                    <a:prstGeom prst="rect">
+                      <a:avLst/>
+                    </a:prstGeom>
+                    <a:noFill/>
+                    <a:ln w="9525">
+                      <a:noFill/>
+                      <a:headEnd/>
+                      <a:tailEnd/>
+                    </a:ln>
+                  </pic:spPr>
+                </pic:pic>
+              </a:graphicData>
+            </a:graphic>
+          </wp:inline>
+        </w:drawing>
+      </w:r>
+    </w:p>
+    <w:p>
+      <w:pPr>
+        <w:pStyle w:val="ImageCaption"/>
+      </w:pPr>
+      <w:r>
+        <w:t xml:space="preserve">Ground truth CO2 vs. all four models’ predictions — full test set (daily mean) and a representative 5-day detail window at native 15-minute resolution</w:t>
+      </w:r>
+    </w:p>
+    <w:p>
+      <w:pPr>
+        <w:pStyle w:val="BodyText"/>
+      </w:pPr>
+      <w:r>
+        <w:t xml:space="preserve">All four track the everyday CO2 trend closely; they diverge at the sharp spikes in the detail panel (14-19 March), where every model lags or flattens the peak — the Decision Tree even overshoots into a spike the sensor never reached (15 March), a symptom of its piecewise-constant leaves extrapolating from a small high-CO2 training leaf.</w:t>
+      </w:r>
+    </w:p>
+    <w:p>
+      <w:pPr>
+        <w:pStyle w:val="CaptionedFigure"/>
+      </w:pPr>
+      <w:r>
+        <w:drawing>
+          <wp:inline>
+            <wp:extent cx="3931919" cy="3931919"/>
+            <wp:effectExtent b="0" l="0" r="0" t="0"/>
+            <wp:docPr descr="Predicted vs. actual CO2 for each model on the held-out test set, with a y=x reference line" title="" id="62" name="Picture"/>
+            <a:graphic>
+              <a:graphicData uri="http://schemas.openxmlformats.org/drawingml/2006/picture">
+                <pic:pic>
+                  <pic:nvPicPr>
+                    <pic:cNvPr descr="chart12_predicted_vs_actual.png" id="63" name="Picture"/>
+                    <pic:cNvPicPr>
+                      <a:picLocks noChangeArrowheads="1" noChangeAspect="1"/>
+                    </pic:cNvPicPr>
+                  </pic:nvPicPr>
+                  <pic:blipFill>
+                    <a:blip r:embed="rId61"/>
+                    <a:stretch>
+                      <a:fillRect/>
+                    </a:stretch>
+                  </pic:blipFill>
+                  <pic:spPr bwMode="auto">
+                    <a:xfrm>
+                      <a:off x="0" y="0"/>
+                      <a:ext cx="3931919" cy="3931919"/>
+                    </a:xfrm>
+                    <a:prstGeom prst="rect">
+                      <a:avLst/>
+                    </a:prstGeom>
+                    <a:noFill/>
+                    <a:ln w="9525">
+                      <a:noFill/>
+                      <a:headEnd/>
+                      <a:tailEnd/>
+                    </a:ln>
+                  </pic:spPr>
+                </pic:pic>
+              </a:graphicData>
+            </a:graphic>
+          </wp:inline>
+        </w:drawing>
+      </w:r>
+    </w:p>
+    <w:p>
+      <w:pPr>
+        <w:pStyle w:val="ImageCaption"/>
+      </w:pPr>
+      <w:r>
+        <w:t xml:space="preserve">Predicted vs. actual CO2 for each model on the held-out test set, with a y=x reference line</w:t>
+      </w:r>
+    </w:p>
+    <w:p>
+      <w:pPr>
+        <w:pStyle w:val="CaptionedFigure"/>
+      </w:pPr>
+      <w:r>
+        <w:drawing>
+          <wp:inline>
+            <wp:extent cx="3931919" cy="3538727"/>
+            <wp:effectExtent b="0" l="0" r="0" t="0"/>
+            <wp:docPr descr="Residual (predicted minus actual) vs. predicted CO2 for each model" title="" id="65" name="Picture"/>
+            <a:graphic>
+              <a:graphicData uri="http://schemas.openxmlformats.org/drawingml/2006/picture">
+                <pic:pic>
+                  <pic:nvPicPr>
+                    <pic:cNvPr descr="chart13_residuals.png" id="66" name="Picture"/>
+                    <pic:cNvPicPr>
+                      <a:picLocks noChangeArrowheads="1" noChangeAspect="1"/>
+                    </pic:cNvPicPr>
+                  </pic:nvPicPr>
+                  <pic:blipFill>
+                    <a:blip r:embed="rId64"/>
+                    <a:stretch>
+                      <a:fillRect/>
+                    </a:stretch>
+                  </pic:blipFill>
+                  <pic:spPr bwMode="auto">
+                    <a:xfrm>
+                      <a:off x="0" y="0"/>
+                      <a:ext cx="3931919" cy="3538727"/>
+                    </a:xfrm>
+                    <a:prstGeom prst="rect">
+                      <a:avLst/>
+                    </a:prstGeom>
+                    <a:noFill/>
+                    <a:ln w="9525">
+                      <a:noFill/>
+                      <a:headEnd/>
+                      <a:tailEnd/>
+                    </a:ln>
+                  </pic:spPr>
+                </pic:pic>
+              </a:graphicData>
+            </a:graphic>
+          </wp:inline>
+        </w:drawing>
+      </w:r>
+    </w:p>
+    <w:p>
+      <w:pPr>
+        <w:pStyle w:val="ImageCaption"/>
+      </w:pPr>
+      <w:r>
+        <w:t xml:space="preserve">Residual (predicted minus actual) vs. predicted CO2 for each model</w:t>
+      </w:r>
+    </w:p>
+    <w:p>
+      <w:pPr>
+        <w:pStyle w:val="BodyText"/>
+      </w:pPr>
+      <w:r>
+        <w:t xml:space="preserve">Predicted-vs-actual makes the R² numbers concrete: all four point clouds hug y=x below 550 ppm, then fall well short of it as actual CO2 rises past 600 ppm. The residual plots show the same effect directionally: residuals sit near zero typically but turn increasingly negative as predicted CO2 rises, rather than scattering symmetrically — a model under-responding to its most extreme inputs, consistent with the training data being dominated by the 400-550 ppm range (Section 2.3).</w:t>
       </w:r>
     </w:p>
     <w:bookmarkEnd w:id="67"/>

</xml_diff>

<commit_message>
Report: add weekday/weekend finding, citations and wording fixes
- New scripts/weekday_weekend_comparison.py: room G.38 (0869) shows an
  occupied-room pattern (13:00 weekday peak, 55 ppm lower at weekends);
  sensor 0326 shows none (07:00 peak, weekday = weekend), so it follows
  the ventilation schedule
- Section 1: correct the ASHRAE 1000 ppm statement; cite Satish et al.
  (2012) and Persily & de Jonge (2017)
- Section 2: link the autoregressive form to the mass balance (one-step
  solution, ~30 min time constant); fix rolling-mean, lag-feature,
  is_weekend and row-count wording; make 800/1000 ppm thresholds consistent
- Move data-pipeline and split-timeline figures to Appendix A to keep the
  main text within 10 pages
</commit_message>
<xml_diff>
--- a/docs/report/MMA3001_Project_Report.docx
+++ b/docs/report/MMA3001_Project_Report.docx
@@ -85,7 +85,7 @@
         <w:pStyle w:val="FirstParagraph"/>
       </w:pPr>
       <w:r>
-        <w:t xml:space="preserve">Indoor air quality in office buildings deteriorates primarily through the accumulation of carbon dioxide (CO₂). Human respiration releases CO₂ continuously at approximately 0.2–0.3 litres per minute per person. In an enclosed space, the indoor concentration evolves according to a first-order mass balance:</w:t>
+        <w:t xml:space="preserve">Indoor air quality in office buildings deteriorates primarily through the accumulation of carbon dioxide (CO₂). Human respiration releases CO₂ continuously at approximately 0.2–0.3 litres per minute per person. In an enclosed, well-mixed space, the indoor concentration evolves according to a first-order mass balance — the standard single-zone model used in ventilation engineering (Persily &amp; de Jonge, 2017):</w:t>
       </w:r>
     </w:p>
     <w:p>
@@ -344,7 +344,7 @@
         <w:pStyle w:val="BodyText"/>
       </w:pPr>
       <w:r>
-        <w:t xml:space="preserve">CO₂ concentration is therefore a direct, measurable proxy for both occupancy load and ventilation adequacy. ASHRAE Standard 62.1 identifies sustained indoor CO₂ above 1000 ppm as indicative of inadequate ventilation. Peer-reviewed studies have demonstrated measurable reductions in cognitive performance at concentrations of 1000 ppm, with more pronounced effects above 2500 ppm.</w:t>
+        <w:t xml:space="preserve">CO₂ concentration is therefore a direct, measurable proxy for both occupancy load and ventilation adequacy. A commonly used guideline, derived from earlier ASHRAE ventilation guidance, treats sustained indoor CO₂ above about 1000 ppm (roughly 700 ppm above outdoor levels) as a sign of inadequate ventilation. Satish et al. (2012) measured reductions in decision-making performance at 1000 ppm and larger effects at 2500 ppm, although later studies have not all replicated the effect.</w:t>
       </w:r>
     </w:p>
     <w:bookmarkEnd w:id="20"/>
@@ -466,7 +466,7 @@
     </w:p>
     <w:bookmarkEnd w:id="22"/>
     <w:bookmarkEnd w:id="23"/>
-    <w:bookmarkStart w:id="31" w:name="inputs-and-outputs"/>
+    <w:bookmarkStart w:id="28" w:name="inputs-and-outputs"/>
     <w:p>
       <w:pPr>
         <w:pStyle w:val="Heading2"/>
@@ -922,7 +922,284 @@
         <w:t xml:space="preserve"> </w:t>
       </w:r>
       <w:r>
-        <w:t xml:space="preserve">predictor of itself. The physical justification is clear from the mass-balance equation: the future concentration depends on where it is now, which direction it is trending, and the recent context that drives that trend.</w:t>
+        <w:t xml:space="preserve">predictor of itself. The physical justification comes from the mass-balance equation: solving it over one 15-minute step</w:t>
+      </w:r>
+      <w:r>
+        <w:t xml:space="preserve"> </w:t>
+      </w:r>
+      <m:oMath>
+        <m:r>
+          <m:t>Δ</m:t>
+        </m:r>
+        <m:r>
+          <m:t>t</m:t>
+        </m:r>
+      </m:oMath>
+      <w:r>
+        <w:t xml:space="preserve"> </w:t>
+      </w:r>
+      <w:r>
+        <w:t xml:space="preserve">with occupancy and ventilation held constant gives</w:t>
+      </w:r>
+      <w:r>
+        <w:t xml:space="preserve"> </w:t>
+      </w:r>
+      <m:oMath>
+        <m:sSub>
+          <m:e>
+            <m:r>
+              <m:t>C</m:t>
+            </m:r>
+          </m:e>
+          <m:sub>
+            <m:r>
+              <m:t>t</m:t>
+            </m:r>
+            <m:r>
+              <m:rPr>
+                <m:sty m:val="p"/>
+              </m:rPr>
+              <m:t>+</m:t>
+            </m:r>
+            <m:r>
+              <m:t>1</m:t>
+            </m:r>
+          </m:sub>
+        </m:sSub>
+        <m:r>
+          <m:rPr>
+            <m:sty m:val="p"/>
+          </m:rPr>
+          <m:t>=</m:t>
+        </m:r>
+        <m:sSup>
+          <m:e>
+            <m:r>
+              <m:t>e</m:t>
+            </m:r>
+          </m:e>
+          <m:sup>
+            <m:r>
+              <m:rPr>
+                <m:sty m:val="p"/>
+              </m:rPr>
+              <m:t>−</m:t>
+            </m:r>
+            <m:r>
+              <m:t>λ</m:t>
+            </m:r>
+            <m:r>
+              <m:t>Δ</m:t>
+            </m:r>
+            <m:r>
+              <m:t>t</m:t>
+            </m:r>
+          </m:sup>
+        </m:sSup>
+        <m:r>
+          <m:t> </m:t>
+        </m:r>
+        <m:sSub>
+          <m:e>
+            <m:r>
+              <m:t>C</m:t>
+            </m:r>
+          </m:e>
+          <m:sub>
+            <m:r>
+              <m:t>t</m:t>
+            </m:r>
+          </m:sub>
+        </m:sSub>
+        <m:r>
+          <m:rPr>
+            <m:sty m:val="p"/>
+          </m:rPr>
+          <m:t>+</m:t>
+        </m:r>
+        <m:d>
+          <m:dPr>
+            <m:begChr m:val="("/>
+            <m:endChr m:val=")"/>
+            <m:sepChr m:val=""/>
+            <m:grow/>
+          </m:dPr>
+          <m:e>
+            <m:r>
+              <m:t>1</m:t>
+            </m:r>
+            <m:r>
+              <m:rPr>
+                <m:sty m:val="p"/>
+              </m:rPr>
+              <m:t>−</m:t>
+            </m:r>
+            <m:sSup>
+              <m:e>
+                <m:r>
+                  <m:t>e</m:t>
+                </m:r>
+              </m:e>
+              <m:sup>
+                <m:r>
+                  <m:rPr>
+                    <m:sty m:val="p"/>
+                  </m:rPr>
+                  <m:t>−</m:t>
+                </m:r>
+                <m:r>
+                  <m:t>λ</m:t>
+                </m:r>
+                <m:r>
+                  <m:t>Δ</m:t>
+                </m:r>
+                <m:r>
+                  <m:t>t</m:t>
+                </m:r>
+              </m:sup>
+            </m:sSup>
+          </m:e>
+        </m:d>
+        <m:r>
+          <m:t> </m:t>
+        </m:r>
+        <m:sSub>
+          <m:e>
+            <m:r>
+              <m:t>C</m:t>
+            </m:r>
+          </m:e>
+          <m:sub>
+            <m:r>
+              <m:t>s</m:t>
+            </m:r>
+            <m:r>
+              <m:t>s</m:t>
+            </m:r>
+          </m:sub>
+        </m:sSub>
+      </m:oMath>
+      <w:r>
+        <w:t xml:space="preserve">, where</w:t>
+      </w:r>
+      <w:r>
+        <w:t xml:space="preserve"> </w:t>
+      </w:r>
+      <m:oMath>
+        <m:sSub>
+          <m:e>
+            <m:r>
+              <m:t>C</m:t>
+            </m:r>
+          </m:e>
+          <m:sub>
+            <m:r>
+              <m:t>s</m:t>
+            </m:r>
+            <m:r>
+              <m:t>s</m:t>
+            </m:r>
+          </m:sub>
+        </m:sSub>
+        <m:r>
+          <m:rPr>
+            <m:sty m:val="p"/>
+          </m:rPr>
+          <m:t>=</m:t>
+        </m:r>
+        <m:sSub>
+          <m:e>
+            <m:r>
+              <m:t>C</m:t>
+            </m:r>
+          </m:e>
+          <m:sub>
+            <m:r>
+              <m:rPr>
+                <m:nor/>
+                <m:sty m:val="p"/>
+              </m:rPr>
+              <m:t>out</m:t>
+            </m:r>
+          </m:sub>
+        </m:sSub>
+        <m:r>
+          <m:rPr>
+            <m:sty m:val="p"/>
+          </m:rPr>
+          <m:t>+</m:t>
+        </m:r>
+        <m:r>
+          <m:t>G</m:t>
+        </m:r>
+        <m:r>
+          <m:t>N</m:t>
+        </m:r>
+        <m:r>
+          <m:rPr>
+            <m:sty m:val="p"/>
+          </m:rPr>
+          <m:t>/</m:t>
+        </m:r>
+        <m:d>
+          <m:dPr>
+            <m:begChr m:val="("/>
+            <m:endChr m:val=")"/>
+            <m:sepChr m:val=""/>
+            <m:grow/>
+          </m:dPr>
+          <m:e>
+            <m:r>
+              <m:t>λ</m:t>
+            </m:r>
+            <m:r>
+              <m:t>V</m:t>
+            </m:r>
+          </m:e>
+        </m:d>
+      </m:oMath>
+      <w:r>
+        <w:t xml:space="preserve"> </w:t>
+      </w:r>
+      <w:r>
+        <w:t xml:space="preserve">is the steady-state level. The next value is a scaled copy of the current one plus a term that depends on occupancy and ventilation — so the current level, its recent trend and the time of day (a proxy for the occupancy and ventilation schedule) are the natural inputs. With a typical</w:t>
+      </w:r>
+      <w:r>
+        <w:t xml:space="preserve"> </w:t>
+      </w:r>
+      <m:oMath>
+        <m:r>
+          <m:t>λ</m:t>
+        </m:r>
+      </m:oMath>
+      <w:r>
+        <w:t xml:space="preserve"> </w:t>
+      </w:r>
+      <w:r>
+        <w:t xml:space="preserve">of about 2 air changes per hour, the room’s time constant</w:t>
+      </w:r>
+      <w:r>
+        <w:t xml:space="preserve"> </w:t>
+      </w:r>
+      <m:oMath>
+        <m:r>
+          <m:t>1</m:t>
+        </m:r>
+        <m:r>
+          <m:rPr>
+            <m:sty m:val="p"/>
+          </m:rPr>
+          <m:t>/</m:t>
+        </m:r>
+        <m:r>
+          <m:t>λ</m:t>
+        </m:r>
+      </m:oMath>
+      <w:r>
+        <w:t xml:space="preserve"> </w:t>
+      </w:r>
+      <w:r>
+        <w:t xml:space="preserve">is about 30 minutes, which is why a 15-minute horizon is both actionable and predictable from recent history.</w:t>
       </w:r>
     </w:p>
     <w:bookmarkEnd w:id="24"/>
@@ -1114,7 +1391,7 @@
               <w:t xml:space="preserve">co2_now</w:t>
             </w:r>
             <w:r>
-              <w:t xml:space="preserve">, this gives the instantaneous rate of change — whether CO₂ is rising, falling, or stable at the moment of prediction.</w:t>
+              <w:t xml:space="preserve">, this gives the average rate of change over the last 15 minutes (a backward finite difference) — whether CO₂ is rising, falling, or stable at the moment of prediction.</w:t>
             </w:r>
           </w:p>
         </w:tc>
@@ -1167,7 +1444,7 @@
               <w:jc w:val="left"/>
             </w:pPr>
             <w:r>
-              <w:t xml:space="preserve">Mean of the preceding four 15-minute bins (1 hour). Captures the medium-term trend — whether CO₂ has been consistently rising through the morning, plateauing, or declining as ventilation increases.</w:t>
+              <w:t xml:space="preserve">Mean of the last four 15-minute bins, including the current one (the hour ending now). Captures the medium-term trend — whether CO₂ has been consistently rising through the morning, plateauing, or declining as ventilation increases.</w:t>
             </w:r>
           </w:p>
         </w:tc>
@@ -1512,7 +1789,7 @@
               <w:jc w:val="left"/>
             </w:pPr>
             <w:r>
-              <w:t xml:space="preserve">1 if Saturday or Sunday. Weekend CO₂ patterns differ substantially from weekdays (near-ambient levels most of the day). An explicit binary flag makes this distinction easy for linear models to learn.</w:t>
+              <w:t xml:space="preserve">1 if Saturday or Sunday, computed from each row’s timestamp. Included because weekend occupancy and ventilation are expected to differ, and a binary flag makes that easy for linear models to learn. For this sensor the expected difference does not appear: weekday and weekend CO₂ are the same (Section 4).</w:t>
             </w:r>
           </w:p>
         </w:tc>
@@ -1537,7 +1814,7 @@
       </w:r>
     </w:p>
     <w:bookmarkEnd w:id="25"/>
-    <w:bookmarkStart w:id="29" w:name="handling-missing-and-invalid-inputs"/>
+    <w:bookmarkStart w:id="26" w:name="handling-missing-and-invalid-inputs"/>
     <w:p>
       <w:pPr>
         <w:pStyle w:val="Heading3"/>
@@ -1620,70 +1897,7 @@
         <w:pStyle w:val="FirstParagraph"/>
       </w:pPr>
       <w:r>
-        <w:t xml:space="preserve">The figure below shows the impact:</w:t>
-      </w:r>
-    </w:p>
-    <w:p>
-      <w:pPr>
-        <w:pStyle w:val="CaptionedFigure"/>
-      </w:pPr>
-      <w:r>
-        <w:drawing>
-          <wp:inline>
-            <wp:extent cx="3931919" cy="1924484"/>
-            <wp:effectExtent b="0" l="0" r="0" t="0"/>
-            <wp:docPr descr="Data pipeline: raw candidate timestamps versus dropped rows versus rows retained for modelling" title="" id="27" name="Picture"/>
-            <a:graphic>
-              <a:graphicData uri="http://schemas.openxmlformats.org/drawingml/2006/picture">
-                <pic:pic>
-                  <pic:nvPicPr>
-                    <pic:cNvPr descr="chart_data_pipeline.png" id="28" name="Picture"/>
-                    <pic:cNvPicPr>
-                      <a:picLocks noChangeArrowheads="1" noChangeAspect="1"/>
-                    </pic:cNvPicPr>
-                  </pic:nvPicPr>
-                  <pic:blipFill>
-                    <a:blip r:embed="rId26"/>
-                    <a:stretch>
-                      <a:fillRect/>
-                    </a:stretch>
-                  </pic:blipFill>
-                  <pic:spPr bwMode="auto">
-                    <a:xfrm>
-                      <a:off x="0" y="0"/>
-                      <a:ext cx="3931919" cy="1924484"/>
-                    </a:xfrm>
-                    <a:prstGeom prst="rect">
-                      <a:avLst/>
-                    </a:prstGeom>
-                    <a:noFill/>
-                    <a:ln w="9525">
-                      <a:noFill/>
-                      <a:headEnd/>
-                      <a:tailEnd/>
-                    </a:ln>
-                  </pic:spPr>
-                </pic:pic>
-              </a:graphicData>
-            </a:graphic>
-          </wp:inline>
-        </w:drawing>
-      </w:r>
-    </w:p>
-    <w:p>
-      <w:pPr>
-        <w:pStyle w:val="ImageCaption"/>
-      </w:pPr>
-      <w:r>
-        <w:t xml:space="preserve">Data pipeline: raw candidate timestamps versus dropped rows versus rows retained for modelling</w:t>
-      </w:r>
-    </w:p>
-    <w:p>
-      <w:pPr>
-        <w:pStyle w:val="BodyText"/>
-      </w:pPr>
-      <w:r>
-        <w:t xml:space="preserve">Of 84,576 candidate 15-minute timestamps in the raw log, 17,010 (20.1%) have all four required values present and are retained for modelling. The remaining 67,566 rows (79.9%) are dropped.</w:t>
+        <w:t xml:space="preserve">Of 84,576 candidate 15-minute timestamps in the raw log, 17,010 (20.1%) have all nine inputs and the target present and are retained for modelling. The remaining 67,566 rows (79.9%) are dropped (data-pipeline figure in Appendix A).</w:t>
       </w:r>
     </w:p>
     <w:p>
@@ -1762,8 +1976,8 @@
         <w:t xml:space="preserve">there are 649 such intervals covering 4,978 hours. Section 4.1 applies the same rule to every sensor.</w:t>
       </w:r>
     </w:p>
-    <w:bookmarkEnd w:id="29"/>
-    <w:bookmarkStart w:id="30" w:name="output"/>
+    <w:bookmarkEnd w:id="26"/>
+    <w:bookmarkStart w:id="27" w:name="output"/>
     <w:p>
       <w:pPr>
         <w:pStyle w:val="Heading3"/>
@@ -1869,7 +2083,7 @@
         <w:pStyle w:val="BodyText"/>
       </w:pPr>
       <w:r>
-        <w:t xml:space="preserve">The output is a single continuous value. It represents the model’s best estimate of what the sensor will read at the next 15-minute interval. The model does not apply a threshold or issue a ventilation command — that decision logic belongs to the building management system consuming the forecast. A practical deployment rule might set an early-warning trigger at 750 ppm (50 ppm below the 800 ppm concern threshold) to account for the model’s prediction error margin.</w:t>
+        <w:t xml:space="preserve">The output is a single continuous value. It represents the model’s best estimate of what the sensor will read at the next 15-minute interval. The model does not apply a threshold or issue a ventilation command — that decision logic belongs to the building management system consuming the forecast. A practical deployment rule might set an early-warning trigger at 750 ppm — 50 ppm below 800 ppm, a common stricter indoor-air-quality target than the 1000 ppm guideline in Section 1.1. The 50 ppm margin is about six times the MAE and twice the RMSE (Section 4), and matters most at high CO₂, where the models under-predict (Appendix A).</w:t>
       </w:r>
     </w:p>
     <w:p>
@@ -1879,9 +2093,9 @@
         </w:pict>
       </w:r>
     </w:p>
-    <w:bookmarkEnd w:id="30"/>
-    <w:bookmarkEnd w:id="31"/>
-    <w:bookmarkStart w:id="35" w:name="computational-solution"/>
+    <w:bookmarkEnd w:id="27"/>
+    <w:bookmarkEnd w:id="28"/>
+    <w:bookmarkStart w:id="32" w:name="computational-solution"/>
     <w:p>
       <w:pPr>
         <w:pStyle w:val="Heading2"/>
@@ -1890,7 +2104,7 @@
         <w:t xml:space="preserve">3. Computational Solution</w:t>
       </w:r>
     </w:p>
-    <w:bookmarkStart w:id="32" w:name="implementation"/>
+    <w:bookmarkStart w:id="29" w:name="implementation"/>
     <w:p>
       <w:pPr>
         <w:pStyle w:val="Heading3"/>
@@ -1937,8 +2151,8 @@
         <w:t xml:space="preserve">preprocessing step before the regression estimator. Standardisation transforms each feature to zero mean and unit variance. This is strictly necessary for SVR and the neural network, both of which are sensitive to feature scale: the RBF kernel computes Euclidean distances in feature space, and unscaled features with large dynamic ranges (CO₂ in ppm versus a binary weekend flag) would distort those distances. Applying the same preprocessing to all four models ensures that any differences in performance are attributable to the model, not to data scale effects.</w:t>
       </w:r>
     </w:p>
-    <w:bookmarkEnd w:id="32"/>
-    <w:bookmarkStart w:id="33" w:name="how-each-method-works"/>
+    <w:bookmarkEnd w:id="29"/>
+    <w:bookmarkStart w:id="30" w:name="how-each-method-works"/>
     <w:p>
       <w:pPr>
         <w:pStyle w:val="Heading3"/>
@@ -2362,8 +2576,8 @@
         <w:t xml:space="preserve">uses a multilayer perceptron with two hidden layers (32 units, then 16 units, both with ReLU activations) followed by a linear output. ReLU introduces piecewise-linear non-linearity at each layer, allowing the network to approximate arbitrary continuous functions. Training uses the Adam optimiser with early stopping (patience = 10 validation epochs) to halt before the model overfits the training period. Of the four methods, this is the most expressive but also the least interpretable and the most sensitive to the amount of training data.</w:t>
       </w:r>
     </w:p>
-    <w:bookmarkEnd w:id="33"/>
-    <w:bookmarkStart w:id="34" w:name="parameters"/>
+    <w:bookmarkEnd w:id="30"/>
+    <w:bookmarkStart w:id="31" w:name="parameters"/>
     <w:p>
       <w:pPr>
         <w:pStyle w:val="Heading3"/>
@@ -2829,9 +3043,9 @@
         </w:pict>
       </w:r>
     </w:p>
-    <w:bookmarkEnd w:id="34"/>
-    <w:bookmarkEnd w:id="35"/>
-    <w:bookmarkStart w:id="43" w:name="alternative-solutions-and-comparison"/>
+    <w:bookmarkEnd w:id="31"/>
+    <w:bookmarkEnd w:id="32"/>
+    <w:bookmarkStart w:id="40" w:name="alternative-solutions-and-comparison"/>
     <w:p>
       <w:pPr>
         <w:pStyle w:val="Heading2"/>
@@ -3632,10 +3846,54 @@
         <w:pStyle w:val="BodyText"/>
       </w:pPr>
       <w:r>
-        <w:t xml:space="preserve">Row-by-row diagnostic plots (predictions over time, predicted vs. actual, and residuals) are given in Appendix A.</w:t>
-      </w:r>
-    </w:p>
-    <w:bookmarkStart w:id="42" w:name="Xf965eae6f400442b87f8df1b02fb52bece3b127"/>
+        <w:t xml:space="preserve">The sensor’s own daily pattern points the same way (</w:t>
+      </w:r>
+      <w:r>
+        <w:rPr>
+          <w:rStyle w:val="VerbatimChar"/>
+        </w:rPr>
+        <w:t xml:space="preserve">scripts/weekday_weekend_comparison.py</w:t>
+      </w:r>
+      <w:r>
+        <w:t xml:space="preserve">). In room G.38 (sensor</w:t>
+      </w:r>
+      <w:r>
+        <w:t xml:space="preserve"> </w:t>
+      </w:r>
+      <w:r>
+        <w:rPr>
+          <w:rStyle w:val="VerbatimChar"/>
+        </w:rPr>
+        <w:t xml:space="preserve">6012002000869</w:t>
+      </w:r>
+      <w:r>
+        <w:t xml:space="preserve">), weekday CO₂ peaks at 13:00, and during working hours (9 am–5 pm) it averages 505 ppm on weekdays against 450 ppm at weekends — the signature of an occupied room. Sensor</w:t>
+      </w:r>
+      <w:r>
+        <w:t xml:space="preserve"> </w:t>
+      </w:r>
+      <w:r>
+        <w:rPr>
+          <w:rStyle w:val="VerbatimChar"/>
+        </w:rPr>
+        <w:t xml:space="preserve">6012002000326</w:t>
+      </w:r>
+      <w:r>
+        <w:t xml:space="preserve"> </w:t>
+      </w:r>
+      <w:r>
+        <w:t xml:space="preserve">shows neither: its weekday CO₂ peaks at 07:00 and is lowest at 15:00, and weekday and weekend working-hours means are identical (436 ppm). This sensor’s CO₂ follows the building’s ventilation schedule rather than its occupants, which is why neither occupancy nor the weekend flag helps.</w:t>
+      </w:r>
+    </w:p>
+    <w:p>
+      <w:pPr>
+        <w:pStyle w:val="BodyText"/>
+      </w:pPr>
+      <w:r>
+        <w:t xml:space="preserve">Row-by-row diagnostic plots (predictions over time, predicted vs. actual, and residuals) are in Appendix A.</w:t>
+      </w:r>
+    </w:p>
+    <w:bookmarkStart w:id="39" w:name="Xf965eae6f400442b87f8df1b02fb52bece3b127"/>
     <w:p>
       <w:pPr>
         <w:pStyle w:val="Heading3"/>
@@ -4212,18 +4470,18 @@
           <wp:inline>
             <wp:extent cx="4754880" cy="1536192"/>
             <wp:effectExtent b="0" l="0" r="0" t="0"/>
-            <wp:docPr descr="Usable unbroken intervals (green) and re-transmitted stale packets (grey) for each sensor" title="" id="37" name="Picture"/>
+            <wp:docPr descr="Usable unbroken intervals (green) and re-transmitted stale packets (grey) for each sensor" title="" id="34" name="Picture"/>
             <a:graphic>
               <a:graphicData uri="http://schemas.openxmlformats.org/drawingml/2006/picture">
                 <pic:pic>
                   <pic:nvPicPr>
-                    <pic:cNvPr descr="chart15_sensor_intervals.png" id="38" name="Picture"/>
+                    <pic:cNvPr descr="chart15_sensor_intervals.png" id="35" name="Picture"/>
                     <pic:cNvPicPr>
                       <a:picLocks noChangeArrowheads="1" noChangeAspect="1"/>
                     </pic:cNvPicPr>
                   </pic:nvPicPr>
                   <pic:blipFill>
-                    <a:blip r:embed="rId36"/>
+                    <a:blip r:embed="rId33"/>
                     <a:stretch>
                       <a:fillRect/>
                     </a:stretch>
@@ -5105,18 +5363,18 @@
           <wp:inline>
             <wp:extent cx="4754880" cy="1682496"/>
             <wp:effectExtent b="0" l="0" r="0" t="0"/>
-            <wp:docPr descr="MAE for Experiment A (left) and Experiment B (right)" title="" id="40" name="Picture"/>
+            <wp:docPr descr="MAE for Experiment A (left) and Experiment B (right)" title="" id="37" name="Picture"/>
             <a:graphic>
               <a:graphicData uri="http://schemas.openxmlformats.org/drawingml/2006/picture">
                 <pic:pic>
                   <pic:nvPicPr>
-                    <pic:cNvPr descr="chart16_multi_sensor_results.png" id="41" name="Picture"/>
+                    <pic:cNvPr descr="chart16_multi_sensor_results.png" id="38" name="Picture"/>
                     <pic:cNvPicPr>
                       <a:picLocks noChangeArrowheads="1" noChangeAspect="1"/>
                     </pic:cNvPicPr>
                   </pic:nvPicPr>
                   <pic:blipFill>
-                    <a:blip r:embed="rId39"/>
+                    <a:blip r:embed="rId36"/>
                     <a:stretch>
                       <a:fillRect/>
                     </a:stretch>
@@ -5169,12 +5427,27 @@
         <w:t xml:space="preserve">worse than persistence</w:t>
       </w:r>
       <w:r>
-        <w:t xml:space="preserve">. The models learn room-specific behaviour — the typical CO₂ level each room settles to and how quickly it returns there — so a model from one room pulls its forecasts toward the wrong baseline in another. The practical conclusion is that a forecaster of this kind must be trained per room (or per sensor); it cannot simply be copied between rooms.</w:t>
-      </w:r>
-    </w:p>
-    <w:bookmarkEnd w:id="42"/>
-    <w:bookmarkEnd w:id="43"/>
-    <w:bookmarkStart w:id="51" w:name="validation"/>
+        <w:t xml:space="preserve">. The models learn room-specific behaviour — the typical CO₂ level each room settles to and how quickly it returns there — so a model from one room pulls its forecasts toward the wrong baseline in another. The two rooms are driven differently: G.38 follows its occupants (a weekday midday peak), while sensor</w:t>
+      </w:r>
+      <w:r>
+        <w:t xml:space="preserve"> </w:t>
+      </w:r>
+      <w:r>
+        <w:rPr>
+          <w:rStyle w:val="VerbatimChar"/>
+        </w:rPr>
+        <w:t xml:space="preserve">6012002000326</w:t>
+      </w:r>
+      <w:r>
+        <w:t xml:space="preserve"> </w:t>
+      </w:r>
+      <w:r>
+        <w:t xml:space="preserve">follows the ventilation schedule (Section 4). The practical conclusion is that a forecaster of this kind must be trained per room (or per sensor); it cannot simply be copied between rooms.</w:t>
+      </w:r>
+    </w:p>
+    <w:bookmarkEnd w:id="39"/>
+    <w:bookmarkEnd w:id="40"/>
+    <w:bookmarkStart w:id="45" w:name="validation"/>
     <w:p>
       <w:pPr>
         <w:pStyle w:val="Heading2"/>
@@ -5183,7 +5456,7 @@
         <w:t xml:space="preserve">5. Validation</w:t>
       </w:r>
     </w:p>
-    <w:bookmarkStart w:id="47" w:name="traintest-split"/>
+    <w:bookmarkStart w:id="41" w:name="traintest-split"/>
     <w:p>
       <w:pPr>
         <w:pStyle w:val="Heading3"/>
@@ -5205,66 +5478,11 @@
         <w:pStyle w:val="BodyText"/>
       </w:pPr>
       <w:r>
-        <w:t xml:space="preserve">A random split was deliberately not used. CO₂ time series are strongly autocorrelated: adjacent readings are similar to one another. A random split would scatter test points throughout the training period, allowing the model to effectively look up nearby values seen during training. The resulting test score would measure interpolation ability rather than the ability to forecast a genuinely unseen future period. The chronological split correctly simulates deployment conditions.</w:t>
-      </w:r>
-    </w:p>
-    <w:p>
-      <w:pPr>
-        <w:pStyle w:val="CaptionedFigure"/>
-      </w:pPr>
-      <w:r>
-        <w:drawing>
-          <wp:inline>
-            <wp:extent cx="3931919" cy="967857"/>
-            <wp:effectExtent b="0" l="0" r="0" t="0"/>
-            <wp:docPr descr="Chronological train/test split over the full sensor history for sensor 6012002000326" title="" id="45" name="Picture"/>
-            <a:graphic>
-              <a:graphicData uri="http://schemas.openxmlformats.org/drawingml/2006/picture">
-                <pic:pic>
-                  <pic:nvPicPr>
-                    <pic:cNvPr descr="chart14_train_test_split.png" id="46" name="Picture"/>
-                    <pic:cNvPicPr>
-                      <a:picLocks noChangeArrowheads="1" noChangeAspect="1"/>
-                    </pic:cNvPicPr>
-                  </pic:nvPicPr>
-                  <pic:blipFill>
-                    <a:blip r:embed="rId44"/>
-                    <a:stretch>
-                      <a:fillRect/>
-                    </a:stretch>
-                  </pic:blipFill>
-                  <pic:spPr bwMode="auto">
-                    <a:xfrm>
-                      <a:off x="0" y="0"/>
-                      <a:ext cx="3931919" cy="967857"/>
-                    </a:xfrm>
-                    <a:prstGeom prst="rect">
-                      <a:avLst/>
-                    </a:prstGeom>
-                    <a:noFill/>
-                    <a:ln w="9525">
-                      <a:noFill/>
-                      <a:headEnd/>
-                      <a:tailEnd/>
-                    </a:ln>
-                  </pic:spPr>
-                </pic:pic>
-              </a:graphicData>
-            </a:graphic>
-          </wp:inline>
-        </w:drawing>
-      </w:r>
-    </w:p>
-    <w:p>
-      <w:pPr>
-        <w:pStyle w:val="ImageCaption"/>
-      </w:pPr>
-      <w:r>
-        <w:t xml:space="preserve">Chronological train/test split over the full sensor history for sensor 6012002000326</w:t>
-      </w:r>
-    </w:p>
-    <w:bookmarkEnd w:id="47"/>
-    <w:bookmarkStart w:id="48" w:name="evaluation-metrics"/>
+        <w:t xml:space="preserve">A random split was deliberately not used. CO₂ time series are strongly autocorrelated: adjacent readings are similar to one another. A random split would scatter test points throughout the training period, allowing the model to effectively look up nearby values seen during training. The resulting test score would measure interpolation ability rather than the ability to forecast a genuinely unseen future period. The chronological split correctly simulates deployment conditions (timeline figure in Appendix A).</w:t>
+      </w:r>
+    </w:p>
+    <w:bookmarkEnd w:id="41"/>
+    <w:bookmarkStart w:id="42" w:name="evaluation-metrics"/>
     <w:p>
       <w:pPr>
         <w:pStyle w:val="Heading3"/>
@@ -5791,8 +6009,8 @@
         <w:t xml:space="preserve">The proportion of variance in the target explained by the model. R² = 1 is a perfect fit; R² = 0 means the model does no better than always predicting the mean. All four models achieve R² in the range 0.19–0.36, indicating they explain approximately one third of the variance in next-15-minute CO₂ readings. The remaining variance is driven by factors not captured in the dataset: HVAC switching events, doors and windows, equipment, and the occupants of this particular room.</w:t>
       </w:r>
     </w:p>
-    <w:bookmarkEnd w:id="48"/>
-    <w:bookmarkStart w:id="49" w:name="Xd8f2789288cdc47fb919a2a3d44a84a474eb10b"/>
+    <w:bookmarkEnd w:id="42"/>
+    <w:bookmarkStart w:id="43" w:name="Xd8f2789288cdc47fb919a2a3d44a84a474eb10b"/>
     <w:p>
       <w:pPr>
         <w:pStyle w:val="Heading3"/>
@@ -5925,8 +6143,8 @@
         <w:t xml:space="preserve">is physically working and measuring real environmental conditions, even without a documented room label.</w:t>
       </w:r>
     </w:p>
-    <w:bookmarkEnd w:id="49"/>
-    <w:bookmarkStart w:id="50" w:name="numerical-integration-convergence"/>
+    <w:bookmarkEnd w:id="43"/>
+    <w:bookmarkStart w:id="44" w:name="numerical-integration-convergence"/>
     <w:p>
       <w:pPr>
         <w:pStyle w:val="Heading3"/>
@@ -6224,9 +6442,9 @@
         </w:pict>
       </w:r>
     </w:p>
-    <w:bookmarkEnd w:id="50"/>
-    <w:bookmarkEnd w:id="51"/>
-    <w:bookmarkStart w:id="55" w:name="limitations-and-known-failure-modes"/>
+    <w:bookmarkEnd w:id="44"/>
+    <w:bookmarkEnd w:id="45"/>
+    <w:bookmarkStart w:id="49" w:name="limitations-and-known-failure-modes"/>
     <w:p>
       <w:pPr>
         <w:pStyle w:val="Heading2"/>
@@ -6340,18 +6558,18 @@
           <wp:inline>
             <wp:extent cx="4754880" cy="2099870"/>
             <wp:effectExtent b="0" l="0" r="0" t="0"/>
-            <wp:docPr descr="Best-lag correlation between each zone’s occupancy and the 15-minute change in each sensor’s reading" title="" id="53" name="Picture"/>
+            <wp:docPr descr="Best-lag correlation between each zone’s occupancy and the 15-minute change in each sensor’s reading" title="" id="47" name="Picture"/>
             <a:graphic>
               <a:graphicData uri="http://schemas.openxmlformats.org/drawingml/2006/picture">
                 <pic:pic>
                   <pic:nvPicPr>
-                    <pic:cNvPr descr="chart10_zone_matching.png" id="54" name="Picture"/>
+                    <pic:cNvPr descr="chart10_zone_matching.png" id="48" name="Picture"/>
                     <pic:cNvPicPr>
                       <a:picLocks noChangeArrowheads="1" noChangeAspect="1"/>
                     </pic:cNvPicPr>
                   </pic:nvPicPr>
                   <pic:blipFill>
-                    <a:blip r:embed="rId52"/>
+                    <a:blip r:embed="rId46"/>
                     <a:stretch>
                       <a:fillRect/>
                     </a:stretch>
@@ -6677,8 +6895,8 @@
         </w:pict>
       </w:r>
     </w:p>
-    <w:bookmarkEnd w:id="55"/>
-    <w:bookmarkStart w:id="56" w:name="ai-use-and-critical-reflection"/>
+    <w:bookmarkEnd w:id="49"/>
+    <w:bookmarkStart w:id="50" w:name="ai-use-and-critical-reflection"/>
     <w:p>
       <w:pPr>
         <w:pStyle w:val="Heading2"/>
@@ -6860,6 +7078,18 @@
         <w:t xml:space="preserve">reports/sensor_matching_results.json</w:t>
       </w:r>
       <w:r>
+        <w:t xml:space="preserve">,</w:t>
+      </w:r>
+      <w:r>
+        <w:t xml:space="preserve"> </w:t>
+      </w:r>
+      <w:r>
+        <w:rPr>
+          <w:rStyle w:val="VerbatimChar"/>
+        </w:rPr>
+        <w:t xml:space="preserve">reports/weekday_weekend_results.json</w:t>
+      </w:r>
+      <w:r>
         <w:t xml:space="preserve">) before being recorded here. The integration estimates and convergence results come from scripts that can be rerun to reproduce the same outputs.</w:t>
       </w:r>
     </w:p>
@@ -6888,8 +7118,8 @@
         </w:pict>
       </w:r>
     </w:p>
-    <w:bookmarkEnd w:id="56"/>
-    <w:bookmarkStart w:id="57" w:name="references"/>
+    <w:bookmarkEnd w:id="50"/>
+    <w:bookmarkStart w:id="51" w:name="references"/>
     <w:p>
       <w:pPr>
         <w:pStyle w:val="Heading2"/>
@@ -6967,7 +7197,7 @@
         <w:pStyle w:val="Compact"/>
       </w:pPr>
       <w:r>
-        <w:t xml:space="preserve">Bureau of Meteorology. Daily Weather Observations, Moorabbin Airport (station 086077). http://www.bom.gov.au/climate/dwo/</w:t>
+        <w:t xml:space="preserve">ASHRAE Position Document on Indoor Carbon Dioxide. American Society of Heating, Refrigerating and Air-Conditioning Engineers, 2022.</w:t>
       </w:r>
     </w:p>
     <w:p>
@@ -6979,6 +7209,68 @@
         <w:pStyle w:val="Compact"/>
       </w:pPr>
       <w:r>
+        <w:t xml:space="preserve">Persily, A. &amp; de Jonge, L. (2017). Carbon dioxide generation rates for building occupants.</w:t>
+      </w:r>
+      <w:r>
+        <w:t xml:space="preserve"> </w:t>
+      </w:r>
+      <w:r>
+        <w:rPr>
+          <w:iCs/>
+          <w:i/>
+        </w:rPr>
+        <w:t xml:space="preserve">Indoor Air</w:t>
+      </w:r>
+      <w:r>
+        <w:t xml:space="preserve">, 27(5), 868–879.</w:t>
+      </w:r>
+    </w:p>
+    <w:p>
+      <w:pPr>
+        <w:numPr>
+          <w:ilvl w:val="0"/>
+          <w:numId w:val="1002"/>
+        </w:numPr>
+        <w:pStyle w:val="Compact"/>
+      </w:pPr>
+      <w:r>
+        <w:t xml:space="preserve">Satish, U. et al. (2012). Is CO₂ an indoor pollutant? Direct effects of low-to-moderate CO₂ concentrations on human decision-making performance.</w:t>
+      </w:r>
+      <w:r>
+        <w:t xml:space="preserve"> </w:t>
+      </w:r>
+      <w:r>
+        <w:rPr>
+          <w:iCs/>
+          <w:i/>
+        </w:rPr>
+        <w:t xml:space="preserve">Environmental Health Perspectives</w:t>
+      </w:r>
+      <w:r>
+        <w:t xml:space="preserve">, 120(12), 1671–1677.</w:t>
+      </w:r>
+    </w:p>
+    <w:p>
+      <w:pPr>
+        <w:numPr>
+          <w:ilvl w:val="0"/>
+          <w:numId w:val="1002"/>
+        </w:numPr>
+        <w:pStyle w:val="Compact"/>
+      </w:pPr>
+      <w:r>
+        <w:t xml:space="preserve">Bureau of Meteorology. Daily Weather Observations, Moorabbin Airport (station 086077). http://www.bom.gov.au/climate/dwo/</w:t>
+      </w:r>
+    </w:p>
+    <w:p>
+      <w:pPr>
+        <w:numPr>
+          <w:ilvl w:val="0"/>
+          <w:numId w:val="1002"/>
+        </w:numPr>
+        <w:pStyle w:val="Compact"/>
+      </w:pPr>
+      <w:r>
         <w:t xml:space="preserve">scikit-learn documentation: LinearRegression, DecisionTreeRegressor, SVR, MLPRegressor, StandardScaler, Pipeline. https://scikit-learn.org/</w:t>
       </w:r>
     </w:p>
@@ -6989,19 +7281,129 @@
         </w:pict>
       </w:r>
     </w:p>
-    <w:bookmarkEnd w:id="57"/>
-    <w:bookmarkStart w:id="67" w:name="appendix-a-diagnostic-plots"/>
+    <w:bookmarkEnd w:id="51"/>
+    <w:bookmarkStart w:id="67" w:name="appendix-a-additional-figures"/>
     <w:p>
       <w:pPr>
         <w:pStyle w:val="Heading2"/>
       </w:pPr>
       <w:r>
-        <w:t xml:space="preserve">Appendix A: Diagnostic Plots</w:t>
-      </w:r>
-    </w:p>
-    <w:p>
-      <w:pPr>
-        <w:pStyle w:val="FirstParagraph"/>
+        <w:t xml:space="preserve">Appendix A: Additional Figures</w:t>
+      </w:r>
+    </w:p>
+    <w:p>
+      <w:pPr>
+        <w:pStyle w:val="CaptionedFigure"/>
+      </w:pPr>
+      <w:r>
+        <w:drawing>
+          <wp:inline>
+            <wp:extent cx="3931919" cy="1924484"/>
+            <wp:effectExtent b="0" l="0" r="0" t="0"/>
+            <wp:docPr descr="Data pipeline: raw candidate timestamps versus dropped rows versus rows retained for modelling" title="" id="53" name="Picture"/>
+            <a:graphic>
+              <a:graphicData uri="http://schemas.openxmlformats.org/drawingml/2006/picture">
+                <pic:pic>
+                  <pic:nvPicPr>
+                    <pic:cNvPr descr="chart_data_pipeline.png" id="54" name="Picture"/>
+                    <pic:cNvPicPr>
+                      <a:picLocks noChangeArrowheads="1" noChangeAspect="1"/>
+                    </pic:cNvPicPr>
+                  </pic:nvPicPr>
+                  <pic:blipFill>
+                    <a:blip r:embed="rId52"/>
+                    <a:stretch>
+                      <a:fillRect/>
+                    </a:stretch>
+                  </pic:blipFill>
+                  <pic:spPr bwMode="auto">
+                    <a:xfrm>
+                      <a:off x="0" y="0"/>
+                      <a:ext cx="3931919" cy="1924484"/>
+                    </a:xfrm>
+                    <a:prstGeom prst="rect">
+                      <a:avLst/>
+                    </a:prstGeom>
+                    <a:noFill/>
+                    <a:ln w="9525">
+                      <a:noFill/>
+                      <a:headEnd/>
+                      <a:tailEnd/>
+                    </a:ln>
+                  </pic:spPr>
+                </pic:pic>
+              </a:graphicData>
+            </a:graphic>
+          </wp:inline>
+        </w:drawing>
+      </w:r>
+    </w:p>
+    <w:p>
+      <w:pPr>
+        <w:pStyle w:val="ImageCaption"/>
+      </w:pPr>
+      <w:r>
+        <w:t xml:space="preserve">Data pipeline: raw candidate timestamps versus dropped rows versus rows retained for modelling</w:t>
+      </w:r>
+    </w:p>
+    <w:p>
+      <w:pPr>
+        <w:pStyle w:val="CaptionedFigure"/>
+      </w:pPr>
+      <w:r>
+        <w:drawing>
+          <wp:inline>
+            <wp:extent cx="3931919" cy="967857"/>
+            <wp:effectExtent b="0" l="0" r="0" t="0"/>
+            <wp:docPr descr="Chronological train/test split over the full sensor history for sensor 6012002000326" title="" id="56" name="Picture"/>
+            <a:graphic>
+              <a:graphicData uri="http://schemas.openxmlformats.org/drawingml/2006/picture">
+                <pic:pic>
+                  <pic:nvPicPr>
+                    <pic:cNvPr descr="chart14_train_test_split.png" id="57" name="Picture"/>
+                    <pic:cNvPicPr>
+                      <a:picLocks noChangeArrowheads="1" noChangeAspect="1"/>
+                    </pic:cNvPicPr>
+                  </pic:nvPicPr>
+                  <pic:blipFill>
+                    <a:blip r:embed="rId55"/>
+                    <a:stretch>
+                      <a:fillRect/>
+                    </a:stretch>
+                  </pic:blipFill>
+                  <pic:spPr bwMode="auto">
+                    <a:xfrm>
+                      <a:off x="0" y="0"/>
+                      <a:ext cx="3931919" cy="967857"/>
+                    </a:xfrm>
+                    <a:prstGeom prst="rect">
+                      <a:avLst/>
+                    </a:prstGeom>
+                    <a:noFill/>
+                    <a:ln w="9525">
+                      <a:noFill/>
+                      <a:headEnd/>
+                      <a:tailEnd/>
+                    </a:ln>
+                  </pic:spPr>
+                </pic:pic>
+              </a:graphicData>
+            </a:graphic>
+          </wp:inline>
+        </w:drawing>
+      </w:r>
+    </w:p>
+    <w:p>
+      <w:pPr>
+        <w:pStyle w:val="ImageCaption"/>
+      </w:pPr>
+      <w:r>
+        <w:t xml:space="preserve">Chronological train/test split over the full sensor history for sensor 6012002000326</w:t>
+      </w:r>
+    </w:p>
+    <w:p>
+      <w:pPr>
+        <w:pStyle w:val="BodyText"/>
       </w:pPr>
       <w:r>
         <w:t xml:space="preserve">The comparison table in Section 4 is aggregate; the plots below show what it looks like row by row (Linear Regression, Decision Tree, SVR and Neural Network, with occupancy, on the 0326 test set).</w:t>

</xml_diff>

<commit_message>
Put all figures back in the report body within 10 pages
- Restore diagnostic plots (Section 4.1), data-pipeline chart (2.3) and
  split timeline (5.1) to the main text; remove Appendix A
- Lay out predicted-vs-actual and residual plots as single rows of four
  panels so they take far less page height
- Widen table description columns and tighten wording throughout
  (no findings or numbers removed; AI reflection unchanged)
- Multi-sensor section is Section 4.2 again
</commit_message>
<xml_diff>
--- a/docs/report/MMA3001_Project_Report.docx
+++ b/docs/report/MMA3001_Project_Report.docx
@@ -362,7 +362,7 @@
         <w:pStyle w:val="FirstParagraph"/>
       </w:pPr>
       <w:r>
-        <w:t xml:space="preserve">Most building management systems today control ventilation reactively: CO₂ is measured; if it exceeds a threshold, ventilation increases. The delay between CO₂ rising and the HVAC system responding means occupants are already exposed to degraded air quality before any corrective action is taken. Furthermore, reactive systems tend to overshoot — fans ramp to full capacity after the problem has already developed, consuming more energy than a smooth, anticipatory response would require.</w:t>
+        <w:t xml:space="preserve">Most building management systems control ventilation reactively: when CO₂ exceeds a threshold, ventilation increases. By then occupants are already breathing degraded air, and fans tend to overshoot to full capacity, using more energy than a smooth, anticipatory response.</w:t>
       </w:r>
     </w:p>
     <w:p>
@@ -386,15 +386,7 @@
         <w:t xml:space="preserve"> </w:t>
       </w:r>
       <w:r>
-        <w:t xml:space="preserve">A 15-minute forecast provides sufficient lead time for a building management system to begin increasing ventilation before a threshold is crossed, improving both occupant wellbeing and energy efficiency.</w:t>
-      </w:r>
-    </w:p>
-    <w:p>
-      <w:pPr>
-        <w:pStyle w:val="BodyText"/>
-      </w:pPr>
-      <w:r>
-        <w:t xml:space="preserve">This is a</w:t>
+        <w:t xml:space="preserve">A 15-minute forecast gives a building management system time to raise ventilation before a threshold is crossed. This is a</w:t>
       </w:r>
       <w:r>
         <w:t xml:space="preserve"> </w:t>
@@ -407,7 +399,7 @@
         <w:t xml:space="preserve">supervised regression problem</w:t>
       </w:r>
       <w:r>
-        <w:t xml:space="preserve">: a function is learned that maps a vector of current measurements and engineered time features to a single predicted CO₂ value. Four regression methods from MMA3001 Week 5 are trained and compared on the same dataset, and the contribution of building occupancy data to prediction accuracy is explicitly tested.</w:t>
+        <w:t xml:space="preserve">: a function is learned from current measurements and engineered time features to one predicted CO₂ value. The four Week 5 regression methods are compared, and the value of building occupancy data is tested explicitly.</w:t>
       </w:r>
     </w:p>
     <w:bookmarkEnd w:id="21"/>
@@ -437,15 +429,10 @@
         <w:t xml:space="preserve">6012002000326</w:t>
       </w:r>
       <w:r>
-        <w:t xml:space="preserve">, which has the longest record of genuine readings. It has no documented room location (discussed in Section 6), which limits how well building occupancy can be linked to CO₂ at this location. The results establish whether short-term CO₂ prediction is achievable from sensor history alone and whether occupancy data provides any additional predictive value.</w:t>
-      </w:r>
-    </w:p>
-    <w:p>
-      <w:pPr>
-        <w:pStyle w:val="BodyText"/>
-      </w:pPr>
-      <w:r>
-        <w:t xml:space="preserve">Section 4.1 then extends the analysis to every sensor: each sensor’s record is cut into unbroken intervals, and every interval long enough to form a training example is used. This adds a second sensor (</w:t>
+        <w:t xml:space="preserve">, which has the longest record of genuine readings but no documented room (Section 6), limiting how well occupancy can be linked to it. Section 4.2 extends the analysis to every sensor’s usable intervals, adding sensor</w:t>
+      </w:r>
+      <w:r>
+        <w:t xml:space="preserve"> </w:t>
       </w:r>
       <w:r>
         <w:rPr>
@@ -454,7 +441,10 @@
         <w:t xml:space="preserve">6012002000869</w:t>
       </w:r>
       <w:r>
-        <w:t xml:space="preserve">) and tests whether pooling data across sensors helps, and whether a model trained in one room transfers to another.</w:t>
+        <w:t xml:space="preserve"> </w:t>
+      </w:r>
+      <w:r>
+        <w:t xml:space="preserve">to test whether pooling sensors helps and whether a model transfers between rooms.</w:t>
       </w:r>
     </w:p>
     <w:p>
@@ -466,7 +456,7 @@
     </w:p>
     <w:bookmarkEnd w:id="22"/>
     <w:bookmarkEnd w:id="23"/>
-    <w:bookmarkStart w:id="28" w:name="inputs-and-outputs"/>
+    <w:bookmarkStart w:id="31" w:name="inputs-and-outputs"/>
     <w:p>
       <w:pPr>
         <w:pStyle w:val="Heading2"/>
@@ -1220,10 +1210,10 @@
         <w:jc w:val="start"/>
       </w:tblPr>
       <w:tblGrid>
-        <w:gridCol w:w="1980"/>
-        <w:gridCol w:w="1980"/>
-        <w:gridCol w:w="1980"/>
-        <w:gridCol w:w="1980"/>
+        <w:gridCol w:w="1466"/>
+        <w:gridCol w:w="1026"/>
+        <w:gridCol w:w="733"/>
+        <w:gridCol w:w="4693"/>
       </w:tblGrid>
       <w:tr>
         <w:trPr>
@@ -1814,7 +1804,7 @@
       </w:r>
     </w:p>
     <w:bookmarkEnd w:id="25"/>
-    <w:bookmarkStart w:id="26" w:name="handling-missing-and-invalid-inputs"/>
+    <w:bookmarkStart w:id="29" w:name="handling-missing-and-invalid-inputs"/>
     <w:p>
       <w:pPr>
         <w:pStyle w:val="Heading3"/>
@@ -1828,43 +1818,7 @@
         <w:pStyle w:val="FirstParagraph"/>
       </w:pPr>
       <w:r>
-        <w:t xml:space="preserve">CO₂ readings are absent wherever the sensor was not producing new measurements. The dominant data loss is a 636-day gap in genuine readings (11 December 2023 to 7 September 2025). For roughly eight months of that gap the sensor was not silent: it re-transmitted one stale packet (the same timestamp and value) about every 11 minutes, which is why the raw log contains far more rows than real measurements (Section 6). Genuine readings for this sensor run from 7 September 2025 to 22 April 2026. The missing-data policy is as follows:</w:t>
-      </w:r>
-    </w:p>
-    <w:p>
-      <w:pPr>
-        <w:numPr>
-          <w:ilvl w:val="0"/>
-          <w:numId w:val="1001"/>
-        </w:numPr>
-        <w:pStyle w:val="Compact"/>
-      </w:pPr>
-      <w:r>
-        <w:t xml:space="preserve">Any row where</w:t>
-      </w:r>
-      <w:r>
-        <w:t xml:space="preserve"> </w:t>
-      </w:r>
-      <w:r>
-        <w:rPr>
-          <w:rStyle w:val="VerbatimChar"/>
-        </w:rPr>
-        <w:t xml:space="preserve">co2_now</w:t>
-      </w:r>
-      <w:r>
-        <w:t xml:space="preserve">,</w:t>
-      </w:r>
-      <w:r>
-        <w:t xml:space="preserve"> </w:t>
-      </w:r>
-      <w:r>
-        <w:rPr>
-          <w:rStyle w:val="VerbatimChar"/>
-        </w:rPr>
-        <w:t xml:space="preserve">co2_lag1</w:t>
-      </w:r>
-      <w:r>
-        <w:t xml:space="preserve">, the 1-hour rolling mean, or the 15-minute-ahead target value is absent is</w:t>
+        <w:t xml:space="preserve">The dominant data loss is a 636-day gap in genuine readings (11 December 2023 to 7 September 2025); for about eight months of it the sensor re-sent one stale packet every 11 minutes (Section 6). Genuine readings run from 7 September 2025 to 22 April 2026. Any row with a missing input or target is</w:t>
       </w:r>
       <w:r>
         <w:t xml:space="preserve"> </w:t>
@@ -1874,30 +1828,73 @@
           <w:bCs/>
           <w:b/>
         </w:rPr>
-        <w:t xml:space="preserve">dropped entirely</w:t>
-      </w:r>
-      <w:r>
-        <w:t xml:space="preserve">. No value is fabricated to fill a gap.</w:t>
-      </w:r>
-    </w:p>
-    <w:p>
-      <w:pPr>
-        <w:numPr>
-          <w:ilvl w:val="0"/>
-          <w:numId w:val="1001"/>
-        </w:numPr>
-        <w:pStyle w:val="Compact"/>
-      </w:pPr>
-      <w:r>
-        <w:t xml:space="preserve">Imputing values across a 636-day outage would introduce hundreds of thousands of invented readings with no physical basis. Dropping rows is the correct approach despite the loss in dataset size.</w:t>
-      </w:r>
-    </w:p>
-    <w:p>
-      <w:pPr>
-        <w:pStyle w:val="FirstParagraph"/>
-      </w:pPr>
-      <w:r>
-        <w:t xml:space="preserve">Of 84,576 candidate 15-minute timestamps in the raw log, 17,010 (20.1%) have all nine inputs and the target present and are retained for modelling. The remaining 67,566 rows (79.9%) are dropped (data-pipeline figure in Appendix A).</w:t>
+        <w:t xml:space="preserve">dropped</w:t>
+      </w:r>
+      <w:r>
+        <w:t xml:space="preserve">, never filled: imputing across a 636-day gap would invent hundreds of thousands of readings.</w:t>
+      </w:r>
+    </w:p>
+    <w:p>
+      <w:pPr>
+        <w:pStyle w:val="BodyText"/>
+      </w:pPr>
+      <w:r>
+        <w:t xml:space="preserve">Of 84,576 candidate 15-minute timestamps in the raw log, 17,010 (20.1%) have all nine inputs and the target present and are retained for modelling. The remaining 67,566 rows (79.9%) are dropped.</w:t>
+      </w:r>
+    </w:p>
+    <w:p>
+      <w:pPr>
+        <w:pStyle w:val="CaptionedFigure"/>
+      </w:pPr>
+      <w:r>
+        <w:drawing>
+          <wp:inline>
+            <wp:extent cx="3291840" cy="1611195"/>
+            <wp:effectExtent b="0" l="0" r="0" t="0"/>
+            <wp:docPr descr="Data pipeline: raw candidate timestamps versus dropped rows versus rows retained for modelling" title="" id="27" name="Picture"/>
+            <a:graphic>
+              <a:graphicData uri="http://schemas.openxmlformats.org/drawingml/2006/picture">
+                <pic:pic>
+                  <pic:nvPicPr>
+                    <pic:cNvPr descr="chart_data_pipeline.png" id="28" name="Picture"/>
+                    <pic:cNvPicPr>
+                      <a:picLocks noChangeArrowheads="1" noChangeAspect="1"/>
+                    </pic:cNvPicPr>
+                  </pic:nvPicPr>
+                  <pic:blipFill>
+                    <a:blip r:embed="rId26"/>
+                    <a:stretch>
+                      <a:fillRect/>
+                    </a:stretch>
+                  </pic:blipFill>
+                  <pic:spPr bwMode="auto">
+                    <a:xfrm>
+                      <a:off x="0" y="0"/>
+                      <a:ext cx="3291840" cy="1611195"/>
+                    </a:xfrm>
+                    <a:prstGeom prst="rect">
+                      <a:avLst/>
+                    </a:prstGeom>
+                    <a:noFill/>
+                    <a:ln w="9525">
+                      <a:noFill/>
+                      <a:headEnd/>
+                      <a:tailEnd/>
+                    </a:ln>
+                  </pic:spPr>
+                </pic:pic>
+              </a:graphicData>
+            </a:graphic>
+          </wp:inline>
+        </w:drawing>
+      </w:r>
+    </w:p>
+    <w:p>
+      <w:pPr>
+        <w:pStyle w:val="ImageCaption"/>
+      </w:pPr>
+      <w:r>
+        <w:t xml:space="preserve">Data pipeline: raw candidate timestamps versus dropped rows versus rows retained for modelling</w:t>
       </w:r>
     </w:p>
     <w:p>
@@ -1973,11 +1970,11 @@
         <w:t xml:space="preserve"> </w:t>
       </w:r>
       <w:r>
-        <w:t xml:space="preserve">there are 649 such intervals covering 4,978 hours. Section 4.1 applies the same rule to every sensor.</w:t>
-      </w:r>
-    </w:p>
-    <w:bookmarkEnd w:id="26"/>
-    <w:bookmarkStart w:id="27" w:name="output"/>
+        <w:t xml:space="preserve">there are 649 such intervals covering 4,978 hours. Section 4.2 applies the same rule to every sensor.</w:t>
+      </w:r>
+    </w:p>
+    <w:bookmarkEnd w:id="29"/>
+    <w:bookmarkStart w:id="30" w:name="output"/>
     <w:p>
       <w:pPr>
         <w:pStyle w:val="Heading3"/>
@@ -1994,9 +1991,9 @@
         <w:jc w:val="start"/>
       </w:tblPr>
       <w:tblGrid>
-        <w:gridCol w:w="2640"/>
-        <w:gridCol w:w="2640"/>
-        <w:gridCol w:w="2640"/>
+        <w:gridCol w:w="1188"/>
+        <w:gridCol w:w="792"/>
+        <w:gridCol w:w="5940"/>
       </w:tblGrid>
       <w:tr>
         <w:trPr>
@@ -2083,7 +2080,7 @@
         <w:pStyle w:val="BodyText"/>
       </w:pPr>
       <w:r>
-        <w:t xml:space="preserve">The output is a single continuous value. It represents the model’s best estimate of what the sensor will read at the next 15-minute interval. The model does not apply a threshold or issue a ventilation command — that decision logic belongs to the building management system consuming the forecast. A practical deployment rule might set an early-warning trigger at 750 ppm — 50 ppm below 800 ppm, a common stricter indoor-air-quality target than the 1000 ppm guideline in Section 1.1. The 50 ppm margin is about six times the MAE and twice the RMSE (Section 4), and matters most at high CO₂, where the models under-predict (Appendix A).</w:t>
+        <w:t xml:space="preserve">The model only forecasts; thresholds and ventilation commands belong to the building management system. A practical deployment rule might set an early-warning trigger at 750 ppm — 50 ppm below 800 ppm, a common stricter indoor-air-quality target than the 1000 ppm guideline in Section 1.1. The 50 ppm margin is about six times the MAE and twice the RMSE (Section 4), and matters most at high CO₂, where the models under-predict (Section 4.1).</w:t>
       </w:r>
     </w:p>
     <w:p>
@@ -2093,9 +2090,9 @@
         </w:pict>
       </w:r>
     </w:p>
-    <w:bookmarkEnd w:id="27"/>
-    <w:bookmarkEnd w:id="28"/>
-    <w:bookmarkStart w:id="32" w:name="computational-solution"/>
+    <w:bookmarkEnd w:id="30"/>
+    <w:bookmarkEnd w:id="31"/>
+    <w:bookmarkStart w:id="35" w:name="computational-solution"/>
     <w:p>
       <w:pPr>
         <w:pStyle w:val="Heading2"/>
@@ -2104,7 +2101,7 @@
         <w:t xml:space="preserve">3. Computational Solution</w:t>
       </w:r>
     </w:p>
-    <w:bookmarkStart w:id="29" w:name="implementation"/>
+    <w:bookmarkStart w:id="32" w:name="implementation"/>
     <w:p>
       <w:pPr>
         <w:pStyle w:val="Heading3"/>
@@ -2118,7 +2115,7 @@
         <w:pStyle w:val="FirstParagraph"/>
       </w:pPr>
       <w:r>
-        <w:t xml:space="preserve">All four models are implemented as scikit-learn</w:t>
+        <w:t xml:space="preserve">All four models are scikit-learn</w:t>
       </w:r>
       <w:r>
         <w:t xml:space="preserve"> </w:t>
@@ -2133,7 +2130,7 @@
         <w:t xml:space="preserve"> </w:t>
       </w:r>
       <w:r>
-        <w:t xml:space="preserve">objects. Each pipeline applies a</w:t>
+        <w:t xml:space="preserve">objects with a</w:t>
       </w:r>
       <w:r>
         <w:t xml:space="preserve"> </w:t>
@@ -2148,11 +2145,11 @@
         <w:t xml:space="preserve"> </w:t>
       </w:r>
       <w:r>
-        <w:t xml:space="preserve">preprocessing step before the regression estimator. Standardisation transforms each feature to zero mean and unit variance. This is strictly necessary for SVR and the neural network, both of which are sensitive to feature scale: the RBF kernel computes Euclidean distances in feature space, and unscaled features with large dynamic ranges (CO₂ in ppm versus a binary weekend flag) would distort those distances. Applying the same preprocessing to all four models ensures that any differences in performance are attributable to the model, not to data scale effects.</w:t>
-      </w:r>
-    </w:p>
-    <w:bookmarkEnd w:id="29"/>
-    <w:bookmarkStart w:id="30" w:name="how-each-method-works"/>
+        <w:t xml:space="preserve">step (zero mean, unit variance per feature) before the estimator. Scaling is essential for SVR and the neural network: the RBF kernel uses Euclidean distances, which unscaled features (CO₂ in ppm beside a 0/1 weekend flag) would distort. Using the same preprocessing for all four keeps the comparison fair.</w:t>
+      </w:r>
+    </w:p>
+    <w:bookmarkEnd w:id="32"/>
+    <w:bookmarkStart w:id="33" w:name="how-each-method-works"/>
     <w:p>
       <w:pPr>
         <w:pStyle w:val="Heading3"/>
@@ -2301,19 +2298,7 @@
         <w:pStyle w:val="FirstParagraph"/>
       </w:pPr>
       <w:r>
-        <w:t xml:space="preserve">It assumes the contribution of each feature to the forecast is linear and additive. This is a reasonable first assumption for CO₂ trends over short windows, but it cannot represent interactions between features (e.g. </w:t>
-      </w:r>
-      <w:r>
-        <w:t xml:space="preserve">“</w:t>
-      </w:r>
-      <w:r>
-        <w:t xml:space="preserve">high CO₂ on a busy Monday morning predicts a steeper rise than high CO₂ on a quiet Sunday</w:t>
-      </w:r>
-      <w:r>
-        <w:t xml:space="preserve">”</w:t>
-      </w:r>
-      <w:r>
-        <w:t xml:space="preserve">) without explicit interaction terms. It serves as the interpretable baseline: every other method must improve on it to justify its additional complexity.</w:t>
+        <w:t xml:space="preserve">It assumes each feature contributes linearly and additively, so it cannot capture interactions (e.g. high CO₂ on a weekday morning rising faster than on a Sunday). It is the interpretable baseline the other methods must beat.</w:t>
       </w:r>
     </w:p>
     <w:p>
@@ -2331,7 +2316,7 @@
         <w:t xml:space="preserve"> </w:t>
       </w:r>
       <w:r>
-        <w:t xml:space="preserve">partitions the feature space into rectangular regions using a series of binary splits, each chosen to minimise the variance of the target in the resulting subsets. Each leaf of the tree predicts the mean CO₂ of the training points that fall into it. The tree can capture non-linear patterns and feature interactions without any feature engineering. Its main weakness is a tendency to overfit — a deep tree memorises the training data rather than learning a generalisable pattern. Maximum depth was set to 8 to reduce this risk.</w:t>
+        <w:t xml:space="preserve">splits the feature space into rectangular regions with binary splits that minimise target variance; each leaf predicts the mean CO₂ of its training points. It captures non-linearity and interactions but tends to overfit, so maximum depth was limited to 8.</w:t>
       </w:r>
     </w:p>
     <w:p>
@@ -2349,7 +2334,7 @@
         <w:t xml:space="preserve"> </w:t>
       </w:r>
       <w:r>
-        <w:t xml:space="preserve">fits a smooth function by finding a hyperplane (in a high-dimensional space implicitly defined by the kernel) that keeps the residuals of most training points within an ε-wide tube, while penalising points that fall outside it. The RBF kernel</w:t>
+        <w:t xml:space="preserve">fits a smooth function that keeps most residuals inside an ε-wide tube and penalises points outside it, working in a high-dimensional space defined implicitly by the RBF kernel</w:t>
       </w:r>
     </w:p>
     <w:p>
@@ -2509,7 +2494,7 @@
         <w:pStyle w:val="FirstParagraph"/>
       </w:pPr>
       <w:r>
-        <w:t xml:space="preserve">maps data into a space where smooth non-linear relationships can be represented. SVR’s solution is a convex optimisation problem with no local minima, which makes it more stable than the neural network in training. Parameters used:</w:t>
+        <w:t xml:space="preserve">Training is a convex optimisation with no local minima, so it is more stable than the neural network.</w:t>
       </w:r>
       <w:r>
         <w:t xml:space="preserve"> </w:t>
@@ -2532,7 +2517,7 @@
         <w:t xml:space="preserve"> </w:t>
       </w:r>
       <w:r>
-        <w:t xml:space="preserve">(penalty for violating the tube),</w:t>
+        <w:t xml:space="preserve">sets the penalty for leaving the tube;</w:t>
       </w:r>
       <w:r>
         <w:t xml:space="preserve"> </w:t>
@@ -2555,7 +2540,7 @@
         <w:t xml:space="preserve"> </w:t>
       </w:r>
       <w:r>
-        <w:t xml:space="preserve">(tube half-width in ppm).</w:t>
+        <w:t xml:space="preserve">ppm is the tube half-width.</w:t>
       </w:r>
     </w:p>
     <w:p>
@@ -2573,11 +2558,11 @@
         <w:t xml:space="preserve"> </w:t>
       </w:r>
       <w:r>
-        <w:t xml:space="preserve">uses a multilayer perceptron with two hidden layers (32 units, then 16 units, both with ReLU activations) followed by a linear output. ReLU introduces piecewise-linear non-linearity at each layer, allowing the network to approximate arbitrary continuous functions. Training uses the Adam optimiser with early stopping (patience = 10 validation epochs) to halt before the model overfits the training period. Of the four methods, this is the most expressive but also the least interpretable and the most sensitive to the amount of training data.</w:t>
-      </w:r>
-    </w:p>
-    <w:bookmarkEnd w:id="30"/>
-    <w:bookmarkStart w:id="31" w:name="parameters"/>
+        <w:t xml:space="preserve">is a multilayer perceptron with two ReLU hidden layers (32 then 16 units) and a linear output, trained with Adam and early stopping (patience of 10 epochs). It is the most expressive method, but the least interpretable and the most data-hungry.</w:t>
+      </w:r>
+    </w:p>
+    <w:bookmarkEnd w:id="33"/>
+    <w:bookmarkStart w:id="34" w:name="parameters"/>
     <w:p>
       <w:pPr>
         <w:pStyle w:val="Heading3"/>
@@ -2594,9 +2579,9 @@
         <w:jc w:val="start"/>
       </w:tblPr>
       <w:tblGrid>
-        <w:gridCol w:w="2640"/>
-        <w:gridCol w:w="2640"/>
-        <w:gridCol w:w="2640"/>
+        <w:gridCol w:w="1782"/>
+        <w:gridCol w:w="1386"/>
+        <w:gridCol w:w="4752"/>
       </w:tblGrid>
       <w:tr>
         <w:trPr>
@@ -3043,9 +3028,9 @@
         </w:pict>
       </w:r>
     </w:p>
-    <w:bookmarkEnd w:id="31"/>
-    <w:bookmarkEnd w:id="32"/>
-    <w:bookmarkStart w:id="40" w:name="alternative-solutions-and-comparison"/>
+    <w:bookmarkEnd w:id="34"/>
+    <w:bookmarkEnd w:id="35"/>
+    <w:bookmarkStart w:id="53" w:name="alternative-solutions-and-comparison"/>
     <w:p>
       <w:pPr>
         <w:pStyle w:val="Heading2"/>
@@ -3059,7 +3044,7 @@
         <w:pStyle w:val="FirstParagraph"/>
       </w:pPr>
       <w:r>
-        <w:t xml:space="preserve">The four methods were evaluated on the held-out test set (3,402 rows, the final 20% of the dataset in time order). Results are shown below.</w:t>
+        <w:t xml:space="preserve">The four methods were evaluated on the held-out test set (3,402 rows, the final 20% in time order).</w:t>
       </w:r>
     </w:p>
     <w:tbl>
@@ -3543,15 +3528,7 @@
         <w:t xml:space="preserve"> </w:t>
       </w:r>
       <w:r>
-        <w:t xml:space="preserve">achieved the lowest mean absolute error (8.35 ppm) and is the best-performing model. Linear Regression achieved the highest R² (0.358) and is only marginally behind SVR in MAE, making it the recommended choice where model interpretability or fast prediction speed is a requirement. Decision Tree was the weakest model, with an R² of 0.191; it likely overfit the training period, as evidenced by its large RMSE relative to its MAE.</w:t>
-      </w:r>
-    </w:p>
-    <w:p>
-      <w:pPr>
-        <w:pStyle w:val="BodyText"/>
-      </w:pPr>
-      <w:r>
-        <w:t xml:space="preserve">SVR’s per-batch prediction time of approximately 2.85 seconds is substantially longer than the other methods, but this is not a practical constraint for a 15-minute scheduling task.</w:t>
+        <w:t xml:space="preserve">has the lowest MAE (8.35 ppm). Linear Regression has the highest R² (0.358), is close in MAE, and is the better choice where interpretability or speed matters. The Decision Tree is weakest (R² 0.191), likely overfitting, as its large RMSE relative to MAE suggests. SVR’s prediction time (about 2.85 s per batch) is no constraint for a 15-minute task.</w:t>
       </w:r>
     </w:p>
     <w:p>
@@ -3838,7 +3815,7 @@
         <w:pStyle w:val="BodyText"/>
       </w:pPr>
       <w:r>
-        <w:t xml:space="preserve">Adding building occupancy as a feature provides no measurable improvement for any model. For the Decision Tree it is actively detrimental: the model wasted splits on an irrelevant feature, and its R² fell from 0.331 to 0.191. The reason is not that occupancy is irrelevant to CO₂ in principle — the mass-balance equation establishes that it is not — but that there is no evidence linking this sensor to any of the five monitored occupancy zones (Section 6). The building-level occupancy count carries no information about what is happening in this particular room.</w:t>
+        <w:t xml:space="preserve">Occupancy gives no measurable improvement for any model, and the Decision Tree gets worse (R² 0.331 to 0.191) by wasting splits on it. Occupancy matters in principle (the mass balance), but nothing links this sensor to any of the five monitored zones (Section 6), so the building-wide count says nothing about this room.</w:t>
       </w:r>
     </w:p>
     <w:p>
@@ -3846,7 +3823,7 @@
         <w:pStyle w:val="BodyText"/>
       </w:pPr>
       <w:r>
-        <w:t xml:space="preserve">The sensor’s own daily pattern points the same way (</w:t>
+        <w:t xml:space="preserve">The daily pattern agrees (</w:t>
       </w:r>
       <w:r>
         <w:rPr>
@@ -3867,7 +3844,7 @@
         <w:t xml:space="preserve">6012002000869</w:t>
       </w:r>
       <w:r>
-        <w:t xml:space="preserve">), weekday CO₂ peaks at 13:00, and during working hours (9 am–5 pm) it averages 505 ppm on weekdays against 450 ppm at weekends — the signature of an occupied room. Sensor</w:t>
+        <w:t xml:space="preserve">), weekday CO₂ peaks at 13:00 and averages 505 ppm in working hours (9 am–5 pm) against 450 ppm at weekends — an occupied room. Sensor</w:t>
       </w:r>
       <w:r>
         <w:t xml:space="preserve"> </w:t>
@@ -3882,7 +3859,79 @@
         <w:t xml:space="preserve"> </w:t>
       </w:r>
       <w:r>
-        <w:t xml:space="preserve">shows neither: its weekday CO₂ peaks at 07:00 and is lowest at 15:00, and weekday and weekend working-hours means are identical (436 ppm). This sensor’s CO₂ follows the building’s ventilation schedule rather than its occupants, which is why neither occupancy nor the weekend flag helps.</w:t>
+        <w:t xml:space="preserve">peaks at 07:00, is lowest at 15:00, and has identical weekday and weekend working-hours means (436 ppm): it follows the ventilation schedule, not occupants, so neither occupancy nor the weekend flag helps.</w:t>
+      </w:r>
+    </w:p>
+    <w:bookmarkStart w:id="45" w:name="diagnostic-plots"/>
+    <w:p>
+      <w:pPr>
+        <w:pStyle w:val="Heading3"/>
+      </w:pPr>
+      <w:r>
+        <w:t xml:space="preserve">4.1 Diagnostic plots</w:t>
+      </w:r>
+    </w:p>
+    <w:p>
+      <w:pPr>
+        <w:pStyle w:val="FirstParagraph"/>
+      </w:pPr>
+      <w:r>
+        <w:t xml:space="preserve">The comparison table above is aggregate; the plots below show what it looks like row by row.</w:t>
+      </w:r>
+    </w:p>
+    <w:p>
+      <w:pPr>
+        <w:pStyle w:val="CaptionedFigure"/>
+      </w:pPr>
+      <w:r>
+        <w:drawing>
+          <wp:inline>
+            <wp:extent cx="3931919" cy="2948940"/>
+            <wp:effectExtent b="0" l="0" r="0" t="0"/>
+            <wp:docPr descr="Ground truth CO2 vs. all four models’ predictions — full test set (daily mean) and a representative 5-day detail window at native 15-minute resolution" title="" id="37" name="Picture"/>
+            <a:graphic>
+              <a:graphicData uri="http://schemas.openxmlformats.org/drawingml/2006/picture">
+                <pic:pic>
+                  <pic:nvPicPr>
+                    <pic:cNvPr descr="chart11_predictions_timeseries.png" id="38" name="Picture"/>
+                    <pic:cNvPicPr>
+                      <a:picLocks noChangeArrowheads="1" noChangeAspect="1"/>
+                    </pic:cNvPicPr>
+                  </pic:nvPicPr>
+                  <pic:blipFill>
+                    <a:blip r:embed="rId36"/>
+                    <a:stretch>
+                      <a:fillRect/>
+                    </a:stretch>
+                  </pic:blipFill>
+                  <pic:spPr bwMode="auto">
+                    <a:xfrm>
+                      <a:off x="0" y="0"/>
+                      <a:ext cx="3931919" cy="2948940"/>
+                    </a:xfrm>
+                    <a:prstGeom prst="rect">
+                      <a:avLst/>
+                    </a:prstGeom>
+                    <a:noFill/>
+                    <a:ln w="9525">
+                      <a:noFill/>
+                      <a:headEnd/>
+                      <a:tailEnd/>
+                    </a:ln>
+                  </pic:spPr>
+                </pic:pic>
+              </a:graphicData>
+            </a:graphic>
+          </wp:inline>
+        </w:drawing>
+      </w:r>
+    </w:p>
+    <w:p>
+      <w:pPr>
+        <w:pStyle w:val="ImageCaption"/>
+      </w:pPr>
+      <w:r>
+        <w:t xml:space="preserve">Ground truth CO2 vs. all four models’ predictions — full test set (daily mean) and a representative 5-day detail window at native 15-minute resolution</w:t>
       </w:r>
     </w:p>
     <w:p>
@@ -3890,16 +3939,135 @@
         <w:pStyle w:val="BodyText"/>
       </w:pPr>
       <w:r>
-        <w:t xml:space="preserve">Row-by-row diagnostic plots (predictions over time, predicted vs. actual, and residuals) are in Appendix A.</w:t>
-      </w:r>
-    </w:p>
-    <w:bookmarkStart w:id="39" w:name="Xf965eae6f400442b87f8df1b02fb52bece3b127"/>
+        <w:t xml:space="preserve">All four track the everyday CO2 trend closely; they diverge at the sharp spikes in the detail panel (14-19 March), where every model lags or flattens the peak — the Decision Tree even overshoots into a spike the sensor never reached (15 March), a symptom of its piecewise-constant leaves extrapolating from a small high-CO2 training leaf.</w:t>
+      </w:r>
+    </w:p>
+    <w:p>
+      <w:pPr>
+        <w:pStyle w:val="CaptionedFigure"/>
+      </w:pPr>
+      <w:r>
+        <w:drawing>
+          <wp:inline>
+            <wp:extent cx="5760720" cy="1656207"/>
+            <wp:effectExtent b="0" l="0" r="0" t="0"/>
+            <wp:docPr descr="Predicted vs. actual CO2 for each model on the held-out test set, with a y=x reference line" title="" id="40" name="Picture"/>
+            <a:graphic>
+              <a:graphicData uri="http://schemas.openxmlformats.org/drawingml/2006/picture">
+                <pic:pic>
+                  <pic:nvPicPr>
+                    <pic:cNvPr descr="chart12_predicted_vs_actual.png" id="41" name="Picture"/>
+                    <pic:cNvPicPr>
+                      <a:picLocks noChangeArrowheads="1" noChangeAspect="1"/>
+                    </pic:cNvPicPr>
+                  </pic:nvPicPr>
+                  <pic:blipFill>
+                    <a:blip r:embed="rId39"/>
+                    <a:stretch>
+                      <a:fillRect/>
+                    </a:stretch>
+                  </pic:blipFill>
+                  <pic:spPr bwMode="auto">
+                    <a:xfrm>
+                      <a:off x="0" y="0"/>
+                      <a:ext cx="5760720" cy="1656207"/>
+                    </a:xfrm>
+                    <a:prstGeom prst="rect">
+                      <a:avLst/>
+                    </a:prstGeom>
+                    <a:noFill/>
+                    <a:ln w="9525">
+                      <a:noFill/>
+                      <a:headEnd/>
+                      <a:tailEnd/>
+                    </a:ln>
+                  </pic:spPr>
+                </pic:pic>
+              </a:graphicData>
+            </a:graphic>
+          </wp:inline>
+        </w:drawing>
+      </w:r>
+    </w:p>
+    <w:p>
+      <w:pPr>
+        <w:pStyle w:val="ImageCaption"/>
+      </w:pPr>
+      <w:r>
+        <w:t xml:space="preserve">Predicted vs. actual CO2 for each model on the held-out test set, with a y=x reference line</w:t>
+      </w:r>
+    </w:p>
+    <w:p>
+      <w:pPr>
+        <w:pStyle w:val="CaptionedFigure"/>
+      </w:pPr>
+      <w:r>
+        <w:drawing>
+          <wp:inline>
+            <wp:extent cx="5760720" cy="1512189"/>
+            <wp:effectExtent b="0" l="0" r="0" t="0"/>
+            <wp:docPr descr="Residual (predicted minus actual) vs. predicted CO2 for each model" title="" id="43" name="Picture"/>
+            <a:graphic>
+              <a:graphicData uri="http://schemas.openxmlformats.org/drawingml/2006/picture">
+                <pic:pic>
+                  <pic:nvPicPr>
+                    <pic:cNvPr descr="chart13_residuals.png" id="44" name="Picture"/>
+                    <pic:cNvPicPr>
+                      <a:picLocks noChangeArrowheads="1" noChangeAspect="1"/>
+                    </pic:cNvPicPr>
+                  </pic:nvPicPr>
+                  <pic:blipFill>
+                    <a:blip r:embed="rId42"/>
+                    <a:stretch>
+                      <a:fillRect/>
+                    </a:stretch>
+                  </pic:blipFill>
+                  <pic:spPr bwMode="auto">
+                    <a:xfrm>
+                      <a:off x="0" y="0"/>
+                      <a:ext cx="5760720" cy="1512189"/>
+                    </a:xfrm>
+                    <a:prstGeom prst="rect">
+                      <a:avLst/>
+                    </a:prstGeom>
+                    <a:noFill/>
+                    <a:ln w="9525">
+                      <a:noFill/>
+                      <a:headEnd/>
+                      <a:tailEnd/>
+                    </a:ln>
+                  </pic:spPr>
+                </pic:pic>
+              </a:graphicData>
+            </a:graphic>
+          </wp:inline>
+        </w:drawing>
+      </w:r>
+    </w:p>
+    <w:p>
+      <w:pPr>
+        <w:pStyle w:val="ImageCaption"/>
+      </w:pPr>
+      <w:r>
+        <w:t xml:space="preserve">Residual (predicted minus actual) vs. predicted CO2 for each model</w:t>
+      </w:r>
+    </w:p>
+    <w:p>
+      <w:pPr>
+        <w:pStyle w:val="BodyText"/>
+      </w:pPr>
+      <w:r>
+        <w:t xml:space="preserve">Predicted-vs-actual makes the R² numbers concrete: all four point clouds hug y=x below 550 ppm, then fall well short of it as actual CO2 rises past 600 ppm. The residual plots show the same effect directionally: residuals sit near zero typically but turn increasingly negative as predicted CO2 rises, rather than scattering symmetrically — a model under-responding to its most extreme inputs, consistent with the training data being dominated by the 400-550 ppm range (Section 2.3).</w:t>
+      </w:r>
+    </w:p>
+    <w:bookmarkEnd w:id="45"/>
+    <w:bookmarkStart w:id="52" w:name="Xf965eae6f400442b87f8df1b02fb52bece3b127"/>
     <w:p>
       <w:pPr>
         <w:pStyle w:val="Heading3"/>
       </w:pPr>
       <w:r>
-        <w:t xml:space="preserve">4.1 Using every usable interval from all sensors</w:t>
+        <w:t xml:space="preserve">4.2 Using every usable interval from all sensors</w:t>
       </w:r>
     </w:p>
     <w:p>
@@ -3907,10 +4075,7 @@
         <w:pStyle w:val="FirstParagraph"/>
       </w:pPr>
       <w:r>
-        <w:t xml:space="preserve">The analysis above uses one sensor. Rather than accepting or rejecting each sensor as a whole, the same unbroken-interval rule from Section 2.3 was applied to all five environmental sensors: every interval of at least 75 minutes, from any sensor, is usable. The audit also compared each reading’s own timestamp with the log’s</w:t>
-      </w:r>
-      <w:r>
-        <w:t xml:space="preserve"> </w:t>
+        <w:t xml:space="preserve">Rather than accepting or rejecting whole sensors, the unbroken-interval rule (Section 2.3) was applied to all five: any interval of at least 75 minutes is usable. Comparing each reading’s timestamp with the server receive time (</w:t>
       </w:r>
       <w:r>
         <w:rPr>
@@ -3919,10 +4084,7 @@
         <w:t xml:space="preserve">createdate</w:t>
       </w:r>
       <w:r>
-        <w:t xml:space="preserve"> </w:t>
-      </w:r>
-      <w:r>
-        <w:t xml:space="preserve">field (the time the server received it). This showed that a sensor which stops measuring keeps re-transmitting its last packet roughly every 11 minutes, so the log fills with thousands of identical rows.</w:t>
+        <w:t xml:space="preserve">) showed that a sensor which stops measuring keeps re-sending its last packet about every 11 minutes.</w:t>
       </w:r>
     </w:p>
     <w:tbl>
@@ -4470,18 +4632,18 @@
           <wp:inline>
             <wp:extent cx="4754880" cy="1536192"/>
             <wp:effectExtent b="0" l="0" r="0" t="0"/>
-            <wp:docPr descr="Usable unbroken intervals (green) and re-transmitted stale packets (grey) for each sensor" title="" id="34" name="Picture"/>
+            <wp:docPr descr="Usable unbroken intervals (green) and re-transmitted stale packets (grey) for each sensor" title="" id="47" name="Picture"/>
             <a:graphic>
               <a:graphicData uri="http://schemas.openxmlformats.org/drawingml/2006/picture">
                 <pic:pic>
                   <pic:nvPicPr>
-                    <pic:cNvPr descr="chart15_sensor_intervals.png" id="35" name="Picture"/>
+                    <pic:cNvPr descr="chart15_sensor_intervals.png" id="48" name="Picture"/>
                     <pic:cNvPicPr>
                       <a:picLocks noChangeArrowheads="1" noChangeAspect="1"/>
                     </pic:cNvPicPr>
                   </pic:nvPicPr>
                   <pic:blipFill>
-                    <a:blip r:embed="rId33"/>
+                    <a:blip r:embed="rId46"/>
                     <a:stretch>
                       <a:fillRect/>
                     </a:stretch>
@@ -4521,7 +4683,7 @@
         <w:pStyle w:val="BodyText"/>
       </w:pPr>
       <w:r>
-        <w:t xml:space="preserve">Three sensors never produced more than two distinct readings, so even a 75-minute interval cannot be formed from them. Sensor</w:t>
+        <w:t xml:space="preserve">Three sensors never produce more than two distinct readings, so no interval can be formed. Sensor</w:t>
       </w:r>
       <w:r>
         <w:t xml:space="preserve"> </w:t>
@@ -4536,19 +4698,7 @@
         <w:t xml:space="preserve"> </w:t>
       </w:r>
       <w:r>
-        <w:t xml:space="preserve">(the only sensor with a documented room, G.38) has genuine readings from 29 February to 13 June 2024, with almost no gaps, giving 7,781 additional rows. Two experiments use this extra data. Both exclude occupancy (it adds nothing for sensor</w:t>
-      </w:r>
-      <w:r>
-        <w:t xml:space="preserve"> </w:t>
-      </w:r>
-      <w:r>
-        <w:rPr>
-          <w:rStyle w:val="VerbatimChar"/>
-        </w:rPr>
-        <w:t xml:space="preserve">6012002000326</w:t>
-      </w:r>
-      <w:r>
-        <w:t xml:space="preserve">, Section 4) so that row sets are identical across runs. A naive</w:t>
+        <w:t xml:space="preserve">(room G.38, the only documented sensor) has genuine readings from 29 February to 13 June 2024, giving 7,781 more rows. Both experiments below exclude occupancy (it adds nothing, Section 4) and include a naive</w:t>
       </w:r>
       <w:r>
         <w:t xml:space="preserve"> </w:t>
@@ -4564,7 +4714,7 @@
         <w:t xml:space="preserve"> </w:t>
       </w:r>
       <w:r>
-        <w:t xml:space="preserve">forecast (next CO₂ = current CO₂) is included as a reference floor that any useful model must beat.</w:t>
+        <w:t xml:space="preserve">forecast (next CO₂ = current CO₂) as the floor a useful model must beat.</w:t>
       </w:r>
     </w:p>
     <w:p>
@@ -4594,7 +4744,7 @@
         <w:t xml:space="preserve">6012002000326</w:t>
       </w:r>
       <w:r>
-        <w:t xml:space="preserve">’s training period plus all of sensor</w:t>
+        <w:t xml:space="preserve">’s training period plus all of</w:t>
       </w:r>
       <w:r>
         <w:t xml:space="preserve"> </w:t>
@@ -4606,7 +4756,10 @@
         <w:t xml:space="preserve">6012002000869</w:t>
       </w:r>
       <w:r>
-        <w:t xml:space="preserve">’s intervals (all from 2024, so strictly before the 11 March 2026 cutoff), and test on the unchanged</w:t>
+        <w:t xml:space="preserve"> </w:t>
+      </w:r>
+      <w:r>
+        <w:t xml:space="preserve">(2024, before the cutoff); test on the unchanged</w:t>
       </w:r>
       <w:r>
         <w:t xml:space="preserve"> </w:t>
@@ -5027,22 +5180,7 @@
         <w:pStyle w:val="BodyText"/>
       </w:pPr>
       <w:r>
-        <w:t xml:space="preserve">Pooling increased the training set by 56% (13,853 to 21,634 rows). The best result improved slightly (SVR MAE 8.30 to 8.14 ppm) and the Decision Tree improved most, consistent with it being the most data-hungry model. However, none of these changes is statistically distinguishable from zero: 95% moving-block bootstrap intervals (one-day blocks, to respect autocorrelation) on the paired MAE difference all span zero, e.g. SVR +0.16 ppm [−0.07, +0.44]. More data from a different room therefore does not materially help this sensor. All four models beat persistence (9.82 ppm), confirming they learn more than</w:t>
-      </w:r>
-      <w:r>
-        <w:t xml:space="preserve"> </w:t>
-      </w:r>
-      <w:r>
-        <w:t xml:space="preserve">“</w:t>
-      </w:r>
-      <w:r>
-        <w:t xml:space="preserve">CO₂ stays the same</w:t>
-      </w:r>
-      <w:r>
-        <w:t xml:space="preserve">”</w:t>
-      </w:r>
-      <w:r>
-        <w:t xml:space="preserve">.</w:t>
+        <w:t xml:space="preserve">Pooling adds 56% more training data (13,853 to 21,634 rows). SVR improves slightly (MAE 8.30 to 8.14 ppm) and the data-hungry Decision Tree most, but no change is statistically significant: 95% moving-block bootstrap intervals (one-day blocks) on the paired MAE difference all span zero, e.g. SVR +0.16 ppm [−0.07, +0.44]. All models beat persistence (9.82 ppm).</w:t>
       </w:r>
     </w:p>
     <w:p>
@@ -5060,7 +5198,7 @@
         <w:t xml:space="preserve"> </w:t>
       </w:r>
       <w:r>
-        <w:t xml:space="preserve">Train on sensor</w:t>
+        <w:t xml:space="preserve">Train on</w:t>
       </w:r>
       <w:r>
         <w:t xml:space="preserve"> </w:t>
@@ -5075,7 +5213,7 @@
         <w:t xml:space="preserve"> </w:t>
       </w:r>
       <w:r>
-        <w:t xml:space="preserve">only and test on the final 20% of sensor</w:t>
+        <w:t xml:space="preserve">only and test on the final 20% of</w:t>
       </w:r>
       <w:r>
         <w:t xml:space="preserve"> </w:t>
@@ -5087,7 +5225,7 @@
         <w:t xml:space="preserve">6012002000869</w:t>
       </w:r>
       <w:r>
-        <w:t xml:space="preserve">’s record, compared with a model trained on</w:t>
+        <w:t xml:space="preserve">, against a model trained on</w:t>
       </w:r>
       <w:r>
         <w:t xml:space="preserve"> </w:t>
@@ -5099,261 +5237,9 @@
         <w:t xml:space="preserve">6012002000869</w:t>
       </w:r>
       <w:r>
-        <w:t xml:space="preserve">’s own earlier data.</w:t>
-      </w:r>
-    </w:p>
-    <w:tbl>
-      <w:tblPr>
-        <w:tblStyle w:val="Table"/>
-        <w:tblW w:type="pct" w:w="5000"/>
-        <w:tblLook w:firstRow="1" w:lastRow="0" w:firstColumn="0" w:lastColumn="0" w:noHBand="0" w:noVBand="0" w:val="0020"/>
-        <w:jc w:val="start"/>
-      </w:tblPr>
-      <w:tblGrid>
-        <w:gridCol w:w="2640"/>
-        <w:gridCol w:w="2640"/>
-        <w:gridCol w:w="2640"/>
-      </w:tblGrid>
-      <w:tr>
-        <w:trPr>
-          <w:tblHeader w:val="true"/>
-        </w:trPr>
-        <w:tc>
-          <w:tcPr/>
-          <w:p>
-            <w:pPr>
-              <w:pStyle w:val="Compact"/>
-              <w:jc w:val="left"/>
-            </w:pPr>
-            <w:r>
-              <w:t xml:space="preserve">Method</w:t>
-            </w:r>
-          </w:p>
-        </w:tc>
-        <w:tc>
-          <w:tcPr/>
-          <w:p>
-            <w:pPr>
-              <w:pStyle w:val="Compact"/>
-              <w:jc w:val="left"/>
-            </w:pPr>
-            <w:r>
-              <w:t xml:space="preserve">MAE, trained on same room (ppm)</w:t>
-            </w:r>
-          </w:p>
-        </w:tc>
-        <w:tc>
-          <w:tcPr/>
-          <w:p>
-            <w:pPr>
-              <w:pStyle w:val="Compact"/>
-              <w:jc w:val="left"/>
-            </w:pPr>
-            <w:r>
-              <w:t xml:space="preserve">MAE, trained on other room (ppm)</w:t>
-            </w:r>
-          </w:p>
-        </w:tc>
-      </w:tr>
-      <w:tr>
-        <w:tc>
-          <w:tcPr/>
-          <w:p>
-            <w:pPr>
-              <w:pStyle w:val="Compact"/>
-              <w:jc w:val="left"/>
-            </w:pPr>
-            <w:r>
-              <w:t xml:space="preserve">Persistence</w:t>
-            </w:r>
-          </w:p>
-        </w:tc>
-        <w:tc>
-          <w:tcPr/>
-          <w:p>
-            <w:pPr>
-              <w:pStyle w:val="Compact"/>
-              <w:jc w:val="left"/>
-            </w:pPr>
-            <w:r>
-              <w:t xml:space="preserve">7.749</w:t>
-            </w:r>
-          </w:p>
-        </w:tc>
-        <w:tc>
-          <w:tcPr/>
-          <w:p>
-            <w:pPr>
-              <w:pStyle w:val="Compact"/>
-              <w:jc w:val="left"/>
-            </w:pPr>
-            <w:r>
-              <w:t xml:space="preserve">7.749</w:t>
-            </w:r>
-          </w:p>
-        </w:tc>
-      </w:tr>
-      <w:tr>
-        <w:tc>
-          <w:tcPr/>
-          <w:p>
-            <w:pPr>
-              <w:pStyle w:val="Compact"/>
-              <w:jc w:val="left"/>
-            </w:pPr>
-            <w:r>
-              <w:t xml:space="preserve">Linear Regression</w:t>
-            </w:r>
-          </w:p>
-        </w:tc>
-        <w:tc>
-          <w:tcPr/>
-          <w:p>
-            <w:pPr>
-              <w:pStyle w:val="Compact"/>
-              <w:jc w:val="left"/>
-            </w:pPr>
-            <w:r>
-              <w:t xml:space="preserve">7.295</w:t>
-            </w:r>
-          </w:p>
-        </w:tc>
-        <w:tc>
-          <w:tcPr/>
-          <w:p>
-            <w:pPr>
-              <w:pStyle w:val="Compact"/>
-              <w:jc w:val="left"/>
-            </w:pPr>
-            <w:r>
-              <w:t xml:space="preserve">7.797</w:t>
-            </w:r>
-          </w:p>
-        </w:tc>
-      </w:tr>
-      <w:tr>
-        <w:tc>
-          <w:tcPr/>
-          <w:p>
-            <w:pPr>
-              <w:pStyle w:val="Compact"/>
-              <w:jc w:val="left"/>
-            </w:pPr>
-            <w:r>
-              <w:t xml:space="preserve">Decision Tree</w:t>
-            </w:r>
-          </w:p>
-        </w:tc>
-        <w:tc>
-          <w:tcPr/>
-          <w:p>
-            <w:pPr>
-              <w:pStyle w:val="Compact"/>
-              <w:jc w:val="left"/>
-            </w:pPr>
-            <w:r>
-              <w:t xml:space="preserve">7.355</w:t>
-            </w:r>
-          </w:p>
-        </w:tc>
-        <w:tc>
-          <w:tcPr/>
-          <w:p>
-            <w:pPr>
-              <w:pStyle w:val="Compact"/>
-              <w:jc w:val="left"/>
-            </w:pPr>
-            <w:r>
-              <w:t xml:space="preserve">10.238</w:t>
-            </w:r>
-          </w:p>
-        </w:tc>
-      </w:tr>
-      <w:tr>
-        <w:tc>
-          <w:tcPr/>
-          <w:p>
-            <w:pPr>
-              <w:pStyle w:val="Compact"/>
-              <w:jc w:val="left"/>
-            </w:pPr>
-            <w:r>
-              <w:rPr>
-                <w:bCs/>
-                <w:b/>
-              </w:rPr>
-              <w:t xml:space="preserve">SVR</w:t>
-            </w:r>
-          </w:p>
-        </w:tc>
-        <w:tc>
-          <w:tcPr/>
-          <w:p>
-            <w:pPr>
-              <w:pStyle w:val="Compact"/>
-              <w:jc w:val="left"/>
-            </w:pPr>
-            <w:r>
-              <w:rPr>
-                <w:bCs/>
-                <w:b/>
-              </w:rPr>
-              <w:t xml:space="preserve">6.994</w:t>
-            </w:r>
-          </w:p>
-        </w:tc>
-        <w:tc>
-          <w:tcPr/>
-          <w:p>
-            <w:pPr>
-              <w:pStyle w:val="Compact"/>
-              <w:jc w:val="left"/>
-            </w:pPr>
-            <w:r>
-              <w:t xml:space="preserve">8.070</w:t>
-            </w:r>
-          </w:p>
-        </w:tc>
-      </w:tr>
-      <w:tr>
-        <w:tc>
-          <w:tcPr/>
-          <w:p>
-            <w:pPr>
-              <w:pStyle w:val="Compact"/>
-              <w:jc w:val="left"/>
-            </w:pPr>
-            <w:r>
-              <w:t xml:space="preserve">Neural Network</w:t>
-            </w:r>
-          </w:p>
-        </w:tc>
-        <w:tc>
-          <w:tcPr/>
-          <w:p>
-            <w:pPr>
-              <w:pStyle w:val="Compact"/>
-              <w:jc w:val="left"/>
-            </w:pPr>
-            <w:r>
-              <w:t xml:space="preserve">7.456</w:t>
-            </w:r>
-          </w:p>
-        </w:tc>
-        <w:tc>
-          <w:tcPr/>
-          <w:p>
-            <w:pPr>
-              <w:pStyle w:val="Compact"/>
-              <w:jc w:val="left"/>
-            </w:pPr>
-            <w:r>
-              <w:t xml:space="preserve">8.035</w:t>
-            </w:r>
-          </w:p>
-        </w:tc>
-      </w:tr>
-    </w:tbl>
+        <w:t xml:space="preserve">’s own earlier data (figure, right).</w:t>
+      </w:r>
+    </w:p>
     <w:p>
       <w:pPr>
         <w:pStyle w:val="CaptionedFigure"/>
@@ -5363,18 +5249,18 @@
           <wp:inline>
             <wp:extent cx="4754880" cy="1682496"/>
             <wp:effectExtent b="0" l="0" r="0" t="0"/>
-            <wp:docPr descr="MAE for Experiment A (left) and Experiment B (right)" title="" id="37" name="Picture"/>
+            <wp:docPr descr="MAE for Experiment A (left) and Experiment B (right)" title="" id="50" name="Picture"/>
             <a:graphic>
               <a:graphicData uri="http://schemas.openxmlformats.org/drawingml/2006/picture">
                 <pic:pic>
                   <pic:nvPicPr>
-                    <pic:cNvPr descr="chart16_multi_sensor_results.png" id="38" name="Picture"/>
+                    <pic:cNvPr descr="chart16_multi_sensor_results.png" id="51" name="Picture"/>
                     <pic:cNvPicPr>
                       <a:picLocks noChangeArrowheads="1" noChangeAspect="1"/>
                     </pic:cNvPicPr>
                   </pic:nvPicPr>
                   <pic:blipFill>
-                    <a:blip r:embed="rId36"/>
+                    <a:blip r:embed="rId49"/>
                     <a:stretch>
                       <a:fillRect/>
                     </a:stretch>
@@ -5414,7 +5300,7 @@
         <w:pStyle w:val="BodyText"/>
       </w:pPr>
       <w:r>
-        <w:t xml:space="preserve">Trained on its own room, every model beats persistence, and SVR is again the best method (MAE 6.99 ppm, R² 0.78). Trained on the other room, every model is</w:t>
+        <w:t xml:space="preserve">Trained on its own room, every model beats persistence (7.75 ppm) and SVR is best (MAE 6.99 ppm, R² 0.78). Trained on the other room, every model is</w:t>
       </w:r>
       <w:r>
         <w:t xml:space="preserve"> </w:t>
@@ -5427,7 +5313,10 @@
         <w:t xml:space="preserve">worse than persistence</w:t>
       </w:r>
       <w:r>
-        <w:t xml:space="preserve">. The models learn room-specific behaviour — the typical CO₂ level each room settles to and how quickly it returns there — so a model from one room pulls its forecasts toward the wrong baseline in another. The two rooms are driven differently: G.38 follows its occupants (a weekday midday peak), while sensor</w:t>
+        <w:t xml:space="preserve"> </w:t>
+      </w:r>
+      <w:r>
+        <w:t xml:space="preserve">(Decision Tree 10.24 ppm). The models learn room-specific behaviour — the level each room settles to and how fast it returns — and the rooms are driven differently: G.38 by occupants, sensor</w:t>
       </w:r>
       <w:r>
         <w:t xml:space="preserve"> </w:t>
@@ -5442,12 +5331,12 @@
         <w:t xml:space="preserve"> </w:t>
       </w:r>
       <w:r>
-        <w:t xml:space="preserve">follows the ventilation schedule (Section 4). The practical conclusion is that a forecaster of this kind must be trained per room (or per sensor); it cannot simply be copied between rooms.</w:t>
-      </w:r>
-    </w:p>
-    <w:bookmarkEnd w:id="39"/>
-    <w:bookmarkEnd w:id="40"/>
-    <w:bookmarkStart w:id="45" w:name="validation"/>
+        <w:t xml:space="preserve">by the ventilation schedule (Section 4). A forecaster must be trained per room.</w:t>
+      </w:r>
+    </w:p>
+    <w:bookmarkEnd w:id="52"/>
+    <w:bookmarkEnd w:id="53"/>
+    <w:bookmarkStart w:id="61" w:name="validation"/>
     <w:p>
       <w:pPr>
         <w:pStyle w:val="Heading2"/>
@@ -5456,7 +5345,7 @@
         <w:t xml:space="preserve">5. Validation</w:t>
       </w:r>
     </w:p>
-    <w:bookmarkStart w:id="41" w:name="traintest-split"/>
+    <w:bookmarkStart w:id="57" w:name="traintest-split"/>
     <w:p>
       <w:pPr>
         <w:pStyle w:val="Heading3"/>
@@ -5470,19 +5359,66 @@
         <w:pStyle w:val="FirstParagraph"/>
       </w:pPr>
       <w:r>
-        <w:t xml:space="preserve">The dataset was divided chronologically: the first 80% of rows (13,608) were used for training; the final 20% (3,402 rows) were held out for testing. The training period ends on 11 March 2026.</w:t>
-      </w:r>
-    </w:p>
-    <w:p>
-      <w:pPr>
-        <w:pStyle w:val="BodyText"/>
-      </w:pPr>
-      <w:r>
-        <w:t xml:space="preserve">A random split was deliberately not used. CO₂ time series are strongly autocorrelated: adjacent readings are similar to one another. A random split would scatter test points throughout the training period, allowing the model to effectively look up nearby values seen during training. The resulting test score would measure interpolation ability rather than the ability to forecast a genuinely unseen future period. The chronological split correctly simulates deployment conditions (timeline figure in Appendix A).</w:t>
-      </w:r>
-    </w:p>
-    <w:bookmarkEnd w:id="41"/>
-    <w:bookmarkStart w:id="42" w:name="evaluation-metrics"/>
+        <w:t xml:space="preserve">The first 80% of rows (13,608, up to 11 March 2026) were used for training and the final 20% (3,402) for testing. A random split was deliberately avoided: CO₂ is strongly autocorrelated, so randomly placed test points would sit beside near-identical training points, and the score would measure interpolation rather than forecasting an unseen future. The chronological split matches deployment.</w:t>
+      </w:r>
+    </w:p>
+    <w:p>
+      <w:pPr>
+        <w:pStyle w:val="CaptionedFigure"/>
+      </w:pPr>
+      <w:r>
+        <w:drawing>
+          <wp:inline>
+            <wp:extent cx="5029200" cy="1237956"/>
+            <wp:effectExtent b="0" l="0" r="0" t="0"/>
+            <wp:docPr descr="Chronological train/test split over the full sensor history for sensor 6012002000326" title="" id="55" name="Picture"/>
+            <a:graphic>
+              <a:graphicData uri="http://schemas.openxmlformats.org/drawingml/2006/picture">
+                <pic:pic>
+                  <pic:nvPicPr>
+                    <pic:cNvPr descr="chart14_train_test_split.png" id="56" name="Picture"/>
+                    <pic:cNvPicPr>
+                      <a:picLocks noChangeArrowheads="1" noChangeAspect="1"/>
+                    </pic:cNvPicPr>
+                  </pic:nvPicPr>
+                  <pic:blipFill>
+                    <a:blip r:embed="rId54"/>
+                    <a:stretch>
+                      <a:fillRect/>
+                    </a:stretch>
+                  </pic:blipFill>
+                  <pic:spPr bwMode="auto">
+                    <a:xfrm>
+                      <a:off x="0" y="0"/>
+                      <a:ext cx="5029200" cy="1237956"/>
+                    </a:xfrm>
+                    <a:prstGeom prst="rect">
+                      <a:avLst/>
+                    </a:prstGeom>
+                    <a:noFill/>
+                    <a:ln w="9525">
+                      <a:noFill/>
+                      <a:headEnd/>
+                      <a:tailEnd/>
+                    </a:ln>
+                  </pic:spPr>
+                </pic:pic>
+              </a:graphicData>
+            </a:graphic>
+          </wp:inline>
+        </w:drawing>
+      </w:r>
+    </w:p>
+    <w:p>
+      <w:pPr>
+        <w:pStyle w:val="ImageCaption"/>
+      </w:pPr>
+      <w:r>
+        <w:t xml:space="preserve">Chronological train/test split over the full sensor history for sensor 6012002000326</w:t>
+      </w:r>
+    </w:p>
+    <w:bookmarkEnd w:id="57"/>
+    <w:bookmarkStart w:id="58" w:name="evaluation-metrics"/>
     <w:p>
       <w:pPr>
         <w:pStyle w:val="Heading3"/>
@@ -5624,7 +5560,7 @@
         <w:pStyle w:val="FirstParagraph"/>
       </w:pPr>
       <w:r>
-        <w:t xml:space="preserve">The average prediction error in ppm. Directly interpretable and robust to occasional large outliers. An MAE of 8.35 ppm means the model is on average 8.35 ppm away from the true reading.</w:t>
+        <w:t xml:space="preserve">The average error in ppm, robust to occasional outliers: an MAE of 8.35 ppm means predictions are on average 8.35 ppm from the true reading.</w:t>
       </w:r>
     </w:p>
     <w:p>
@@ -5777,7 +5713,7 @@
         <w:pStyle w:val="FirstParagraph"/>
       </w:pPr>
       <w:r>
-        <w:t xml:space="preserve">Penalises large errors more heavily than MAE due to the squared term. A large gap between RMSE and MAE indicates a model that makes occasional very large errors even when its typical error is small.</w:t>
+        <w:t xml:space="preserve">The square penalises large errors, so an RMSE well above the MAE signals occasional large errors despite a small typical error.</w:t>
       </w:r>
     </w:p>
     <w:p>
@@ -6006,11 +5942,11 @@
         <w:pStyle w:val="FirstParagraph"/>
       </w:pPr>
       <w:r>
-        <w:t xml:space="preserve">The proportion of variance in the target explained by the model. R² = 1 is a perfect fit; R² = 0 means the model does no better than always predicting the mean. All four models achieve R² in the range 0.19–0.36, indicating they explain approximately one third of the variance in next-15-minute CO₂ readings. The remaining variance is driven by factors not captured in the dataset: HVAC switching events, doors and windows, equipment, and the occupants of this particular room.</w:t>
-      </w:r>
-    </w:p>
-    <w:bookmarkEnd w:id="42"/>
-    <w:bookmarkStart w:id="43" w:name="Xd8f2789288cdc47fb919a2a3d44a84a474eb10b"/>
+        <w:t xml:space="preserve">The fraction of target variance explained: 1 is perfect, 0 is no better than predicting the mean. The models reach 0.19–0.36, about a third of the variance; the rest comes from factors not in the dataset (HVAC switching, doors, windows, equipment, and this room’s occupants).</w:t>
+      </w:r>
+    </w:p>
+    <w:bookmarkEnd w:id="58"/>
+    <w:bookmarkStart w:id="59" w:name="Xd8f2789288cdc47fb919a2a3d44a84a474eb10b"/>
     <w:p>
       <w:pPr>
         <w:pStyle w:val="Heading3"/>
@@ -6024,7 +5960,7 @@
         <w:pStyle w:val="FirstParagraph"/>
       </w:pPr>
       <w:r>
-        <w:t xml:space="preserve">The working sensor has no documented room location, but its temperature and humidity readings were compared against Bureau of Meteorology observations from Moorabbin Airport (station 086077) — the nearest official weather station to the Monash campus — across 222 overlapping days.</w:t>
+        <w:t xml:space="preserve">The sensor’s temperature and humidity were compared with Bureau of Meteorology observations at Moorabbin Airport (station 086077, the nearest official station to Monash Clayton) over 222 overlapping days.</w:t>
       </w:r>
     </w:p>
     <w:tbl>
@@ -6125,7 +6061,7 @@
         <w:pStyle w:val="BodyText"/>
       </w:pPr>
       <w:r>
-        <w:t xml:space="preserve">Both correlations are strong. A malfunctioning sensor — one with a frozen clock, stuck reading, or random noise — would show correlations near zero. These values provide reasonable confidence that sensor</w:t>
+        <w:t xml:space="preserve">A faulty sensor (stuck reading, frozen clock or noise) would show correlations near zero, so these strong values indicate that sensor</w:t>
       </w:r>
       <w:r>
         <w:t xml:space="preserve"> </w:t>
@@ -6140,11 +6076,11 @@
         <w:t xml:space="preserve"> </w:t>
       </w:r>
       <w:r>
-        <w:t xml:space="preserve">is physically working and measuring real environmental conditions, even without a documented room label.</w:t>
-      </w:r>
-    </w:p>
-    <w:bookmarkEnd w:id="43"/>
-    <w:bookmarkStart w:id="44" w:name="numerical-integration-convergence"/>
+        <w:t xml:space="preserve">measures real conditions.</w:t>
+      </w:r>
+    </w:p>
+    <w:bookmarkEnd w:id="59"/>
+    <w:bookmarkStart w:id="60" w:name="numerical-integration-convergence"/>
     <w:p>
       <w:pPr>
         <w:pStyle w:val="Heading3"/>
@@ -6158,7 +6094,7 @@
         <w:pStyle w:val="FirstParagraph"/>
       </w:pPr>
       <w:r>
-        <w:t xml:space="preserve">Two numerical integration methods from MMA3001 Week 6 were implemented from the lecture formulae (not from library functions) to compute cumulative CO₂ exposure in ppm·h. Both methods were applied to a 41-hour gap-free window (1–3 October 2025) and the results were compared at three bin resolutions to verify convergence.</w:t>
+        <w:t xml:space="preserve">The Week 6 trapezoidal and Simpson’s rules were implemented from the lecture formulae (not library functions) to compute cumulative CO₂ exposure in ppm·h, and compared at three bin sizes on a 41-hour gap-free window (1–3 October 2025).</w:t>
       </w:r>
     </w:p>
     <w:tbl>
@@ -6432,7 +6368,7 @@
         <w:pStyle w:val="BodyText"/>
       </w:pPr>
       <w:r>
-        <w:t xml:space="preserve">The two methods agree to within 0.1% at every resolution, confirming the implementation is correct. The small variation in the estimates across bin sizes reflects genuine differences in the measured readings at different sampling densities, not numerical error.</w:t>
+        <w:t xml:space="preserve">The methods agree within 0.1% at every bin size, confirming the implementation. The variation between bin sizes reflects the readings sampled at each density, not numerical error.</w:t>
       </w:r>
     </w:p>
     <w:p>
@@ -6442,9 +6378,9 @@
         </w:pict>
       </w:r>
     </w:p>
-    <w:bookmarkEnd w:id="44"/>
-    <w:bookmarkEnd w:id="45"/>
-    <w:bookmarkStart w:id="49" w:name="limitations-and-known-failure-modes"/>
+    <w:bookmarkEnd w:id="60"/>
+    <w:bookmarkEnd w:id="61"/>
+    <w:bookmarkStart w:id="65" w:name="limitations-and-known-failure-modes"/>
     <w:p>
       <w:pPr>
         <w:pStyle w:val="Heading2"/>
@@ -6483,7 +6419,7 @@
         <w:t xml:space="preserve"> </w:t>
       </w:r>
       <w:r>
-        <w:t xml:space="preserve">does not appear in the Sensor ID and Locations spreadsheet provided with the dataset, so there is no way to determine from metadata which room it monitors or which occupancy zone covers that room. Instead, a data-driven sensor-matching analysis was run (</w:t>
+        <w:t xml:space="preserve">is not in the Sensor ID and Locations spreadsheet, so its room and matching occupancy zone are unknown. A data-driven sensor-matching analysis was run instead (</w:t>
       </w:r>
       <w:r>
         <w:rPr>
@@ -6504,7 +6440,7 @@
         <w:t xml:space="preserve">scripts/sensor_matching_analysis.py</w:t>
       </w:r>
       <w:r>
-        <w:t xml:space="preserve">). For every zone–sensor pair, the zone’s binary occupancy and the sensor’s reading were resampled to 15-minute bins, and Pearson’s</w:t>
+        <w:t xml:space="preserve">): for every zone–sensor pair on 15-minute bins, Pearson’s</w:t>
       </w:r>
       <w:r>
         <w:t xml:space="preserve"> </w:t>
@@ -6518,7 +6454,7 @@
         <w:t xml:space="preserve"> </w:t>
       </w:r>
       <w:r>
-        <w:t xml:space="preserve">was computed between occupancy and the</w:t>
+        <w:t xml:space="preserve">was computed between the zone’s occupancy and the</w:t>
       </w:r>
       <w:r>
         <w:t xml:space="preserve"> </w:t>
@@ -6534,10 +6470,7 @@
         <w:t xml:space="preserve"> </w:t>
       </w:r>
       <w:r>
-        <w:t xml:space="preserve">in the reading from one bin to the next (its first difference). Using the change rather than the level matters: every room’s CO₂ and temperature follow the same working-day cycle, so correlating raw levels would make every pair look related. Lags of up to ±4 bins (±1 hour) were searched and the strongest absolute correlation kept. The test was repeated for CO₂, temperature and humidity (results in</w:t>
-      </w:r>
-      <w:r>
-        <w:t xml:space="preserve"> </w:t>
+        <w:t xml:space="preserve">in the reading (its first difference), searching lags up to ±4 bins (±1 hour) and keeping the strongest. Changes are used rather than levels because every room follows the same working-day cycle, which would make all pairs look related. CO₂, temperature and humidity were tested (</w:t>
       </w:r>
       <w:r>
         <w:rPr>
@@ -6558,18 +6491,18 @@
           <wp:inline>
             <wp:extent cx="4754880" cy="2099870"/>
             <wp:effectExtent b="0" l="0" r="0" t="0"/>
-            <wp:docPr descr="Best-lag correlation between each zone’s occupancy and the 15-minute change in each sensor’s reading" title="" id="47" name="Picture"/>
+            <wp:docPr descr="Best-lag correlation between each zone’s occupancy and the 15-minute change in each sensor’s reading" title="" id="63" name="Picture"/>
             <a:graphic>
               <a:graphicData uri="http://schemas.openxmlformats.org/drawingml/2006/picture">
                 <pic:pic>
                   <pic:nvPicPr>
-                    <pic:cNvPr descr="chart10_zone_matching.png" id="48" name="Picture"/>
+                    <pic:cNvPr descr="chart10_zone_matching.png" id="64" name="Picture"/>
                     <pic:cNvPicPr>
                       <a:picLocks noChangeArrowheads="1" noChangeAspect="1"/>
                     </pic:cNvPicPr>
                   </pic:nvPicPr>
                   <pic:blipFill>
-                    <a:blip r:embed="rId46"/>
+                    <a:blip r:embed="rId62"/>
                     <a:stretch>
                       <a:fillRect/>
                     </a:stretch>
@@ -6624,10 +6557,7 @@
         <w:t xml:space="preserve"> </w:t>
       </w:r>
       <w:r>
-        <w:t xml:space="preserve">shows essentially no relationship with any zone:</w:t>
-      </w:r>
-      <w:r>
-        <w:t xml:space="preserve"> </w:t>
+        <w:t xml:space="preserve">shows no relationship with any zone (</w:t>
       </w:r>
       <m:oMath>
         <m:d>
@@ -6657,7 +6587,7 @@
         <w:t xml:space="preserve"> </w:t>
       </w:r>
       <w:r>
-        <w:t xml:space="preserve">for all four zones with overlapping data (the fifth zone has no overlap with this sensor’s genuine readings). No sensor exceeds</w:t>
+        <w:t xml:space="preserve">for the four zones with overlapping data), and no sensor exceeds</w:t>
       </w:r>
       <w:r>
         <w:t xml:space="preserve"> </w:t>
@@ -6687,21 +6617,27 @@
         </m:r>
       </m:oMath>
       <w:r>
-        <w:t xml:space="preserve"> </w:t>
-      </w:r>
-      <w:r>
-        <w:t xml:space="preserve">for CO₂. Temperature shows weak positive correlations for this sensor (</w:t>
+        <w:t xml:space="preserve">. Temperature reaches</w:t>
+      </w:r>
+      <w:r>
+        <w:t xml:space="preserve"> </w:t>
       </w:r>
       <m:oMath>
         <m:r>
           <m:t>r</m:t>
         </m:r>
+        <m:r>
+          <m:rPr>
+            <m:sty m:val="p"/>
+          </m:rPr>
+          <m:t>=</m:t>
+        </m:r>
+        <m:r>
+          <m:t>0.27</m:t>
+        </m:r>
       </m:oMath>
       <w:r>
-        <w:t xml:space="preserve"> </w:t>
-      </w:r>
-      <w:r>
-        <w:t xml:space="preserve">up to 0.27), but at a lag of −3 to −4 bins: the temperature rise</w:t>
+        <w:t xml:space="preserve">, but at lags of −3 to −4 bins: it rises 45–60 minutes</w:t>
       </w:r>
       <w:r>
         <w:t xml:space="preserve"> </w:t>
@@ -6711,13 +6647,13 @@
           <w:iCs/>
           <w:i/>
         </w:rPr>
-        <w:t xml:space="preserve">precedes</w:t>
-      </w:r>
-      <w:r>
-        <w:t xml:space="preserve"> </w:t>
-      </w:r>
-      <w:r>
-        <w:t xml:space="preserve">occupancy by 45–60 minutes, which points to a building-wide morning HVAC warm-up rather than to people in a shared room. A correlation search of this kind cannot prove that the sensor is outside every zone, but it finds no evidence linking it to any of them. This is a property of the dataset, not a failure of the modelling approach.</w:t>
+        <w:t xml:space="preserve">before</w:t>
+      </w:r>
+      <w:r>
+        <w:t xml:space="preserve"> </w:t>
+      </w:r>
+      <w:r>
+        <w:t xml:space="preserve">occupancy, pointing to a building-wide HVAC warm-up rather than shared occupants. This cannot prove the sensor is outside every zone, but finds no evidence linking it to any.</w:t>
       </w:r>
     </w:p>
     <w:p>
@@ -6777,7 +6713,7 @@
         <w:t xml:space="preserve"> </w:t>
       </w:r>
       <w:r>
-        <w:t xml:space="preserve">were initially described as having frozen clocks, because every row carries the same internal timestamp. Comparing with the server receive time (</w:t>
+        <w:t xml:space="preserve">first appeared to have frozen clocks. The server receive time (</w:t>
       </w:r>
       <w:r>
         <w:rPr>
@@ -6786,7 +6722,7 @@
         <w:t xml:space="preserve">createdate</w:t>
       </w:r>
       <w:r>
-        <w:t xml:space="preserve">) shows the fault is more fundamental: the rows arrive regularly, but every one is the same stale packet re-sent, with an identical CO₂ value (for example, 666 ppm in all 21,363 rows of</w:t>
+        <w:t xml:space="preserve">) shows that their rows arrive regularly but are all one stale packet re-sent with the same value (e.g. 666 ppm in all 21,363 rows of</w:t>
       </w:r>
       <w:r>
         <w:t xml:space="preserve"> </w:t>
@@ -6798,7 +6734,7 @@
         <w:t xml:space="preserve">6012002000227</w:t>
       </w:r>
       <w:r>
-        <w:t xml:space="preserve">). No interval of any length can be formed, so these sensors cannot contribute data under any policy. The same fault affects the two usable sensors outside their genuine periods (Section 4.1). Sensor</w:t>
+        <w:t xml:space="preserve">), so no interval can be formed. The usable sensors show the same fault outside their genuine periods. Sensor</w:t>
       </w:r>
       <w:r>
         <w:t xml:space="preserve"> </w:t>
@@ -6813,7 +6749,7 @@
         <w:t xml:space="preserve"> </w:t>
       </w:r>
       <w:r>
-        <w:t xml:space="preserve">has only three and a half months of genuine data, which is why it was not used for the main analysis; it is used for the pooled and cross-sensor experiments in Section 4.1. None of these issues is documented in the dataset description; they were identified by inspecting the raw timestamps and values.</w:t>
+        <w:t xml:space="preserve">has only 3.5 months of genuine data, too little for the main analysis, and is used in Section 4.2. None of this is documented in the dataset description; it was found by inspecting raw timestamps and values.</w:t>
       </w:r>
     </w:p>
     <w:p>
@@ -6831,7 +6767,7 @@
         <w:t xml:space="preserve"> </w:t>
       </w:r>
       <w:r>
-        <w:t xml:space="preserve">A 636-day gap in genuine readings reduces the usable dataset from 84,576 candidate rows to 17,010 (20.1%). This is a direct consequence of the sensor fault and the correct handling of missing data; imputing values across a gap of this length would produce a fabricated dataset with no physical basis. Adding every usable interval from a second sensor raises the training set by 56% but does not measurably improve accuracy (Section 4.1).</w:t>
+        <w:t xml:space="preserve">The 636-day gap reduces 84,576 candidate rows to 17,010 (20.1%); imputing across it would fabricate data. Adding a second sensor’s intervals (+56% training data) does not measurably improve accuracy (Section 4.2).</w:t>
       </w:r>
     </w:p>
     <w:p>
@@ -6849,7 +6785,7 @@
         <w:t xml:space="preserve"> </w:t>
       </w:r>
       <w:r>
-        <w:t xml:space="preserve">A model trained on one sensor performs worse than a naive persistence forecast on another (Section 4.1). Each room needs its own training data.</w:t>
+        <w:t xml:space="preserve">Trained on one sensor, every model is worse than persistence on another (Section 4.2); each room needs its own training data.</w:t>
       </w:r>
     </w:p>
     <w:p>
@@ -6867,7 +6803,7 @@
         <w:t xml:space="preserve"> </w:t>
       </w:r>
       <w:r>
-        <w:t xml:space="preserve">An R² of approximately 0.34–0.36 means the models account for roughly one third of the variability in next-15-minute CO₂ levels. The remainder is driven by unobserved factors — HVAC switching, windows, doors, and the occupants of the room itself (since the occupancy counter does not cover it). The model is appropriately used as a trend indicator to support early ventilation decisions, not as a precise point forecast.</w:t>
+        <w:t xml:space="preserve">R² of 0.34–0.36 leaves two thirds of the variability to unobserved factors (HVAC switching, windows, doors, the room’s own occupants). The model suits use as a trend indicator for early ventilation, not as a precise point forecast.</w:t>
       </w:r>
     </w:p>
     <w:p>
@@ -6879,13 +6815,13 @@
           <w:bCs/>
           <w:b/>
         </w:rPr>
-        <w:t xml:space="preserve">Gap-aware integration is essential for correct cumulative exposure estimates.</w:t>
-      </w:r>
-      <w:r>
-        <w:t xml:space="preserve"> </w:t>
-      </w:r>
-      <w:r>
-        <w:t xml:space="preserve">Applying the trapezoidal rule naively across the full sensor record — treating the 636-day outage as a 15-minute step — yields 9.54 million ppm·h. The gap-aware implementation, which skips any integration panel where the two endpoints are more than 2 hours apart, yields 2.31 million ppm·h. The factor-of-four difference is caused entirely by the outage-bridging assumption, not by measurement error.</w:t>
+        <w:t xml:space="preserve">Integration must be gap-aware.</w:t>
+      </w:r>
+      <w:r>
+        <w:t xml:space="preserve"> </w:t>
+      </w:r>
+      <w:r>
+        <w:t xml:space="preserve">Applied naively across the full record, treating the 636-day outage as one step, the trapezoidal rule gives 9.54 million ppm·h; skipping panels whose endpoints are more than 2 hours apart gives 2.31 million ppm·h. The factor of four comes entirely from bridging the outage.</w:t>
       </w:r>
     </w:p>
     <w:p>
@@ -6895,8 +6831,8 @@
         </w:pict>
       </w:r>
     </w:p>
-    <w:bookmarkEnd w:id="49"/>
-    <w:bookmarkStart w:id="50" w:name="ai-use-and-critical-reflection"/>
+    <w:bookmarkEnd w:id="65"/>
+    <w:bookmarkStart w:id="66" w:name="ai-use-and-critical-reflection"/>
     <w:p>
       <w:pPr>
         <w:pStyle w:val="Heading2"/>
@@ -6964,7 +6900,7 @@
         <w:t xml:space="preserve"> </w:t>
       </w:r>
       <w:r>
-        <w:t xml:space="preserve">After discussing the project with the teaching team, I was advised to use the valid time intervals from the other sensors instead of discarding them entirely. I brought this feedback to Claude and asked for it to be applied. Claude proposed and implemented the interval audit, the pooled and cross-sensor experiments and the bootstrap significance check (Section 4.1), and found, by comparing the</w:t>
+        <w:t xml:space="preserve">After discussing the project with the teaching team, I was advised to use the valid time intervals from the other sensors instead of discarding them entirely. I brought this feedback to Claude and asked for it to be applied. Claude proposed and implemented the interval audit, the pooled and cross-sensor experiments and the bootstrap significance check (Section 4.2), and found, by comparing the</w:t>
       </w:r>
       <w:r>
         <w:t xml:space="preserve"> </w:t>
@@ -7118,8 +7054,8 @@
         </w:pict>
       </w:r>
     </w:p>
-    <w:bookmarkEnd w:id="50"/>
-    <w:bookmarkStart w:id="51" w:name="references"/>
+    <w:bookmarkEnd w:id="66"/>
+    <w:bookmarkStart w:id="67" w:name="references"/>
     <w:p>
       <w:pPr>
         <w:pStyle w:val="Heading2"/>
@@ -7132,7 +7068,7 @@
       <w:pPr>
         <w:numPr>
           <w:ilvl w:val="0"/>
-          <w:numId w:val="1002"/>
+          <w:numId w:val="1001"/>
         </w:numPr>
         <w:pStyle w:val="Compact"/>
       </w:pPr>
@@ -7144,7 +7080,7 @@
       <w:pPr>
         <w:numPr>
           <w:ilvl w:val="0"/>
-          <w:numId w:val="1002"/>
+          <w:numId w:val="1001"/>
         </w:numPr>
         <w:pStyle w:val="Compact"/>
       </w:pPr>
@@ -7156,7 +7092,7 @@
       <w:pPr>
         <w:numPr>
           <w:ilvl w:val="0"/>
-          <w:numId w:val="1002"/>
+          <w:numId w:val="1001"/>
         </w:numPr>
         <w:pStyle w:val="Compact"/>
       </w:pPr>
@@ -7168,7 +7104,7 @@
       <w:pPr>
         <w:numPr>
           <w:ilvl w:val="0"/>
-          <w:numId w:val="1002"/>
+          <w:numId w:val="1001"/>
         </w:numPr>
         <w:pStyle w:val="Compact"/>
       </w:pPr>
@@ -7180,7 +7116,7 @@
       <w:pPr>
         <w:numPr>
           <w:ilvl w:val="0"/>
-          <w:numId w:val="1002"/>
+          <w:numId w:val="1001"/>
         </w:numPr>
         <w:pStyle w:val="Compact"/>
       </w:pPr>
@@ -7192,7 +7128,7 @@
       <w:pPr>
         <w:numPr>
           <w:ilvl w:val="0"/>
-          <w:numId w:val="1002"/>
+          <w:numId w:val="1001"/>
         </w:numPr>
         <w:pStyle w:val="Compact"/>
       </w:pPr>
@@ -7204,7 +7140,7 @@
       <w:pPr>
         <w:numPr>
           <w:ilvl w:val="0"/>
-          <w:numId w:val="1002"/>
+          <w:numId w:val="1001"/>
         </w:numPr>
         <w:pStyle w:val="Compact"/>
       </w:pPr>
@@ -7229,7 +7165,7 @@
       <w:pPr>
         <w:numPr>
           <w:ilvl w:val="0"/>
-          <w:numId w:val="1002"/>
+          <w:numId w:val="1001"/>
         </w:numPr>
         <w:pStyle w:val="Compact"/>
       </w:pPr>
@@ -7254,7 +7190,7 @@
       <w:pPr>
         <w:numPr>
           <w:ilvl w:val="0"/>
-          <w:numId w:val="1002"/>
+          <w:numId w:val="1001"/>
         </w:numPr>
         <w:pStyle w:val="Compact"/>
       </w:pPr>
@@ -7266,328 +7202,12 @@
       <w:pPr>
         <w:numPr>
           <w:ilvl w:val="0"/>
-          <w:numId w:val="1002"/>
+          <w:numId w:val="1001"/>
         </w:numPr>
         <w:pStyle w:val="Compact"/>
       </w:pPr>
       <w:r>
         <w:t xml:space="preserve">scikit-learn documentation: LinearRegression, DecisionTreeRegressor, SVR, MLPRegressor, StandardScaler, Pipeline. https://scikit-learn.org/</w:t>
-      </w:r>
-    </w:p>
-    <w:p>
-      <w:r>
-        <w:pict>
-          <v:rect style="width:0;height:1.5pt" o:hralign="center" o:hrstd="t" o:hr="t"/>
-        </w:pict>
-      </w:r>
-    </w:p>
-    <w:bookmarkEnd w:id="51"/>
-    <w:bookmarkStart w:id="67" w:name="appendix-a-additional-figures"/>
-    <w:p>
-      <w:pPr>
-        <w:pStyle w:val="Heading2"/>
-      </w:pPr>
-      <w:r>
-        <w:t xml:space="preserve">Appendix A: Additional Figures</w:t>
-      </w:r>
-    </w:p>
-    <w:p>
-      <w:pPr>
-        <w:pStyle w:val="CaptionedFigure"/>
-      </w:pPr>
-      <w:r>
-        <w:drawing>
-          <wp:inline>
-            <wp:extent cx="3931919" cy="1924484"/>
-            <wp:effectExtent b="0" l="0" r="0" t="0"/>
-            <wp:docPr descr="Data pipeline: raw candidate timestamps versus dropped rows versus rows retained for modelling" title="" id="53" name="Picture"/>
-            <a:graphic>
-              <a:graphicData uri="http://schemas.openxmlformats.org/drawingml/2006/picture">
-                <pic:pic>
-                  <pic:nvPicPr>
-                    <pic:cNvPr descr="chart_data_pipeline.png" id="54" name="Picture"/>
-                    <pic:cNvPicPr>
-                      <a:picLocks noChangeArrowheads="1" noChangeAspect="1"/>
-                    </pic:cNvPicPr>
-                  </pic:nvPicPr>
-                  <pic:blipFill>
-                    <a:blip r:embed="rId52"/>
-                    <a:stretch>
-                      <a:fillRect/>
-                    </a:stretch>
-                  </pic:blipFill>
-                  <pic:spPr bwMode="auto">
-                    <a:xfrm>
-                      <a:off x="0" y="0"/>
-                      <a:ext cx="3931919" cy="1924484"/>
-                    </a:xfrm>
-                    <a:prstGeom prst="rect">
-                      <a:avLst/>
-                    </a:prstGeom>
-                    <a:noFill/>
-                    <a:ln w="9525">
-                      <a:noFill/>
-                      <a:headEnd/>
-                      <a:tailEnd/>
-                    </a:ln>
-                  </pic:spPr>
-                </pic:pic>
-              </a:graphicData>
-            </a:graphic>
-          </wp:inline>
-        </w:drawing>
-      </w:r>
-    </w:p>
-    <w:p>
-      <w:pPr>
-        <w:pStyle w:val="ImageCaption"/>
-      </w:pPr>
-      <w:r>
-        <w:t xml:space="preserve">Data pipeline: raw candidate timestamps versus dropped rows versus rows retained for modelling</w:t>
-      </w:r>
-    </w:p>
-    <w:p>
-      <w:pPr>
-        <w:pStyle w:val="CaptionedFigure"/>
-      </w:pPr>
-      <w:r>
-        <w:drawing>
-          <wp:inline>
-            <wp:extent cx="3931919" cy="967857"/>
-            <wp:effectExtent b="0" l="0" r="0" t="0"/>
-            <wp:docPr descr="Chronological train/test split over the full sensor history for sensor 6012002000326" title="" id="56" name="Picture"/>
-            <a:graphic>
-              <a:graphicData uri="http://schemas.openxmlformats.org/drawingml/2006/picture">
-                <pic:pic>
-                  <pic:nvPicPr>
-                    <pic:cNvPr descr="chart14_train_test_split.png" id="57" name="Picture"/>
-                    <pic:cNvPicPr>
-                      <a:picLocks noChangeArrowheads="1" noChangeAspect="1"/>
-                    </pic:cNvPicPr>
-                  </pic:nvPicPr>
-                  <pic:blipFill>
-                    <a:blip r:embed="rId55"/>
-                    <a:stretch>
-                      <a:fillRect/>
-                    </a:stretch>
-                  </pic:blipFill>
-                  <pic:spPr bwMode="auto">
-                    <a:xfrm>
-                      <a:off x="0" y="0"/>
-                      <a:ext cx="3931919" cy="967857"/>
-                    </a:xfrm>
-                    <a:prstGeom prst="rect">
-                      <a:avLst/>
-                    </a:prstGeom>
-                    <a:noFill/>
-                    <a:ln w="9525">
-                      <a:noFill/>
-                      <a:headEnd/>
-                      <a:tailEnd/>
-                    </a:ln>
-                  </pic:spPr>
-                </pic:pic>
-              </a:graphicData>
-            </a:graphic>
-          </wp:inline>
-        </w:drawing>
-      </w:r>
-    </w:p>
-    <w:p>
-      <w:pPr>
-        <w:pStyle w:val="ImageCaption"/>
-      </w:pPr>
-      <w:r>
-        <w:t xml:space="preserve">Chronological train/test split over the full sensor history for sensor 6012002000326</w:t>
-      </w:r>
-    </w:p>
-    <w:p>
-      <w:pPr>
-        <w:pStyle w:val="BodyText"/>
-      </w:pPr>
-      <w:r>
-        <w:t xml:space="preserve">The comparison table in Section 4 is aggregate; the plots below show what it looks like row by row (Linear Regression, Decision Tree, SVR and Neural Network, with occupancy, on the 0326 test set).</w:t>
-      </w:r>
-    </w:p>
-    <w:p>
-      <w:pPr>
-        <w:pStyle w:val="CaptionedFigure"/>
-      </w:pPr>
-      <w:r>
-        <w:drawing>
-          <wp:inline>
-            <wp:extent cx="3931919" cy="2948940"/>
-            <wp:effectExtent b="0" l="0" r="0" t="0"/>
-            <wp:docPr descr="Ground truth CO2 vs. all four models’ predictions — full test set (daily mean) and a representative 5-day detail window at native 15-minute resolution" title="" id="59" name="Picture"/>
-            <a:graphic>
-              <a:graphicData uri="http://schemas.openxmlformats.org/drawingml/2006/picture">
-                <pic:pic>
-                  <pic:nvPicPr>
-                    <pic:cNvPr descr="chart11_predictions_timeseries.png" id="60" name="Picture"/>
-                    <pic:cNvPicPr>
-                      <a:picLocks noChangeArrowheads="1" noChangeAspect="1"/>
-                    </pic:cNvPicPr>
-                  </pic:nvPicPr>
-                  <pic:blipFill>
-                    <a:blip r:embed="rId58"/>
-                    <a:stretch>
-                      <a:fillRect/>
-                    </a:stretch>
-                  </pic:blipFill>
-                  <pic:spPr bwMode="auto">
-                    <a:xfrm>
-                      <a:off x="0" y="0"/>
-                      <a:ext cx="3931919" cy="2948940"/>
-                    </a:xfrm>
-                    <a:prstGeom prst="rect">
-                      <a:avLst/>
-                    </a:prstGeom>
-                    <a:noFill/>
-                    <a:ln w="9525">
-                      <a:noFill/>
-                      <a:headEnd/>
-                      <a:tailEnd/>
-                    </a:ln>
-                  </pic:spPr>
-                </pic:pic>
-              </a:graphicData>
-            </a:graphic>
-          </wp:inline>
-        </w:drawing>
-      </w:r>
-    </w:p>
-    <w:p>
-      <w:pPr>
-        <w:pStyle w:val="ImageCaption"/>
-      </w:pPr>
-      <w:r>
-        <w:t xml:space="preserve">Ground truth CO2 vs. all four models’ predictions — full test set (daily mean) and a representative 5-day detail window at native 15-minute resolution</w:t>
-      </w:r>
-    </w:p>
-    <w:p>
-      <w:pPr>
-        <w:pStyle w:val="BodyText"/>
-      </w:pPr>
-      <w:r>
-        <w:t xml:space="preserve">All four track the everyday CO2 trend closely; they diverge at the sharp spikes in the detail panel (14-19 March), where every model lags or flattens the peak — the Decision Tree even overshoots into a spike the sensor never reached (15 March), a symptom of its piecewise-constant leaves extrapolating from a small high-CO2 training leaf.</w:t>
-      </w:r>
-    </w:p>
-    <w:p>
-      <w:pPr>
-        <w:pStyle w:val="CaptionedFigure"/>
-      </w:pPr>
-      <w:r>
-        <w:drawing>
-          <wp:inline>
-            <wp:extent cx="3931919" cy="3931919"/>
-            <wp:effectExtent b="0" l="0" r="0" t="0"/>
-            <wp:docPr descr="Predicted vs. actual CO2 for each model on the held-out test set, with a y=x reference line" title="" id="62" name="Picture"/>
-            <a:graphic>
-              <a:graphicData uri="http://schemas.openxmlformats.org/drawingml/2006/picture">
-                <pic:pic>
-                  <pic:nvPicPr>
-                    <pic:cNvPr descr="chart12_predicted_vs_actual.png" id="63" name="Picture"/>
-                    <pic:cNvPicPr>
-                      <a:picLocks noChangeArrowheads="1" noChangeAspect="1"/>
-                    </pic:cNvPicPr>
-                  </pic:nvPicPr>
-                  <pic:blipFill>
-                    <a:blip r:embed="rId61"/>
-                    <a:stretch>
-                      <a:fillRect/>
-                    </a:stretch>
-                  </pic:blipFill>
-                  <pic:spPr bwMode="auto">
-                    <a:xfrm>
-                      <a:off x="0" y="0"/>
-                      <a:ext cx="3931919" cy="3931919"/>
-                    </a:xfrm>
-                    <a:prstGeom prst="rect">
-                      <a:avLst/>
-                    </a:prstGeom>
-                    <a:noFill/>
-                    <a:ln w="9525">
-                      <a:noFill/>
-                      <a:headEnd/>
-                      <a:tailEnd/>
-                    </a:ln>
-                  </pic:spPr>
-                </pic:pic>
-              </a:graphicData>
-            </a:graphic>
-          </wp:inline>
-        </w:drawing>
-      </w:r>
-    </w:p>
-    <w:p>
-      <w:pPr>
-        <w:pStyle w:val="ImageCaption"/>
-      </w:pPr>
-      <w:r>
-        <w:t xml:space="preserve">Predicted vs. actual CO2 for each model on the held-out test set, with a y=x reference line</w:t>
-      </w:r>
-    </w:p>
-    <w:p>
-      <w:pPr>
-        <w:pStyle w:val="CaptionedFigure"/>
-      </w:pPr>
-      <w:r>
-        <w:drawing>
-          <wp:inline>
-            <wp:extent cx="3931919" cy="3538727"/>
-            <wp:effectExtent b="0" l="0" r="0" t="0"/>
-            <wp:docPr descr="Residual (predicted minus actual) vs. predicted CO2 for each model" title="" id="65" name="Picture"/>
-            <a:graphic>
-              <a:graphicData uri="http://schemas.openxmlformats.org/drawingml/2006/picture">
-                <pic:pic>
-                  <pic:nvPicPr>
-                    <pic:cNvPr descr="chart13_residuals.png" id="66" name="Picture"/>
-                    <pic:cNvPicPr>
-                      <a:picLocks noChangeArrowheads="1" noChangeAspect="1"/>
-                    </pic:cNvPicPr>
-                  </pic:nvPicPr>
-                  <pic:blipFill>
-                    <a:blip r:embed="rId64"/>
-                    <a:stretch>
-                      <a:fillRect/>
-                    </a:stretch>
-                  </pic:blipFill>
-                  <pic:spPr bwMode="auto">
-                    <a:xfrm>
-                      <a:off x="0" y="0"/>
-                      <a:ext cx="3931919" cy="3538727"/>
-                    </a:xfrm>
-                    <a:prstGeom prst="rect">
-                      <a:avLst/>
-                    </a:prstGeom>
-                    <a:noFill/>
-                    <a:ln w="9525">
-                      <a:noFill/>
-                      <a:headEnd/>
-                      <a:tailEnd/>
-                    </a:ln>
-                  </pic:spPr>
-                </pic:pic>
-              </a:graphicData>
-            </a:graphic>
-          </wp:inline>
-        </w:drawing>
-      </w:r>
-    </w:p>
-    <w:p>
-      <w:pPr>
-        <w:pStyle w:val="ImageCaption"/>
-      </w:pPr>
-      <w:r>
-        <w:t xml:space="preserve">Residual (predicted minus actual) vs. predicted CO2 for each model</w:t>
-      </w:r>
-    </w:p>
-    <w:p>
-      <w:pPr>
-        <w:pStyle w:val="BodyText"/>
-      </w:pPr>
-      <w:r>
-        <w:t xml:space="preserve">Predicted-vs-actual makes the R² numbers concrete: all four point clouds hug y=x below 550 ppm, then fall well short of it as actual CO2 rises past 600 ppm. The residual plots show the same effect directionally: residuals sit near zero typically but turn increasingly negative as predicted CO2 rises, rather than scattering symmetrically — a model under-responding to its most extreme inputs, consistent with the training data being dominated by the 400-550 ppm range (Section 2.3).</w:t>
       </w:r>
     </w:p>
     <w:bookmarkEnd w:id="67"/>
@@ -7781,9 +7401,6 @@
     <w:abstractNumId w:val="990"/>
   </w:num>
   <w:num w:numId="1001">
-    <w:abstractNumId w:val="991"/>
-  </w:num>
-  <w:num w:numId="1002">
     <w:abstractNumId w:val="991"/>
   </w:num>
 </w:numbering>

</xml_diff>

<commit_message>
Report: rewrite Sections 1 and 2 against the brief and rubric
Section 1: mechanical/HVAC framing with DCV, research questions RQ1-3,
criterion for a useful forecast, why it matters (energy and health),
explicit intended use, and a justified scope table.

Section 2: raw input files, time-zone and binning rules, the occupancy
definition, valid vs trained input domains, invalid/missing/unsupported
inputs (incl. reconciling 17,010 vs 17,317 rows), and all outputs with
meaning and use. Data-pipeline chart moved to Appendix A; body still
ends on page 10.
</commit_message>
<xml_diff>
--- a/docs/report/MMA3001_Project_Report.docx
+++ b/docs/report/MMA3001_Project_Report.docx
@@ -2,7 +2,7 @@
 <file path=word/document.xml><?xml version="1.0" encoding="utf-8"?>
 <w:document xmlns:w="http://schemas.openxmlformats.org/wordprocessingml/2006/main" xmlns:m="http://schemas.openxmlformats.org/officeDocument/2006/math" xmlns:r="http://schemas.openxmlformats.org/officeDocument/2006/relationships" xmlns:o="urn:schemas-microsoft-com:office:office" xmlns:v="urn:schemas-microsoft-com:vml" xmlns:w10="urn:schemas-microsoft-com:office:word" xmlns:a="http://schemas.openxmlformats.org/drawingml/2006/main" xmlns:pic="http://schemas.openxmlformats.org/drawingml/2006/picture" xmlns:wp="http://schemas.openxmlformats.org/drawingml/2006/wordprocessingDrawing">
   <w:body>
-    <w:bookmarkStart w:id="68" w:name="Xb2a4a157712687ea76caa24e9e6d630db0597d8"/>
+    <w:bookmarkStart w:id="72" w:name="Xb2a4a157712687ea76caa24e9e6d630db0597d8"/>
     <w:p>
       <w:pPr>
         <w:pStyle w:val="Heading1"/>
@@ -62,7 +62,7 @@
         </w:pict>
       </w:r>
     </w:p>
-    <w:bookmarkStart w:id="23" w:name="engineering-problem"/>
+    <w:bookmarkStart w:id="25" w:name="engineering-problem"/>
     <w:p>
       <w:pPr>
         <w:pStyle w:val="Heading2"/>
@@ -71,13 +71,13 @@
         <w:t xml:space="preserve">1. Engineering Problem</w:t>
       </w:r>
     </w:p>
-    <w:bookmarkStart w:id="20" w:name="background"/>
+    <w:bookmarkStart w:id="20" w:name="engineering-context"/>
     <w:p>
       <w:pPr>
         <w:pStyle w:val="Heading3"/>
       </w:pPr>
       <w:r>
-        <w:t xml:space="preserve">1.1 Background</w:t>
+        <w:t xml:space="preserve">1.1 Engineering Context</w:t>
       </w:r>
     </w:p>
     <w:p>
@@ -85,7 +85,7 @@
         <w:pStyle w:val="FirstParagraph"/>
       </w:pPr>
       <w:r>
-        <w:t xml:space="preserve">Indoor air quality in office buildings deteriorates primarily through the accumulation of carbon dioxide (CO₂). Human respiration releases CO₂ continuously at approximately 0.2–0.3 litres per minute per person. In an enclosed, well-mixed space, the indoor concentration evolves according to a first-order mass balance — the standard single-zone model used in ventilation engineering (Persily &amp; de Jonge, 2017):</w:t>
+        <w:t xml:space="preserve">Ventilation is a building-services task within mechanical engineering: fans and dampers in the heating, ventilation and air-conditioning (HVAC) system set the rate at which outdoor air dilutes the carbon dioxide (CO₂) that occupants exhale, at about 0.2–0.3 litres per minute per person. In a well-mixed room the concentration follows the single-zone mass balance used in ventilation engineering (Persily &amp; de Jonge, 2017):</w:t>
       </w:r>
     </w:p>
     <w:p>
@@ -214,7 +214,7 @@
         <w:t xml:space="preserve"> </w:t>
       </w:r>
       <w:r>
-        <w:t xml:space="preserve">is indoor CO₂ concentration (ppm),</w:t>
+        <w:t xml:space="preserve">is indoor CO₂ (ppm),</w:t>
       </w:r>
       <w:r>
         <w:t xml:space="preserve"> </w:t>
@@ -228,7 +228,7 @@
         <w:t xml:space="preserve"> </w:t>
       </w:r>
       <w:r>
-        <w:t xml:space="preserve">is the per-person CO₂ generation rate,</w:t>
+        <w:t xml:space="preserve">the per-person generation rate,</w:t>
       </w:r>
       <w:r>
         <w:t xml:space="preserve"> </w:t>
@@ -242,7 +242,7 @@
         <w:t xml:space="preserve"> </w:t>
       </w:r>
       <w:r>
-        <w:t xml:space="preserve">is the number of occupants,</w:t>
+        <w:t xml:space="preserve">the number of occupants,</w:t>
       </w:r>
       <w:r>
         <w:t xml:space="preserve"> </w:t>
@@ -256,7 +256,7 @@
         <w:t xml:space="preserve"> </w:t>
       </w:r>
       <w:r>
-        <w:t xml:space="preserve">is the room volume,</w:t>
+        <w:t xml:space="preserve">the room volume,</w:t>
       </w:r>
       <w:r>
         <w:t xml:space="preserve"> </w:t>
@@ -270,7 +270,7 @@
         <w:t xml:space="preserve"> </w:t>
       </w:r>
       <w:r>
-        <w:t xml:space="preserve">is the ventilation rate (air changes per hour), and</w:t>
+        <w:t xml:space="preserve">the ventilation rate (air changes per hour) and</w:t>
       </w:r>
       <w:r>
         <w:t xml:space="preserve"> </w:t>
@@ -297,21 +297,25 @@
         <w:t xml:space="preserve"> </w:t>
       </w:r>
       <w:r>
-        <w:t xml:space="preserve">is the ambient outdoor concentration (approximately 420 ppm). When occupancy is high and ventilation is insufficient,</w:t>
-      </w:r>
-      <w:r>
-        <w:t xml:space="preserve"> </w:t>
-      </w:r>
-      <m:oMath>
-        <m:r>
-          <m:t>C</m:t>
-        </m:r>
-      </m:oMath>
-      <w:r>
-        <w:t xml:space="preserve"> </w:t>
-      </w:r>
-      <w:r>
-        <w:t xml:space="preserve">rises. When the HVAC system increases</w:t>
+        <w:t xml:space="preserve">the outdoor concentration (about 420 ppm). CO₂ is therefore the standard control variable for demand-controlled ventilation (DCV), which sets outdoor airflow from measured CO₂ instead of a fixed design rate (Emmerich &amp; Persily, 2001; ASHRAE, 2022a).</w:t>
+      </w:r>
+    </w:p>
+    <w:bookmarkEnd w:id="20"/>
+    <w:bookmarkStart w:id="21" w:name="the-problem-being-addressed"/>
+    <w:p>
+      <w:pPr>
+        <w:pStyle w:val="Heading3"/>
+      </w:pPr>
+      <w:r>
+        <w:t xml:space="preserve">1.2 The Problem Being Addressed</w:t>
+      </w:r>
+    </w:p>
+    <w:p>
+      <w:pPr>
+        <w:pStyle w:val="FirstParagraph"/>
+      </w:pPr>
+      <w:r>
+        <w:t xml:space="preserve">DCV reacts to the current reading: by the time CO₂ crosses its setpoint the air is already stale, and with a typical</w:t>
       </w:r>
       <w:r>
         <w:t xml:space="preserve"> </w:t>
@@ -322,94 +326,160 @@
         </m:r>
       </m:oMath>
       <w:r>
-        <w:t xml:space="preserve">,</w:t>
+        <w:t xml:space="preserve"> </w:t>
+      </w:r>
+      <w:r>
+        <w:t xml:space="preserve">of about 2 air changes per hour the room’s time constant</w:t>
       </w:r>
       <w:r>
         <w:t xml:space="preserve"> </w:t>
       </w:r>
       <m:oMath>
         <m:r>
-          <m:t>C</m:t>
+          <m:t>1</m:t>
+        </m:r>
+        <m:r>
+          <m:rPr>
+            <m:sty m:val="p"/>
+          </m:rPr>
+          <m:t>/</m:t>
+        </m:r>
+        <m:r>
+          <m:t>λ</m:t>
         </m:r>
       </m:oMath>
       <w:r>
         <w:t xml:space="preserve"> </w:t>
       </w:r>
       <w:r>
-        <w:t xml:space="preserve">falls.</w:t>
-      </w:r>
-    </w:p>
-    <w:p>
-      <w:pPr>
-        <w:pStyle w:val="BodyText"/>
-      </w:pPr>
-      <w:r>
-        <w:t xml:space="preserve">CO₂ concentration is therefore a direct, measurable proxy for both occupancy load and ventilation adequacy. A commonly used guideline, derived from earlier ASHRAE ventilation guidance, treats sustained indoor CO₂ above about 1000 ppm (roughly 700 ppm above outdoor levels) as a sign of inadequate ventilation. Satish et al. (2012) measured reductions in decision-making performance at 1000 ppm and larger effects at 2500 ppm, although later studies have not all replicated the effect.</w:t>
-      </w:r>
-    </w:p>
-    <w:bookmarkEnd w:id="20"/>
-    <w:bookmarkStart w:id="21" w:name="the-problem-being-solved"/>
-    <w:p>
-      <w:pPr>
-        <w:pStyle w:val="Heading3"/>
-      </w:pPr>
-      <w:r>
-        <w:t xml:space="preserve">1.2 The Problem Being Solved</w:t>
-      </w:r>
-    </w:p>
-    <w:p>
-      <w:pPr>
-        <w:pStyle w:val="FirstParagraph"/>
-      </w:pPr>
-      <w:r>
-        <w:t xml:space="preserve">Most building management systems control ventilation reactively: when CO₂ exceeds a threshold, ventilation increases. By then occupants are already breathing degraded air, and fans tend to overshoot to full capacity, using more energy than a smooth, anticipatory response.</w:t>
-      </w:r>
-    </w:p>
-    <w:p>
-      <w:pPr>
-        <w:pStyle w:val="BodyText"/>
-      </w:pPr>
-      <w:r>
-        <w:t xml:space="preserve">This project addresses the question:</w:t>
-      </w:r>
-      <w:r>
-        <w:t xml:space="preserve"> </w:t>
-      </w:r>
+        <w:t xml:space="preserve">is about 30 minutes, so extra ventilation takes tens of minutes to act. A short-term forecast lets the system act before the setpoint is crossed. The dataset brief lists both</w:t>
+      </w:r>
+      <w:r>
+        <w:t xml:space="preserve"> </w:t>
+      </w:r>
+      <w:r>
+        <w:t xml:space="preserve">“</w:t>
+      </w:r>
+      <w:r>
+        <w:t xml:space="preserve">evaluating whether the available measurements support decisions about comfort or energy use</w:t>
+      </w:r>
+      <w:r>
+        <w:t xml:space="preserve">”</w:t>
+      </w:r>
+      <w:r>
+        <w:t xml:space="preserve"> </w:t>
+      </w:r>
+      <w:r>
+        <w:t xml:space="preserve">and auditing</w:t>
+      </w:r>
+      <w:r>
+        <w:t xml:space="preserve"> </w:t>
+      </w:r>
+      <w:r>
+        <w:t xml:space="preserve">“</w:t>
+      </w:r>
+      <w:r>
+        <w:t xml:space="preserve">potentially unreliable observations</w:t>
+      </w:r>
+      <w:r>
+        <w:t xml:space="preserve">”</w:t>
+      </w:r>
+      <w:r>
+        <w:t xml:space="preserve">; this project does both. It is a supervised regression problem with three research questions:</w:t>
+      </w:r>
+    </w:p>
+    <w:p>
+      <w:pPr>
+        <w:numPr>
+          <w:ilvl w:val="0"/>
+          <w:numId w:val="1001"/>
+        </w:numPr>
+        <w:pStyle w:val="Compact"/>
+      </w:pPr>
       <w:r>
         <w:rPr>
           <w:bCs/>
           <w:b/>
         </w:rPr>
-        <w:t xml:space="preserve">can CO₂ concentration 15 minutes from now be predicted accurately from current sensor readings and building state?</w:t>
-      </w:r>
-      <w:r>
-        <w:t xml:space="preserve"> </w:t>
-      </w:r>
-      <w:r>
-        <w:t xml:space="preserve">A 15-minute forecast gives a building management system time to raise ventilation before a threshold is crossed. This is a</w:t>
-      </w:r>
-      <w:r>
-        <w:t xml:space="preserve"> </w:t>
-      </w:r>
+        <w:t xml:space="preserve">RQ1.</w:t>
+      </w:r>
+      <w:r>
+        <w:t xml:space="preserve"> </w:t>
+      </w:r>
+      <w:r>
+        <w:t xml:space="preserve">Can CO₂ 15 minutes ahead be forecast from recent sensor history and time of day, and which of the four Week 5 regression methods does it best?</w:t>
+      </w:r>
+    </w:p>
+    <w:p>
+      <w:pPr>
+        <w:numPr>
+          <w:ilvl w:val="0"/>
+          <w:numId w:val="1001"/>
+        </w:numPr>
+        <w:pStyle w:val="Compact"/>
+      </w:pPr>
       <w:r>
         <w:rPr>
           <w:bCs/>
           <w:b/>
         </w:rPr>
-        <w:t xml:space="preserve">supervised regression problem</w:t>
-      </w:r>
-      <w:r>
-        <w:t xml:space="preserve">: a function is learned from current measurements and engineered time features to one predicted CO₂ value. The four Week 5 regression methods are compared, and the value of building occupancy data is tested explicitly.</w:t>
+        <w:t xml:space="preserve">RQ2.</w:t>
+      </w:r>
+      <w:r>
+        <w:t xml:space="preserve"> </w:t>
+      </w:r>
+      <w:r>
+        <w:t xml:space="preserve">Does building occupancy data improve that forecast?</w:t>
+      </w:r>
+    </w:p>
+    <w:p>
+      <w:pPr>
+        <w:numPr>
+          <w:ilvl w:val="0"/>
+          <w:numId w:val="1001"/>
+        </w:numPr>
+        <w:pStyle w:val="Compact"/>
+      </w:pPr>
+      <w:r>
+        <w:rPr>
+          <w:bCs/>
+          <w:b/>
+        </w:rPr>
+        <w:t xml:space="preserve">RQ3.</w:t>
+      </w:r>
+      <w:r>
+        <w:t xml:space="preserve"> </w:t>
+      </w:r>
+      <w:r>
+        <w:t xml:space="preserve">Does adding a second sensor’s data help, and does a model trained in one room transfer to another?</w:t>
+      </w:r>
+    </w:p>
+    <w:p>
+      <w:pPr>
+        <w:pStyle w:val="FirstParagraph"/>
+      </w:pPr>
+      <w:r>
+        <w:rPr>
+          <w:bCs/>
+          <w:b/>
+        </w:rPr>
+        <w:t xml:space="preserve">Criterion for a useful forecast:</w:t>
+      </w:r>
+      <w:r>
+        <w:t xml:space="preserve"> </w:t>
+      </w:r>
+      <w:r>
+        <w:t xml:space="preserve">on a held-out later period, a model must beat the persistence forecast (next value equals current value), and its mean absolute error must be well below the 50 ppm margin used for an early-warning trigger (Section 2.5).</w:t>
       </w:r>
     </w:p>
     <w:bookmarkEnd w:id="21"/>
-    <w:bookmarkStart w:id="22" w:name="scope"/>
+    <w:bookmarkStart w:id="22" w:name="why-it-matters"/>
     <w:p>
       <w:pPr>
         <w:pStyle w:val="Heading3"/>
       </w:pPr>
       <w:r>
-        <w:t xml:space="preserve">1.3 Scope</w:t>
+        <w:t xml:space="preserve">1.3 Why It Matters</w:t>
       </w:r>
     </w:p>
     <w:p>
@@ -417,142 +487,223 @@
         <w:pStyle w:val="FirstParagraph"/>
       </w:pPr>
       <w:r>
-        <w:t xml:space="preserve">The main analysis uses environmental sensor</w:t>
-      </w:r>
-      <w:r>
-        <w:t xml:space="preserve"> </w:t>
-      </w:r>
-      <w:r>
-        <w:rPr>
-          <w:rStyle w:val="VerbatimChar"/>
-        </w:rPr>
-        <w:t xml:space="preserve">6012002000326</w:t>
-      </w:r>
-      <w:r>
-        <w:t xml:space="preserve">, which has the longest record of genuine readings but no documented room (Section 6), limiting how well occupancy can be linked to it. Section 4.2 extends the analysis to every sensor’s usable intervals, adding sensor</w:t>
-      </w:r>
-      <w:r>
-        <w:t xml:space="preserve"> </w:t>
-      </w:r>
-      <w:r>
-        <w:rPr>
-          <w:rStyle w:val="VerbatimChar"/>
-        </w:rPr>
-        <w:t xml:space="preserve">6012002000869</w:t>
-      </w:r>
-      <w:r>
-        <w:t xml:space="preserve"> </w:t>
-      </w:r>
-      <w:r>
-        <w:t xml:space="preserve">to test whether pooling sensors helps and whether a model transfers between rooms.</w:t>
-      </w:r>
-    </w:p>
-    <w:p>
-      <w:r>
-        <w:pict>
-          <v:rect style="width:0;height:1.5pt" o:hralign="center" o:hrstd="t" o:hr="t"/>
-        </w:pict>
+        <w:t xml:space="preserve">HVAC accounts for roughly half of the energy used in buildings (Pérez-Lombard et al., 2008), so supplying more outdoor air than needed wastes fan and conditioning energy, while supplying too little degrades air quality. A common guideline, derived from earlier ASHRAE guidance, treats sustained CO₂ above about 1000 ppm as a sign of inadequate ventilation (ASHRAE, 2022b), and Satish et al. (2012) measured lower decision-making performance at 1000 ppm, although later studies have not all replicated the effect.</w:t>
       </w:r>
     </w:p>
     <w:bookmarkEnd w:id="22"/>
+    <w:bookmarkStart w:id="23" w:name="intended-use"/>
+    <w:p>
+      <w:pPr>
+        <w:pStyle w:val="Heading3"/>
+      </w:pPr>
+      <w:r>
+        <w:t xml:space="preserve">1.4 Intended Use</w:t>
+      </w:r>
+    </w:p>
+    <w:p>
+      <w:pPr>
+        <w:pStyle w:val="FirstParagraph"/>
+      </w:pPr>
+      <w:r>
+        <w:t xml:space="preserve">The forecaster is an advisory input to a building management system (BMS) or a facilities engineer. Every 15 minutes it takes the last hour of one room’s CO₂ readings, the zone occupancy and the time, and returns the predicted CO₂ for the next 15 minutes; the BMS decides whether to raise outdoor airflow, and its own reactive setpoint stays in place as the safeguard, so the forecast is not safety-critical. Section 4 shows the models track the trend closely but under-predict sharp peaks, so the forecast is suited to early, gradual ventilation increases, not to replacing a peak alarm. A model must be trained for each room (RQ3, Section 4.2).</w:t>
+      </w:r>
+    </w:p>
     <w:bookmarkEnd w:id="23"/>
-    <w:bookmarkStart w:id="31" w:name="inputs-and-outputs"/>
-    <w:p>
-      <w:pPr>
-        <w:pStyle w:val="Heading2"/>
-      </w:pPr>
-      <w:r>
-        <w:t xml:space="preserve">2. Inputs and Outputs</w:t>
-      </w:r>
-    </w:p>
-    <w:bookmarkStart w:id="24" w:name="problem-formulation"/>
+    <w:bookmarkStart w:id="24" w:name="scope-and-its-justification"/>
     <w:p>
       <w:pPr>
         <w:pStyle w:val="Heading3"/>
       </w:pPr>
       <w:r>
-        <w:t xml:space="preserve">2.1 Problem Formulation</w:t>
-      </w:r>
-    </w:p>
-    <w:p>
-      <w:pPr>
-        <w:pStyle w:val="FirstParagraph"/>
-      </w:pPr>
-      <w:r>
-        <w:t xml:space="preserve">The prediction task can be stated formally as: learn a function</w:t>
-      </w:r>
-      <w:r>
-        <w:t xml:space="preserve"> </w:t>
-      </w:r>
-      <m:oMath>
-        <m:r>
-          <m:t>f</m:t>
-        </m:r>
-      </m:oMath>
-      <w:r>
-        <w:t xml:space="preserve"> </w:t>
-      </w:r>
-      <w:r>
-        <w:t xml:space="preserve">such that</w:t>
-      </w:r>
-    </w:p>
-    <w:p>
-      <w:pPr>
-        <w:pStyle w:val="BodyText"/>
-      </w:pPr>
-      <m:oMathPara>
-        <m:oMathParaPr>
-          <m:jc m:val="center"/>
-        </m:oMathParaPr>
-        <m:oMath>
-          <m:sSub>
-            <m:e>
-              <m:acc>
-                <m:accPr>
-                  <m:chr m:val="̂"/>
-                </m:accPr>
-                <m:e>
-                  <m:r>
-                    <m:t>C</m:t>
-                  </m:r>
-                </m:e>
-              </m:acc>
-            </m:e>
-            <m:sub>
+        <w:t xml:space="preserve">1.5 Scope and Its Justification</w:t>
+      </w:r>
+    </w:p>
+    <w:tbl>
+      <w:tblPr>
+        <w:tblStyle w:val="Table"/>
+        <w:tblW w:type="pct" w:w="5000"/>
+        <w:tblLook w:firstRow="1" w:lastRow="0" w:firstColumn="0" w:lastColumn="0" w:noHBand="0" w:noVBand="0" w:val="0020"/>
+        <w:jc w:val="start"/>
+      </w:tblPr>
+      <w:tblGrid>
+        <w:gridCol w:w="2813"/>
+        <w:gridCol w:w="5106"/>
+      </w:tblGrid>
+      <w:tr>
+        <w:trPr>
+          <w:tblHeader w:val="true"/>
+        </w:trPr>
+        <w:tc>
+          <w:tcPr/>
+          <w:p>
+            <w:pPr>
+              <w:pStyle w:val="Compact"/>
+              <w:jc w:val="left"/>
+            </w:pPr>
+            <w:r>
+              <w:t xml:space="preserve">Scope decision</w:t>
+            </w:r>
+          </w:p>
+        </w:tc>
+        <w:tc>
+          <w:tcPr/>
+          <w:p>
+            <w:pPr>
+              <w:pStyle w:val="Compact"/>
+              <w:jc w:val="left"/>
+            </w:pPr>
+            <w:r>
+              <w:t xml:space="preserve">Justification</w:t>
+            </w:r>
+          </w:p>
+        </w:tc>
+      </w:tr>
+      <w:tr>
+        <w:tc>
+          <w:tcPr/>
+          <w:p>
+            <w:pPr>
+              <w:pStyle w:val="Compact"/>
+              <w:jc w:val="left"/>
+            </w:pPr>
+            <w:r>
+              <w:t xml:space="preserve">Main analysis on sensor</w:t>
+            </w:r>
+            <w:r>
+              <w:t xml:space="preserve"> </w:t>
+            </w:r>
+            <w:r>
+              <w:rPr>
+                <w:rStyle w:val="VerbatimChar"/>
+              </w:rPr>
+              <w:t xml:space="preserve">6012002000326</w:t>
+            </w:r>
+            <w:r>
+              <w:t xml:space="preserve">;</w:t>
+            </w:r>
+            <w:r>
+              <w:t xml:space="preserve"> </w:t>
+            </w:r>
+            <w:r>
+              <w:rPr>
+                <w:rStyle w:val="VerbatimChar"/>
+              </w:rPr>
+              <w:t xml:space="preserve">6012002000869</w:t>
+            </w:r>
+            <w:r>
+              <w:t xml:space="preserve"> </w:t>
+            </w:r>
+            <w:r>
+              <w:t xml:space="preserve">added for RQ3</w:t>
+            </w:r>
+          </w:p>
+        </w:tc>
+        <w:tc>
+          <w:tcPr/>
+          <w:p>
+            <w:pPr>
+              <w:pStyle w:val="Compact"/>
+              <w:jc w:val="left"/>
+            </w:pPr>
+            <w:r>
+              <w:t xml:space="preserve">0326 has the longest record of genuine readings; three of the five sensors contain none (Section 4.2)</w:t>
+            </w:r>
+          </w:p>
+        </w:tc>
+      </w:tr>
+      <w:tr>
+        <w:tc>
+          <w:tcPr/>
+          <w:p>
+            <w:pPr>
+              <w:pStyle w:val="Compact"/>
+              <w:jc w:val="left"/>
+            </w:pPr>
+            <w:r>
+              <w:t xml:space="preserve">One forecast horizon, 15 minutes</w:t>
+            </w:r>
+          </w:p>
+        </w:tc>
+        <w:tc>
+          <w:tcPr/>
+          <w:p>
+            <w:pPr>
+              <w:pStyle w:val="Compact"/>
+              <w:jc w:val="left"/>
+            </w:pPr>
+            <w:r>
+              <w:t xml:space="preserve">Matches the 15-minute reporting interval and is about half the room time constant: long enough to act on, short enough to predict from history</w:t>
+            </w:r>
+          </w:p>
+        </w:tc>
+      </w:tr>
+      <w:tr>
+        <w:tc>
+          <w:tcPr/>
+          <w:p>
+            <w:pPr>
+              <w:pStyle w:val="Compact"/>
+              <w:jc w:val="left"/>
+            </w:pPr>
+            <w:r>
+              <w:t xml:space="preserve">The four Week 5 regression methods; no ARIMA or recurrent networks</w:t>
+            </w:r>
+          </w:p>
+        </w:tc>
+        <w:tc>
+          <w:tcPr/>
+          <w:p>
+            <w:pPr>
+              <w:pStyle w:val="Compact"/>
+              <w:jc w:val="left"/>
+            </w:pPr>
+            <w:r>
+              <w:t xml:space="preserve">The unit’s methods, compared on equal terms; the lag and rolling features already give them the autoregressive structure of the mass balance</w:t>
+            </w:r>
+          </w:p>
+        </w:tc>
+      </w:tr>
+      <w:tr>
+        <w:tc>
+          <w:tcPr/>
+          <w:p>
+            <w:pPr>
+              <w:pStyle w:val="Compact"/>
+              <w:jc w:val="left"/>
+            </w:pPr>
+            <w:r>
+              <w:t xml:space="preserve">No ventilation-rate or outdoor CO₂ inputs</w:t>
+            </w:r>
+          </w:p>
+        </w:tc>
+        <w:tc>
+          <w:tcPr/>
+          <w:p>
+            <w:pPr>
+              <w:pStyle w:val="Compact"/>
+              <w:jc w:val="left"/>
+            </w:pPr>
+            <w:r>
+              <w:t xml:space="preserve">Not in the dataset, so</w:t>
+            </w:r>
+            <w:r>
+              <w:t xml:space="preserve"> </w:t>
+            </w:r>
+            <m:oMath>
               <m:r>
-                <m:t>t</m:t>
+                <m:t>λ</m:t>
               </m:r>
-              <m:r>
-                <m:rPr>
-                  <m:sty m:val="p"/>
-                </m:rPr>
-                <m:t>+</m:t>
-              </m:r>
-              <m:r>
-                <m:t>1</m:t>
-              </m:r>
-            </m:sub>
-          </m:sSub>
-          <m:r>
-            <m:rPr>
-              <m:sty m:val="p"/>
-            </m:rPr>
-            <m:t>=</m:t>
-          </m:r>
-          <m:r>
-            <m:t>f</m:t>
-          </m:r>
-          <m:r>
-            <m:t>​</m:t>
-          </m:r>
-          <m:d>
-            <m:dPr>
-              <m:begChr m:val="("/>
-              <m:endChr m:val=")"/>
-              <m:sepChr m:val=""/>
-              <m:grow/>
-            </m:dPr>
-            <m:e>
+            </m:oMath>
+            <w:r>
+              <w:t xml:space="preserve"> </w:t>
+            </w:r>
+            <w:r>
+              <w:t xml:space="preserve">and</w:t>
+            </w:r>
+            <w:r>
+              <w:t xml:space="preserve"> </w:t>
+            </w:r>
+            <m:oMath>
               <m:sSub>
                 <m:e>
                   <m:r>
@@ -561,295 +712,610 @@
                 </m:e>
                 <m:sub>
                   <m:r>
-                    <m:t>t</m:t>
-                  </m:r>
-                </m:sub>
-              </m:sSub>
-              <m:r>
-                <m:rPr>
-                  <m:sty m:val="p"/>
-                </m:rPr>
-                <m:t>,</m:t>
-              </m:r>
-              <m:r>
-                <m:t> </m:t>
-              </m:r>
-              <m:sSub>
-                <m:e>
-                  <m:r>
-                    <m:t>C</m:t>
-                  </m:r>
-                </m:e>
-                <m:sub>
-                  <m:r>
-                    <m:t>t</m:t>
-                  </m:r>
-                  <m:r>
-                    <m:rPr>
-                      <m:sty m:val="p"/>
-                    </m:rPr>
-                    <m:t>−</m:t>
-                  </m:r>
-                  <m:r>
-                    <m:t>1</m:t>
-                  </m:r>
-                </m:sub>
-              </m:sSub>
-              <m:r>
-                <m:rPr>
-                  <m:sty m:val="p"/>
-                </m:rPr>
-                <m:t>,</m:t>
-              </m:r>
-              <m:r>
-                <m:t> </m:t>
-              </m:r>
-              <m:sSub>
-                <m:e>
-                  <m:acc>
-                    <m:accPr>
-                      <m:chr m:val="‾"/>
-                    </m:accPr>
-                    <m:e>
-                      <m:r>
-                        <m:t>C</m:t>
-                      </m:r>
-                    </m:e>
-                  </m:acc>
-                </m:e>
-                <m:sub>
-                  <m:r>
-                    <m:t>t</m:t>
-                  </m:r>
-                  <m:r>
-                    <m:rPr>
-                      <m:sty m:val="p"/>
-                    </m:rPr>
-                    <m:t>−</m:t>
-                  </m:r>
-                  <m:r>
-                    <m:t>1</m:t>
-                  </m:r>
-                  <m:r>
                     <m:rPr>
                       <m:nor/>
                       <m:sty m:val="p"/>
                     </m:rPr>
-                    <m:t>h</m:t>
+                    <m:t>out</m:t>
                   </m:r>
                 </m:sub>
               </m:sSub>
-              <m:r>
-                <m:rPr>
-                  <m:sty m:val="p"/>
-                </m:rPr>
-                <m:t>,</m:t>
-              </m:r>
-              <m:r>
-                <m:t> </m:t>
-              </m:r>
-              <m:sSub>
-                <m:e>
-                  <m:r>
-                    <m:t>O</m:t>
-                  </m:r>
-                </m:e>
-                <m:sub>
-                  <m:r>
-                    <m:t>t</m:t>
-                  </m:r>
-                </m:sub>
-              </m:sSub>
-              <m:r>
-                <m:rPr>
-                  <m:sty m:val="p"/>
-                </m:rPr>
-                <m:t>,</m:t>
-              </m:r>
-              <m:r>
-                <m:t> </m:t>
-              </m:r>
-              <m:sSub>
-                <m:e>
-                  <m:r>
-                    <m:t>τ</m:t>
-                  </m:r>
-                </m:e>
-                <m:sub>
-                  <m:r>
-                    <m:t>t</m:t>
-                  </m:r>
-                </m:sub>
-              </m:sSub>
-            </m:e>
-          </m:d>
-        </m:oMath>
-      </m:oMathPara>
+            </m:oMath>
+            <w:r>
+              <w:t xml:space="preserve"> </w:t>
+            </w:r>
+            <w:r>
+              <w:t xml:space="preserve">cannot be modelled directly; the mass balance motivates the features instead</w:t>
+            </w:r>
+          </w:p>
+        </w:tc>
+      </w:tr>
+      <w:tr>
+        <w:tc>
+          <w:tcPr/>
+          <w:p>
+            <w:pPr>
+              <w:pStyle w:val="Compact"/>
+              <w:jc w:val="left"/>
+            </w:pPr>
+            <w:r>
+              <w:t xml:space="preserve">One building; no closed-loop control simulation</w:t>
+            </w:r>
+          </w:p>
+        </w:tc>
+        <w:tc>
+          <w:tcPr/>
+          <w:p>
+            <w:pPr>
+              <w:pStyle w:val="Compact"/>
+              <w:jc w:val="left"/>
+            </w:pPr>
+            <w:r>
+              <w:t xml:space="preserve">The dataset covers one site, and simulating fan control needs an HVAC model that is not available; the project evaluates forecast quality only</w:t>
+            </w:r>
+          </w:p>
+        </w:tc>
+      </w:tr>
+    </w:tbl>
+    <w:p>
+      <w:r>
+        <w:pict>
+          <v:rect style="width:0;height:1.5pt" o:hralign="center" o:hrstd="t" o:hr="t"/>
+        </w:pict>
+      </w:r>
+    </w:p>
+    <w:bookmarkEnd w:id="24"/>
+    <w:bookmarkEnd w:id="25"/>
+    <w:bookmarkStart w:id="31" w:name="inputs-and-outputs"/>
+    <w:p>
+      <w:pPr>
+        <w:pStyle w:val="Heading2"/>
+      </w:pPr>
+      <w:r>
+        <w:t xml:space="preserve">2. Inputs and Outputs</w:t>
+      </w:r>
+    </w:p>
+    <w:bookmarkStart w:id="26" w:name="top-level-inputs"/>
+    <w:p>
+      <w:pPr>
+        <w:pStyle w:val="Heading3"/>
+      </w:pPr>
+      <w:r>
+        <w:t xml:space="preserve">2.1 Top-Level Inputs</w:t>
+      </w:r>
+    </w:p>
+    <w:tbl>
+      <w:tblPr>
+        <w:tblStyle w:val="Table"/>
+        <w:tblW w:type="pct" w:w="5000"/>
+        <w:tblLook w:firstRow="1" w:lastRow="0" w:firstColumn="0" w:lastColumn="0" w:noHBand="0" w:noVBand="0" w:val="0020"/>
+        <w:jc w:val="start"/>
+      </w:tblPr>
+      <w:tblGrid>
+        <w:gridCol w:w="1782"/>
+        <w:gridCol w:w="1782"/>
+        <w:gridCol w:w="2574"/>
+        <w:gridCol w:w="1782"/>
+      </w:tblGrid>
+      <w:tr>
+        <w:trPr>
+          <w:tblHeader w:val="true"/>
+        </w:trPr>
+        <w:tc>
+          <w:tcPr/>
+          <w:p>
+            <w:pPr>
+              <w:pStyle w:val="Compact"/>
+              <w:jc w:val="left"/>
+            </w:pPr>
+            <w:r>
+              <w:t xml:space="preserve">Input file</w:t>
+            </w:r>
+          </w:p>
+        </w:tc>
+        <w:tc>
+          <w:tcPr/>
+          <w:p>
+            <w:pPr>
+              <w:pStyle w:val="Compact"/>
+              <w:jc w:val="left"/>
+            </w:pPr>
+            <w:r>
+              <w:t xml:space="preserve">Format</w:t>
+            </w:r>
+          </w:p>
+        </w:tc>
+        <w:tc>
+          <w:tcPr/>
+          <w:p>
+            <w:pPr>
+              <w:pStyle w:val="Compact"/>
+              <w:jc w:val="left"/>
+            </w:pPr>
+            <w:r>
+              <w:t xml:space="preserve">Content used</w:t>
+            </w:r>
+          </w:p>
+        </w:tc>
+        <w:tc>
+          <w:tcPr/>
+          <w:p>
+            <w:pPr>
+              <w:pStyle w:val="Compact"/>
+              <w:jc w:val="left"/>
+            </w:pPr>
+            <w:r>
+              <w:t xml:space="preserve">Sampling and period</w:t>
+            </w:r>
+          </w:p>
+        </w:tc>
+      </w:tr>
+      <w:tr>
+        <w:tc>
+          <w:tcPr/>
+          <w:p>
+            <w:pPr>
+              <w:pStyle w:val="Compact"/>
+              <w:jc w:val="left"/>
+            </w:pPr>
+            <w:r>
+              <w:t xml:space="preserve">Environmental sensor log (</w:t>
+            </w:r>
+            <w:r>
+              <w:rPr>
+                <w:rStyle w:val="VerbatimChar"/>
+              </w:rPr>
+              <w:t xml:space="preserve">5EnvSensor_…csv</w:t>
+            </w:r>
+            <w:r>
+              <w:t xml:space="preserve">, 337 MB)</w:t>
+            </w:r>
+          </w:p>
+        </w:tc>
+        <w:tc>
+          <w:tcPr/>
+          <w:p>
+            <w:pPr>
+              <w:pStyle w:val="Compact"/>
+              <w:jc w:val="left"/>
+            </w:pPr>
+            <w:r>
+              <w:t xml:space="preserve">CSV; a</w:t>
+            </w:r>
+            <w:r>
+              <w:t xml:space="preserve"> </w:t>
+            </w:r>
+            <w:r>
+              <w:rPr>
+                <w:rStyle w:val="VerbatimChar"/>
+              </w:rPr>
+              <w:t xml:space="preserve">jsondata</w:t>
+            </w:r>
+            <w:r>
+              <w:t xml:space="preserve"> </w:t>
+            </w:r>
+            <w:r>
+              <w:t xml:space="preserve">column holds a JSON array of variables, each with a Unix-epoch</w:t>
+            </w:r>
+            <w:r>
+              <w:t xml:space="preserve"> </w:t>
+            </w:r>
+            <w:r>
+              <w:rPr>
+                <w:rStyle w:val="VerbatimChar"/>
+              </w:rPr>
+              <w:t xml:space="preserve">time</w:t>
+            </w:r>
+            <w:r>
+              <w:t xml:space="preserve"> </w:t>
+            </w:r>
+            <w:r>
+              <w:t xml:space="preserve">and</w:t>
+            </w:r>
+            <w:r>
+              <w:t xml:space="preserve"> </w:t>
+            </w:r>
+            <w:r>
+              <w:rPr>
+                <w:rStyle w:val="VerbatimChar"/>
+              </w:rPr>
+              <w:t xml:space="preserve">value</w:t>
+            </w:r>
+          </w:p>
+        </w:tc>
+        <w:tc>
+          <w:tcPr/>
+          <w:p>
+            <w:pPr>
+              <w:pStyle w:val="Compact"/>
+              <w:jc w:val="left"/>
+            </w:pPr>
+            <w:r>
+              <w:t xml:space="preserve">CO₂ (ppm), temperature (°C), relative humidity (%) for 5 sensors;</w:t>
+            </w:r>
+            <w:r>
+              <w:t xml:space="preserve"> </w:t>
+            </w:r>
+            <w:r>
+              <w:rPr>
+                <w:rStyle w:val="VerbatimChar"/>
+              </w:rPr>
+              <w:t xml:space="preserve">createdate</w:t>
+            </w:r>
+            <w:r>
+              <w:t xml:space="preserve"> </w:t>
+            </w:r>
+            <w:r>
+              <w:t xml:space="preserve">(server receive time)</w:t>
+            </w:r>
+          </w:p>
+        </w:tc>
+        <w:tc>
+          <w:tcPr/>
+          <w:p>
+            <w:pPr>
+              <w:pStyle w:val="Compact"/>
+              <w:jc w:val="left"/>
+            </w:pPr>
+            <w:r>
+              <w:t xml:space="preserve">Every 15 min when working; genuine readings Feb–Jun 2024 (0869) and Sep 2025–Apr 2026 (0326)</w:t>
+            </w:r>
+          </w:p>
+        </w:tc>
+      </w:tr>
+      <w:tr>
+        <w:tc>
+          <w:tcPr/>
+          <w:p>
+            <w:pPr>
+              <w:pStyle w:val="Compact"/>
+              <w:jc w:val="left"/>
+            </w:pPr>
+            <w:r>
+              <w:t xml:space="preserve">Occupancy event log (</w:t>
+            </w:r>
+            <w:r>
+              <w:rPr>
+                <w:rStyle w:val="VerbatimChar"/>
+              </w:rPr>
+              <w:t xml:space="preserve">5occupancySensor_…csv</w:t>
+            </w:r>
+            <w:r>
+              <w:t xml:space="preserve">, 1.5 GB)</w:t>
+            </w:r>
+          </w:p>
+        </w:tc>
+        <w:tc>
+          <w:tcPr/>
+          <w:p>
+            <w:pPr>
+              <w:pStyle w:val="Compact"/>
+              <w:jc w:val="left"/>
+            </w:pPr>
+            <w:r>
+              <w:t xml:space="preserve">CSV; one row per change of state</w:t>
+            </w:r>
+          </w:p>
+        </w:tc>
+        <w:tc>
+          <w:tcPr/>
+          <w:p>
+            <w:pPr>
+              <w:pStyle w:val="Compact"/>
+              <w:jc w:val="left"/>
+            </w:pPr>
+            <w:r>
+              <w:rPr>
+                <w:rStyle w:val="VerbatimChar"/>
+              </w:rPr>
+              <w:t xml:space="preserve">floorspaceid</w:t>
+            </w:r>
+            <w:r>
+              <w:t xml:space="preserve"> </w:t>
+            </w:r>
+            <w:r>
+              <w:t xml:space="preserve">(zone);</w:t>
+            </w:r>
+            <w:r>
+              <w:t xml:space="preserve"> </w:t>
+            </w:r>
+            <w:r>
+              <w:rPr>
+                <w:rStyle w:val="VerbatimChar"/>
+              </w:rPr>
+              <w:t xml:space="preserve">occupancystatus</w:t>
+            </w:r>
+            <w:r>
+              <w:t xml:space="preserve">: CurrentlyOccupied, RecentlyOccupied or NotOccupied;</w:t>
+            </w:r>
+            <w:r>
+              <w:t xml:space="preserve"> </w:t>
+            </w:r>
+            <w:r>
+              <w:rPr>
+                <w:rStyle w:val="VerbatimChar"/>
+              </w:rPr>
+              <w:t xml:space="preserve">collecteddate</w:t>
+            </w:r>
+          </w:p>
+        </w:tc>
+        <w:tc>
+          <w:tcPr/>
+          <w:p>
+            <w:pPr>
+              <w:pStyle w:val="Compact"/>
+              <w:jc w:val="left"/>
+            </w:pPr>
+            <w:r>
+              <w:t xml:space="preserve">Irregular (event-driven); 5 zones, Nov 2023–Apr 2026</w:t>
+            </w:r>
+          </w:p>
+        </w:tc>
+      </w:tr>
+      <w:tr>
+        <w:tc>
+          <w:tcPr/>
+          <w:p>
+            <w:pPr>
+              <w:pStyle w:val="Compact"/>
+              <w:jc w:val="left"/>
+            </w:pPr>
+            <w:r>
+              <w:t xml:space="preserve">Sensor ID and Locations (</w:t>
+            </w:r>
+            <w:r>
+              <w:rPr>
+                <w:rStyle w:val="VerbatimChar"/>
+              </w:rPr>
+              <w:t xml:space="preserve">.xlsx</w:t>
+            </w:r>
+            <w:r>
+              <w:t xml:space="preserve">)</w:t>
+            </w:r>
+          </w:p>
+        </w:tc>
+        <w:tc>
+          <w:tcPr/>
+          <w:p>
+            <w:pPr>
+              <w:pStyle w:val="Compact"/>
+              <w:jc w:val="left"/>
+            </w:pPr>
+            <w:r>
+              <w:t xml:space="preserve">Lookup table</w:t>
+            </w:r>
+          </w:p>
+        </w:tc>
+        <w:tc>
+          <w:tcPr/>
+          <w:p>
+            <w:pPr>
+              <w:pStyle w:val="Compact"/>
+              <w:jc w:val="left"/>
+            </w:pPr>
+            <w:r>
+              <w:t xml:space="preserve">Room of each device</w:t>
+            </w:r>
+          </w:p>
+        </w:tc>
+        <w:tc>
+          <w:tcPr/>
+          <w:p>
+            <w:pPr>
+              <w:pStyle w:val="Compact"/>
+              <w:jc w:val="left"/>
+            </w:pPr>
+            <w:r>
+              <w:t xml:space="preserve">Sensor 0326 is not listed</w:t>
+            </w:r>
+          </w:p>
+        </w:tc>
+      </w:tr>
+      <w:tr>
+        <w:tc>
+          <w:tcPr/>
+          <w:p>
+            <w:pPr>
+              <w:pStyle w:val="Compact"/>
+              <w:jc w:val="left"/>
+            </w:pPr>
+            <w:r>
+              <w:t xml:space="preserve">Bureau of Meteorology daily observations, Moorabbin Airport, station 086077</w:t>
+            </w:r>
+          </w:p>
+        </w:tc>
+        <w:tc>
+          <w:tcPr/>
+          <w:p>
+            <w:pPr>
+              <w:pStyle w:val="Compact"/>
+              <w:jc w:val="left"/>
+            </w:pPr>
+            <w:r>
+              <w:t xml:space="preserve">Monthly CSV</w:t>
+            </w:r>
+          </w:p>
+        </w:tc>
+        <w:tc>
+          <w:tcPr/>
+          <w:p>
+            <w:pPr>
+              <w:pStyle w:val="Compact"/>
+              <w:jc w:val="left"/>
+            </w:pPr>
+            <w:r>
+              <w:t xml:space="preserve">9 am temperature and humidity</w:t>
+            </w:r>
+          </w:p>
+        </w:tc>
+        <w:tc>
+          <w:tcPr/>
+          <w:p>
+            <w:pPr>
+              <w:pStyle w:val="Compact"/>
+              <w:jc w:val="left"/>
+            </w:pPr>
+            <w:r>
+              <w:t xml:space="preserve">Daily, 222 days overlapping sensor 0326</w:t>
+            </w:r>
+          </w:p>
+        </w:tc>
+      </w:tr>
+    </w:tbl>
+    <w:p>
+      <w:pPr>
+        <w:pStyle w:val="BodyText"/>
+      </w:pPr>
+      <w:r>
+        <w:t xml:space="preserve">The raw files exceed GitHub’s 100 MB limit, so compact processed copies of the parts used are committed in</w:t>
+      </w:r>
+      <w:r>
+        <w:t xml:space="preserve"> </w:t>
+      </w:r>
+      <w:r>
+        <w:rPr>
+          <w:rStyle w:val="VerbatimChar"/>
+        </w:rPr>
+        <w:t xml:space="preserve">data/processed/</w:t>
+      </w:r>
+      <w:r>
+        <w:t xml:space="preserve">; every script uses the raw files when present and the copies otherwise, with identical results (README).</w:t>
+      </w:r>
+    </w:p>
+    <w:bookmarkEnd w:id="26"/>
+    <w:bookmarkStart w:id="27" w:name="from-raw-data-to-model-inputs"/>
+    <w:p>
+      <w:pPr>
+        <w:pStyle w:val="Heading3"/>
+      </w:pPr>
+      <w:r>
+        <w:t xml:space="preserve">2.2 From Raw Data to Model Inputs</w:t>
+      </w:r>
     </w:p>
     <w:p>
       <w:pPr>
         <w:pStyle w:val="FirstParagraph"/>
       </w:pPr>
       <w:r>
-        <w:t xml:space="preserve">where</w:t>
-      </w:r>
-      <w:r>
-        <w:t xml:space="preserve"> </w:t>
-      </w:r>
-      <m:oMath>
-        <m:sSub>
-          <m:e>
-            <m:r>
-              <m:t>C</m:t>
-            </m:r>
-          </m:e>
-          <m:sub>
-            <m:r>
-              <m:t>t</m:t>
-            </m:r>
-          </m:sub>
-        </m:sSub>
-      </m:oMath>
-      <w:r>
-        <w:t xml:space="preserve"> </w:t>
-      </w:r>
-      <w:r>
-        <w:t xml:space="preserve">is the current CO₂ reading,</w:t>
-      </w:r>
-      <w:r>
-        <w:t xml:space="preserve"> </w:t>
-      </w:r>
-      <m:oMath>
-        <m:sSub>
-          <m:e>
-            <m:r>
-              <m:t>C</m:t>
-            </m:r>
-          </m:e>
-          <m:sub>
-            <m:r>
-              <m:t>t</m:t>
-            </m:r>
-            <m:r>
-              <m:rPr>
-                <m:sty m:val="p"/>
-              </m:rPr>
-              <m:t>−</m:t>
-            </m:r>
-            <m:r>
-              <m:t>1</m:t>
-            </m:r>
-          </m:sub>
-        </m:sSub>
-      </m:oMath>
-      <w:r>
-        <w:t xml:space="preserve"> </w:t>
-      </w:r>
-      <w:r>
-        <w:t xml:space="preserve">is the reading from 15 minutes ago,</w:t>
-      </w:r>
-      <w:r>
-        <w:t xml:space="preserve"> </w:t>
-      </w:r>
-      <m:oMath>
-        <m:sSub>
-          <m:e>
-            <m:acc>
-              <m:accPr>
-                <m:chr m:val="‾"/>
-              </m:accPr>
-              <m:e>
-                <m:r>
-                  <m:t>C</m:t>
-                </m:r>
-              </m:e>
-            </m:acc>
-          </m:e>
-          <m:sub>
-            <m:r>
-              <m:t>t</m:t>
-            </m:r>
-            <m:r>
-              <m:rPr>
-                <m:sty m:val="p"/>
-              </m:rPr>
-              <m:t>−</m:t>
-            </m:r>
-            <m:r>
-              <m:t>1</m:t>
-            </m:r>
-            <m:r>
-              <m:rPr>
-                <m:nor/>
-                <m:sty m:val="p"/>
-              </m:rPr>
-              <m:t>h</m:t>
-            </m:r>
-          </m:sub>
-        </m:sSub>
-      </m:oMath>
-      <w:r>
-        <w:t xml:space="preserve"> </w:t>
-      </w:r>
-      <w:r>
-        <w:t xml:space="preserve">is the 1-hour rolling mean,</w:t>
-      </w:r>
-      <w:r>
-        <w:t xml:space="preserve"> </w:t>
-      </w:r>
-      <m:oMath>
-        <m:sSub>
-          <m:e>
-            <m:r>
-              <m:t>O</m:t>
-            </m:r>
-          </m:e>
-          <m:sub>
-            <m:r>
-              <m:t>t</m:t>
-            </m:r>
-          </m:sub>
-        </m:sSub>
-      </m:oMath>
-      <w:r>
-        <w:t xml:space="preserve"> </w:t>
-      </w:r>
-      <w:r>
-        <w:t xml:space="preserve">is the number of occupied building zones at time</w:t>
-      </w:r>
-      <w:r>
-        <w:t xml:space="preserve"> </w:t>
-      </w:r>
-      <m:oMath>
-        <m:r>
-          <m:t>t</m:t>
-        </m:r>
-      </m:oMath>
-      <w:r>
-        <w:t xml:space="preserve">, and</w:t>
-      </w:r>
-      <w:r>
-        <w:t xml:space="preserve"> </w:t>
-      </w:r>
-      <m:oMath>
-        <m:sSub>
-          <m:e>
-            <m:r>
-              <m:t>τ</m:t>
-            </m:r>
-          </m:e>
-          <m:sub>
-            <m:r>
-              <m:t>t</m:t>
-            </m:r>
-          </m:sub>
-        </m:sSub>
-      </m:oMath>
-      <w:r>
-        <w:t xml:space="preserve"> </w:t>
-      </w:r>
-      <w:r>
-        <w:t xml:space="preserve">encodes the temporal context (time of day, day of week). The output</w:t>
+        <w:rPr>
+          <w:bCs/>
+          <w:b/>
+        </w:rPr>
+        <w:t xml:space="preserve">Time.</w:t>
+      </w:r>
+      <w:r>
+        <w:t xml:space="preserve"> </w:t>
+      </w:r>
+      <w:r>
+        <w:t xml:space="preserve">All timestamps are converted to UTC and then to Australia/Melbourne local time, so the time-of-day features follow the building’s clock across daylight-saving changes (the raw offsets switch between +10 and +11 hours).</w:t>
+      </w:r>
+    </w:p>
+    <w:p>
+      <w:pPr>
+        <w:pStyle w:val="BodyText"/>
+      </w:pPr>
+      <w:r>
+        <w:rPr>
+          <w:bCs/>
+          <w:b/>
+        </w:rPr>
+        <w:t xml:space="preserve">Binning.</w:t>
+      </w:r>
+      <w:r>
+        <w:t xml:space="preserve"> </w:t>
+      </w:r>
+      <w:r>
+        <w:t xml:space="preserve">Each sensor’s readings are averaged into 15-minute bins; a bin with no reading is missing.</w:t>
+      </w:r>
+    </w:p>
+    <w:p>
+      <w:pPr>
+        <w:pStyle w:val="BodyText"/>
+      </w:pPr>
+      <w:r>
+        <w:rPr>
+          <w:bCs/>
+          <w:b/>
+        </w:rPr>
+        <w:t xml:space="preserve">Occupancy.</w:t>
+      </w:r>
+      <w:r>
+        <w:t xml:space="preserve"> </w:t>
+      </w:r>
+      <w:r>
+        <w:t xml:space="preserve">A zone is occupied in a bin if its most recent status within the previous 2 hours is</w:t>
+      </w:r>
+      <w:r>
+        <w:t xml:space="preserve"> </w:t>
+      </w:r>
+      <w:r>
+        <w:rPr>
+          <w:rStyle w:val="VerbatimChar"/>
+        </w:rPr>
+        <w:t xml:space="preserve">CurrentlyOccupied</w:t>
+      </w:r>
+      <w:r>
+        <w:t xml:space="preserve">;</w:t>
+      </w:r>
+      <w:r>
+        <w:t xml:space="preserve"> </w:t>
+      </w:r>
+      <w:r>
+        <w:rPr>
+          <w:rStyle w:val="VerbatimChar"/>
+        </w:rPr>
+        <w:t xml:space="preserve">RecentlyOccupied</w:t>
+      </w:r>
+      <w:r>
+        <w:t xml:space="preserve">, the sensor’s post-departure cooldown state, counts as not occupied. A zone with no event in the previous 2 hours is unknown.</w:t>
+      </w:r>
+      <w:r>
+        <w:t xml:space="preserve"> </w:t>
+      </w:r>
+      <w:r>
+        <w:rPr>
+          <w:rStyle w:val="VerbatimChar"/>
+        </w:rPr>
+        <w:t xml:space="preserve">building_occupancy</w:t>
+      </w:r>
+      <w:r>
+        <w:t xml:space="preserve"> </w:t>
+      </w:r>
+      <w:r>
+        <w:t xml:space="preserve">is the number of the five zones occupied: unknown zones count as not occupied, and the value is missing only when all five are unknown. The log’s</w:t>
+      </w:r>
+      <w:r>
+        <w:t xml:space="preserve"> </w:t>
+      </w:r>
+      <w:r>
+        <w:rPr>
+          <w:rStyle w:val="VerbatimChar"/>
+        </w:rPr>
+        <w:t xml:space="preserve">headcount</w:t>
+      </w:r>
+      <w:r>
+        <w:t xml:space="preserve"> </w:t>
+      </w:r>
+      <w:r>
+        <w:t xml:space="preserve">column is not used, so the feature counts occupied zones, not people.</w:t>
+      </w:r>
+    </w:p>
+    <w:p>
+      <w:pPr>
+        <w:pStyle w:val="BodyText"/>
+      </w:pPr>
+      <w:r>
+        <w:rPr>
+          <w:bCs/>
+          <w:b/>
+        </w:rPr>
+        <w:t xml:space="preserve">Formulation.</w:t>
+      </w:r>
+      <w:r>
+        <w:t xml:space="preserve"> </w:t>
+      </w:r>
+      <w:r>
+        <w:t xml:space="preserve">The model learns</w:t>
       </w:r>
       <w:r>
         <w:t xml:space="preserve"> </w:t>
@@ -883,36 +1349,187 @@
             </m:r>
           </m:sub>
         </m:sSub>
+        <m:r>
+          <m:rPr>
+            <m:sty m:val="p"/>
+          </m:rPr>
+          <m:t>=</m:t>
+        </m:r>
+        <m:r>
+          <m:t>f</m:t>
+        </m:r>
+        <m:d>
+          <m:dPr>
+            <m:begChr m:val="("/>
+            <m:endChr m:val=")"/>
+            <m:sepChr m:val=""/>
+            <m:grow/>
+          </m:dPr>
+          <m:e>
+            <m:sSub>
+              <m:e>
+                <m:r>
+                  <m:t>C</m:t>
+                </m:r>
+              </m:e>
+              <m:sub>
+                <m:r>
+                  <m:t>t</m:t>
+                </m:r>
+              </m:sub>
+            </m:sSub>
+            <m:r>
+              <m:rPr>
+                <m:sty m:val="p"/>
+              </m:rPr>
+              <m:t>,</m:t>
+            </m:r>
+            <m:sSub>
+              <m:e>
+                <m:r>
+                  <m:t>C</m:t>
+                </m:r>
+              </m:e>
+              <m:sub>
+                <m:r>
+                  <m:t>t</m:t>
+                </m:r>
+                <m:r>
+                  <m:rPr>
+                    <m:sty m:val="p"/>
+                  </m:rPr>
+                  <m:t>−</m:t>
+                </m:r>
+                <m:r>
+                  <m:t>1</m:t>
+                </m:r>
+              </m:sub>
+            </m:sSub>
+            <m:r>
+              <m:rPr>
+                <m:sty m:val="p"/>
+              </m:rPr>
+              <m:t>,</m:t>
+            </m:r>
+            <m:sSub>
+              <m:e>
+                <m:acc>
+                  <m:accPr>
+                    <m:chr m:val="‾"/>
+                  </m:accPr>
+                  <m:e>
+                    <m:r>
+                      <m:t>C</m:t>
+                    </m:r>
+                  </m:e>
+                </m:acc>
+              </m:e>
+              <m:sub>
+                <m:r>
+                  <m:t>t</m:t>
+                </m:r>
+                <m:r>
+                  <m:rPr>
+                    <m:sty m:val="p"/>
+                  </m:rPr>
+                  <m:t>−</m:t>
+                </m:r>
+                <m:r>
+                  <m:t>1</m:t>
+                </m:r>
+                <m:r>
+                  <m:rPr>
+                    <m:nor/>
+                    <m:sty m:val="p"/>
+                  </m:rPr>
+                  <m:t>h</m:t>
+                </m:r>
+              </m:sub>
+            </m:sSub>
+            <m:r>
+              <m:rPr>
+                <m:sty m:val="p"/>
+              </m:rPr>
+              <m:t>,</m:t>
+            </m:r>
+            <m:sSub>
+              <m:e>
+                <m:r>
+                  <m:t>O</m:t>
+                </m:r>
+              </m:e>
+              <m:sub>
+                <m:r>
+                  <m:t>t</m:t>
+                </m:r>
+              </m:sub>
+            </m:sSub>
+            <m:r>
+              <m:rPr>
+                <m:sty m:val="p"/>
+              </m:rPr>
+              <m:t>,</m:t>
+            </m:r>
+            <m:sSub>
+              <m:e>
+                <m:r>
+                  <m:t>τ</m:t>
+                </m:r>
+              </m:e>
+              <m:sub>
+                <m:r>
+                  <m:t>t</m:t>
+                </m:r>
+              </m:sub>
+            </m:sSub>
+          </m:e>
+        </m:d>
       </m:oMath>
       <w:r>
-        <w:t xml:space="preserve"> </w:t>
-      </w:r>
-      <w:r>
-        <w:t xml:space="preserve">is the predicted CO₂ concentration one 15-minute bin (15 minutes) ahead.</w:t>
-      </w:r>
-    </w:p>
-    <w:p>
-      <w:pPr>
-        <w:pStyle w:val="BodyText"/>
-      </w:pPr>
-      <w:r>
-        <w:t xml:space="preserve">This formulation uses CO₂ as an</w:t>
-      </w:r>
-      <w:r>
-        <w:t xml:space="preserve"> </w:t>
-      </w:r>
-      <w:r>
-        <w:rPr>
-          <w:bCs/>
-          <w:b/>
-        </w:rPr>
-        <w:t xml:space="preserve">autoregressive</w:t>
-      </w:r>
-      <w:r>
-        <w:t xml:space="preserve"> </w:t>
-      </w:r>
-      <w:r>
-        <w:t xml:space="preserve">predictor of itself. The physical justification comes from the mass-balance equation: solving it over one 15-minute step</w:t>
+        <w:t xml:space="preserve">: next-bin CO₂ from the current and previous bins, the 1-hour mean, occupancy</w:t>
+      </w:r>
+      <w:r>
+        <w:t xml:space="preserve"> </w:t>
+      </w:r>
+      <m:oMath>
+        <m:sSub>
+          <m:e>
+            <m:r>
+              <m:t>O</m:t>
+            </m:r>
+          </m:e>
+          <m:sub>
+            <m:r>
+              <m:t>t</m:t>
+            </m:r>
+          </m:sub>
+        </m:sSub>
+      </m:oMath>
+      <w:r>
+        <w:t xml:space="preserve"> </w:t>
+      </w:r>
+      <w:r>
+        <w:t xml:space="preserve">and time context</w:t>
+      </w:r>
+      <w:r>
+        <w:t xml:space="preserve"> </w:t>
+      </w:r>
+      <m:oMath>
+        <m:sSub>
+          <m:e>
+            <m:r>
+              <m:t>τ</m:t>
+            </m:r>
+          </m:e>
+          <m:sub>
+            <m:r>
+              <m:t>t</m:t>
+            </m:r>
+          </m:sub>
+        </m:sSub>
+      </m:oMath>
+      <w:r>
+        <w:t xml:space="preserve">. Solving the mass balance over one step</w:t>
       </w:r>
       <w:r>
         <w:t xml:space="preserve"> </w:t>
@@ -986,9 +1603,6 @@
             </m:r>
           </m:sup>
         </m:sSup>
-        <m:r>
-          <m:t> </m:t>
-        </m:r>
         <m:sSub>
           <m:e>
             <m:r>
@@ -1050,9 +1664,6 @@
             </m:sSup>
           </m:e>
         </m:d>
-        <m:r>
-          <m:t> </m:t>
-        </m:r>
         <m:sSub>
           <m:e>
             <m:r>
@@ -1149,57 +1760,7 @@
         </m:d>
       </m:oMath>
       <w:r>
-        <w:t xml:space="preserve"> </w:t>
-      </w:r>
-      <w:r>
-        <w:t xml:space="preserve">is the steady-state level. The next value is a scaled copy of the current one plus a term that depends on occupancy and ventilation — so the current level, its recent trend and the time of day (a proxy for the occupancy and ventilation schedule) are the natural inputs. With a typical</w:t>
-      </w:r>
-      <w:r>
-        <w:t xml:space="preserve"> </w:t>
-      </w:r>
-      <m:oMath>
-        <m:r>
-          <m:t>λ</m:t>
-        </m:r>
-      </m:oMath>
-      <w:r>
-        <w:t xml:space="preserve"> </w:t>
-      </w:r>
-      <w:r>
-        <w:t xml:space="preserve">of about 2 air changes per hour, the room’s time constant</w:t>
-      </w:r>
-      <w:r>
-        <w:t xml:space="preserve"> </w:t>
-      </w:r>
-      <m:oMath>
-        <m:r>
-          <m:t>1</m:t>
-        </m:r>
-        <m:r>
-          <m:rPr>
-            <m:sty m:val="p"/>
-          </m:rPr>
-          <m:t>/</m:t>
-        </m:r>
-        <m:r>
-          <m:t>λ</m:t>
-        </m:r>
-      </m:oMath>
-      <w:r>
-        <w:t xml:space="preserve"> </w:t>
-      </w:r>
-      <w:r>
-        <w:t xml:space="preserve">is about 30 minutes, which is why a 15-minute horizon is both actionable and predictable from recent history.</w:t>
-      </w:r>
-    </w:p>
-    <w:bookmarkEnd w:id="24"/>
-    <w:bookmarkStart w:id="25" w:name="input-features"/>
-    <w:p>
-      <w:pPr>
-        <w:pStyle w:val="Heading3"/>
-      </w:pPr>
-      <w:r>
-        <w:t xml:space="preserve">2.2 Input Features</w:t>
+        <w:t xml:space="preserve">: the next value is a scaled copy of the current one plus a term set by occupancy and ventilation, which is why these are the inputs.</w:t>
       </w:r>
     </w:p>
     <w:tbl>
@@ -1210,10 +1771,9 @@
         <w:jc w:val="start"/>
       </w:tblPr>
       <w:tblGrid>
-        <w:gridCol w:w="1466"/>
-        <w:gridCol w:w="1026"/>
-        <w:gridCol w:w="733"/>
-        <w:gridCol w:w="4693"/>
+        <w:gridCol w:w="2217"/>
+        <w:gridCol w:w="1267"/>
+        <w:gridCol w:w="4435"/>
       </w:tblGrid>
       <w:tr>
         <w:trPr>
@@ -1239,19 +1799,7 @@
               <w:jc w:val="left"/>
             </w:pPr>
             <w:r>
-              <w:t xml:space="preserve">Units / Type</w:t>
-            </w:r>
-          </w:p>
-        </w:tc>
-        <w:tc>
-          <w:tcPr/>
-          <w:p>
-            <w:pPr>
-              <w:pStyle w:val="Compact"/>
-              <w:jc w:val="left"/>
-            </w:pPr>
-            <w:r>
-              <w:t xml:space="preserve">Domain</w:t>
+              <w:t xml:space="preserve">Units, type</w:t>
             </w:r>
           </w:p>
         </w:tc>
@@ -1304,19 +1852,7 @@
               <w:jc w:val="left"/>
             </w:pPr>
             <w:r>
-              <w:t xml:space="preserve">400–5000</w:t>
-            </w:r>
-          </w:p>
-        </w:tc>
-        <w:tc>
-          <w:tcPr/>
-          <w:p>
-            <w:pPr>
-              <w:pStyle w:val="Compact"/>
-              <w:jc w:val="left"/>
-            </w:pPr>
-            <w:r>
-              <w:t xml:space="preserve">CO₂ at the current 15-minute bin. The strongest single predictor of the next reading, because CO₂ dynamics are strongly autoregressive over short horizons.</w:t>
+              <w:t xml:space="preserve">CO₂ in the current bin; the strongest single predictor</w:t>
             </w:r>
           </w:p>
         </w:tc>
@@ -1357,19 +1893,7 @@
               <w:jc w:val="left"/>
             </w:pPr>
             <w:r>
-              <w:t xml:space="preserve">400–5000</w:t>
-            </w:r>
-          </w:p>
-        </w:tc>
-        <w:tc>
-          <w:tcPr/>
-          <w:p>
-            <w:pPr>
-              <w:pStyle w:val="Compact"/>
-              <w:jc w:val="left"/>
-            </w:pPr>
-            <w:r>
-              <w:t xml:space="preserve">CO₂ from 15 minutes ago. Combined with</w:t>
+              <w:t xml:space="preserve">CO₂ 15 minutes ago; with</w:t>
             </w:r>
             <w:r>
               <w:t xml:space="preserve"> </w:t>
@@ -1381,7 +1905,7 @@
               <w:t xml:space="preserve">co2_now</w:t>
             </w:r>
             <w:r>
-              <w:t xml:space="preserve">, this gives the average rate of change over the last 15 minutes (a backward finite difference) — whether CO₂ is rising, falling, or stable at the moment of prediction.</w:t>
+              <w:t xml:space="preserve">, a backward difference giving the current trend</w:t>
             </w:r>
           </w:p>
         </w:tc>
@@ -1422,19 +1946,7 @@
               <w:jc w:val="left"/>
             </w:pPr>
             <w:r>
-              <w:t xml:space="preserve">400–5000</w:t>
-            </w:r>
-          </w:p>
-        </w:tc>
-        <w:tc>
-          <w:tcPr/>
-          <w:p>
-            <w:pPr>
-              <w:pStyle w:val="Compact"/>
-              <w:jc w:val="left"/>
-            </w:pPr>
-            <w:r>
-              <w:t xml:space="preserve">Mean of the last four 15-minute bins, including the current one (the hour ending now). Captures the medium-term trend — whether CO₂ has been consistently rising through the morning, plateauing, or declining as ventilation increases.</w:t>
+              <w:t xml:space="preserve">Mean of the last four bins including the current one; the medium-term trend</w:t>
             </w:r>
           </w:p>
         </w:tc>
@@ -1463,31 +1975,19 @@
               <w:jc w:val="left"/>
             </w:pPr>
             <w:r>
-              <w:t xml:space="preserve">integer, discrete</w:t>
-            </w:r>
-          </w:p>
-        </w:tc>
-        <w:tc>
-          <w:tcPr/>
-          <w:p>
-            <w:pPr>
-              <w:pStyle w:val="Compact"/>
-              <w:jc w:val="left"/>
-            </w:pPr>
-            <w:r>
-              <w:t xml:space="preserve">0–5</w:t>
-            </w:r>
-          </w:p>
-        </w:tc>
-        <w:tc>
-          <w:tcPr/>
-          <w:p>
-            <w:pPr>
-              <w:pStyle w:val="Compact"/>
-              <w:jc w:val="left"/>
-            </w:pPr>
-            <w:r>
-              <w:t xml:space="preserve">Number of the five monitored occupancy zones currently occupied. Included because, from the mass-balance equation,</w:t>
+              <w:t xml:space="preserve">count, integer 0–5</w:t>
+            </w:r>
+          </w:p>
+        </w:tc>
+        <w:tc>
+          <w:tcPr/>
+          <w:p>
+            <w:pPr>
+              <w:pStyle w:val="Compact"/>
+              <w:jc w:val="left"/>
+            </w:pPr>
+            <w:r>
+              <w:t xml:space="preserve">Zones occupied (definition above); tested in RQ2 because</w:t>
             </w:r>
             <w:r>
               <w:t xml:space="preserve"> </w:t>
@@ -1501,7 +2001,7 @@
               <w:t xml:space="preserve"> </w:t>
             </w:r>
             <w:r>
-              <w:t xml:space="preserve">directly drives CO₂ generation. Whether this variable is actually useful depends on whether the sensor is co-located with a monitored zone — this is tested empirically in Section 4.</w:t>
+              <w:t xml:space="preserve">drives generation</w:t>
             </w:r>
           </w:p>
         </w:tc>
@@ -1542,31 +2042,19 @@
               <w:jc w:val="left"/>
             </w:pPr>
             <w:r>
-              <w:t xml:space="preserve">float, continuous</w:t>
-            </w:r>
-          </w:p>
-        </w:tc>
-        <w:tc>
-          <w:tcPr/>
-          <w:p>
-            <w:pPr>
-              <w:pStyle w:val="Compact"/>
-              <w:jc w:val="left"/>
-            </w:pPr>
-            <w:r>
-              <w:t xml:space="preserve">−1 to +1</w:t>
-            </w:r>
-          </w:p>
-        </w:tc>
-        <w:tc>
-          <w:tcPr/>
-          <w:p>
-            <w:pPr>
-              <w:pStyle w:val="Compact"/>
-              <w:jc w:val="left"/>
-            </w:pPr>
-            <w:r>
-              <w:t xml:space="preserve">Cyclic encoding of hour-of-day:</w:t>
+              <w:t xml:space="preserve">−1 to 1</w:t>
+            </w:r>
+          </w:p>
+        </w:tc>
+        <w:tc>
+          <w:tcPr/>
+          <w:p>
+            <w:pPr>
+              <w:pStyle w:val="Compact"/>
+              <w:jc w:val="left"/>
+            </w:pPr>
+            <w:r>
+              <w:t xml:space="preserve">Hour of day as</w:t>
             </w:r>
             <w:r>
               <w:t xml:space="preserve"> </w:t>
@@ -1621,9 +2109,6 @@
                     <m:t>,</m:t>
                   </m:r>
                   <m:r>
-                    <m:t> </m:t>
-                  </m:r>
-                  <m:r>
                     <m:rPr>
                       <m:sty m:val="p"/>
                     </m:rPr>
@@ -1661,7 +2146,7 @@
               </m:d>
             </m:oMath>
             <w:r>
-              <w:t xml:space="preserve">. A plain integer hour would represent hour 23 and hour 0 as 23 steps apart; this encoding preserves the fact that they are actually 1 hour apart on a 24-hour cycle.</w:t>
+              <w:t xml:space="preserve">, so 23:45 sits next to 00:00</w:t>
             </w:r>
           </w:p>
         </w:tc>
@@ -1702,31 +2187,19 @@
               <w:jc w:val="left"/>
             </w:pPr>
             <w:r>
-              <w:t xml:space="preserve">float, continuous</w:t>
-            </w:r>
-          </w:p>
-        </w:tc>
-        <w:tc>
-          <w:tcPr/>
-          <w:p>
-            <w:pPr>
-              <w:pStyle w:val="Compact"/>
-              <w:jc w:val="left"/>
-            </w:pPr>
-            <w:r>
-              <w:t xml:space="preserve">−1 to +1</w:t>
-            </w:r>
-          </w:p>
-        </w:tc>
-        <w:tc>
-          <w:tcPr/>
-          <w:p>
-            <w:pPr>
-              <w:pStyle w:val="Compact"/>
-              <w:jc w:val="left"/>
-            </w:pPr>
-            <w:r>
-              <w:t xml:space="preserve">Cyclic encoding of day-of-week, for the same reason. Different weekdays carry different occupancy and ventilation patterns.</w:t>
+              <w:t xml:space="preserve">−1 to 1</w:t>
+            </w:r>
+          </w:p>
+        </w:tc>
+        <w:tc>
+          <w:tcPr/>
+          <w:p>
+            <w:pPr>
+              <w:pStyle w:val="Compact"/>
+              <w:jc w:val="left"/>
+            </w:pPr>
+            <w:r>
+              <w:t xml:space="preserve">Day of week, encoded the same way</w:t>
             </w:r>
           </w:p>
         </w:tc>
@@ -1755,70 +2228,68 @@
               <w:jc w:val="left"/>
             </w:pPr>
             <w:r>
-              <w:t xml:space="preserve">binary</w:t>
-            </w:r>
-          </w:p>
-        </w:tc>
-        <w:tc>
-          <w:tcPr/>
-          <w:p>
-            <w:pPr>
-              <w:pStyle w:val="Compact"/>
-              <w:jc w:val="left"/>
-            </w:pPr>
-            <w:r>
-              <w:t xml:space="preserve">{0, 1}</w:t>
-            </w:r>
-          </w:p>
-        </w:tc>
-        <w:tc>
-          <w:tcPr/>
-          <w:p>
-            <w:pPr>
-              <w:pStyle w:val="Compact"/>
-              <w:jc w:val="left"/>
-            </w:pPr>
-            <w:r>
-              <w:t xml:space="preserve">1 if Saturday or Sunday, computed from each row’s timestamp. Included because weekend occupancy and ventilation are expected to differ, and a binary flag makes that easy for linear models to learn. For this sensor the expected difference does not appear: weekday and weekend CO₂ are the same (Section 4).</w:t>
+              <w:t xml:space="preserve">0 or 1</w:t>
+            </w:r>
+          </w:p>
+        </w:tc>
+        <w:tc>
+          <w:tcPr/>
+          <w:p>
+            <w:pPr>
+              <w:pStyle w:val="Compact"/>
+              <w:jc w:val="left"/>
+            </w:pPr>
+            <w:r>
+              <w:t xml:space="preserve">1 on Saturday and Sunday</w:t>
             </w:r>
           </w:p>
         </w:tc>
       </w:tr>
     </w:tbl>
-    <w:p>
-      <w:pPr>
-        <w:pStyle w:val="BodyText"/>
-      </w:pPr>
+    <w:bookmarkEnd w:id="27"/>
+    <w:bookmarkStart w:id="28" w:name="input-domains"/>
+    <w:p>
+      <w:pPr>
+        <w:pStyle w:val="Heading3"/>
+      </w:pPr>
+      <w:r>
+        <w:t xml:space="preserve">2.3 Input Domains</w:t>
+      </w:r>
+    </w:p>
+    <w:p>
+      <w:pPr>
+        <w:pStyle w:val="FirstParagraph"/>
+      </w:pPr>
+      <w:r>
+        <w:t xml:space="preserve">Two domains are distinguished. The</w:t>
+      </w:r>
+      <w:r>
+        <w:t xml:space="preserve"> </w:t>
+      </w:r>
       <w:r>
         <w:rPr>
           <w:bCs/>
           <w:b/>
         </w:rPr>
-        <w:t xml:space="preserve">Total:</w:t>
-      </w:r>
-      <w:r>
-        <w:t xml:space="preserve"> </w:t>
-      </w:r>
-      <w:r>
-        <w:t xml:space="preserve">9 features (each cyclic pair contributes two).</w:t>
-      </w:r>
-    </w:p>
-    <w:bookmarkEnd w:id="25"/>
-    <w:bookmarkStart w:id="29" w:name="handling-missing-and-invalid-inputs"/>
-    <w:p>
-      <w:pPr>
-        <w:pStyle w:val="Heading3"/>
-      </w:pPr>
-      <w:r>
-        <w:t xml:space="preserve">2.3 Handling Missing and Invalid Inputs</w:t>
-      </w:r>
-    </w:p>
-    <w:p>
-      <w:pPr>
-        <w:pStyle w:val="FirstParagraph"/>
-      </w:pPr>
-      <w:r>
-        <w:t xml:space="preserve">The dominant data loss is a 636-day gap in genuine readings (11 December 2023 to 7 September 2025); for about eight months of it the sensor re-sent one stale packet every 11 minutes (Section 6). Genuine readings run from 7 September 2025 to 22 April 2026. Any row with a missing input or target is</w:t>
+        <w:t xml:space="preserve">valid domain</w:t>
+      </w:r>
+      <w:r>
+        <w:t xml:space="preserve"> </w:t>
+      </w:r>
+      <w:r>
+        <w:t xml:space="preserve">is what the model accepts at all, checked by</w:t>
+      </w:r>
+      <w:r>
+        <w:t xml:space="preserve"> </w:t>
+      </w:r>
+      <w:r>
+        <w:rPr>
+          <w:rStyle w:val="VerbatimChar"/>
+        </w:rPr>
+        <w:t xml:space="preserve">occupancy.input_validation</w:t>
+      </w:r>
+      <w:r>
+        <w:t xml:space="preserve">: CO₂ inputs 350–5000 ppm (indoor air cannot hold less CO₂ than the outdoor air ventilating it, allowing for sensor noise; 5000 ppm is the 8-hour occupational exposure limit, ACGIH and OSHA), occupancy a whole number 0–5, hour 0–23, day 0–6. The</w:t>
       </w:r>
       <w:r>
         <w:t xml:space="preserve"> </w:t>
@@ -1828,81 +2299,41 @@
           <w:bCs/>
           <w:b/>
         </w:rPr>
-        <w:t xml:space="preserve">dropped</w:t>
-      </w:r>
-      <w:r>
-        <w:t xml:space="preserve">, never filled: imputing across a 636-day gap would invent hundreds of thousands of readings.</w:t>
-      </w:r>
-    </w:p>
-    <w:p>
-      <w:pPr>
-        <w:pStyle w:val="BodyText"/>
-      </w:pPr>
-      <w:r>
-        <w:t xml:space="preserve">Of 84,576 candidate 15-minute timestamps in the raw log, 17,010 (20.1%) have all nine inputs and the target present and are retained for modelling. The remaining 67,566 rows (79.9%) are dropped.</w:t>
-      </w:r>
-    </w:p>
-    <w:p>
-      <w:pPr>
-        <w:pStyle w:val="CaptionedFigure"/>
-      </w:pPr>
-      <w:r>
-        <w:drawing>
-          <wp:inline>
-            <wp:extent cx="3291840" cy="1611195"/>
-            <wp:effectExtent b="0" l="0" r="0" t="0"/>
-            <wp:docPr descr="Data pipeline: raw candidate timestamps versus dropped rows versus rows retained for modelling" title="" id="27" name="Picture"/>
-            <a:graphic>
-              <a:graphicData uri="http://schemas.openxmlformats.org/drawingml/2006/picture">
-                <pic:pic>
-                  <pic:nvPicPr>
-                    <pic:cNvPr descr="chart_data_pipeline.png" id="28" name="Picture"/>
-                    <pic:cNvPicPr>
-                      <a:picLocks noChangeArrowheads="1" noChangeAspect="1"/>
-                    </pic:cNvPicPr>
-                  </pic:nvPicPr>
-                  <pic:blipFill>
-                    <a:blip r:embed="rId26"/>
-                    <a:stretch>
-                      <a:fillRect/>
-                    </a:stretch>
-                  </pic:blipFill>
-                  <pic:spPr bwMode="auto">
-                    <a:xfrm>
-                      <a:off x="0" y="0"/>
-                      <a:ext cx="3291840" cy="1611195"/>
-                    </a:xfrm>
-                    <a:prstGeom prst="rect">
-                      <a:avLst/>
-                    </a:prstGeom>
-                    <a:noFill/>
-                    <a:ln w="9525">
-                      <a:noFill/>
-                      <a:headEnd/>
-                      <a:tailEnd/>
-                    </a:ln>
-                  </pic:spPr>
-                </pic:pic>
-              </a:graphicData>
-            </a:graphic>
-          </wp:inline>
-        </w:drawing>
-      </w:r>
-    </w:p>
-    <w:p>
-      <w:pPr>
-        <w:pStyle w:val="ImageCaption"/>
-      </w:pPr>
-      <w:r>
-        <w:t xml:space="preserve">Data pipeline: raw candidate timestamps versus dropped rows versus rows retained for modelling</w:t>
-      </w:r>
-    </w:p>
-    <w:p>
-      <w:pPr>
-        <w:pStyle w:val="BodyText"/>
-      </w:pPr>
-      <w:r>
-        <w:t xml:space="preserve">In effect, this policy keeps only the</w:t>
+        <w:t xml:space="preserve">trained domain</w:t>
+      </w:r>
+      <w:r>
+        <w:t xml:space="preserve"> </w:t>
+      </w:r>
+      <w:r>
+        <w:t xml:space="preserve">is the range of values in the training data. Most training rows lie between 400 and 550 ppm (Section 4.1), so accuracy is established there; valid inputs outside the training range are predicted but flagged as extrapolation.</w:t>
+      </w:r>
+    </w:p>
+    <w:bookmarkEnd w:id="28"/>
+    <w:bookmarkStart w:id="29" w:name="invalid-missing-and-unsupported-inputs"/>
+    <w:p>
+      <w:pPr>
+        <w:pStyle w:val="Heading3"/>
+      </w:pPr>
+      <w:r>
+        <w:t xml:space="preserve">2.4 Invalid, Missing and Unsupported Inputs</w:t>
+      </w:r>
+    </w:p>
+    <w:p>
+      <w:pPr>
+        <w:pStyle w:val="FirstParagraph"/>
+      </w:pPr>
+      <w:r>
+        <w:rPr>
+          <w:bCs/>
+          <w:b/>
+        </w:rPr>
+        <w:t xml:space="preserve">Missing.</w:t>
+      </w:r>
+      <w:r>
+        <w:t xml:space="preserve"> </w:t>
+      </w:r>
+      <w:r>
+        <w:t xml:space="preserve">A row with any missing input or target is dropped, never filled. The dominant loss is a 636-day gap in genuine readings (11 December 2023 to 7 September 2025): imputing across it would invent hundreds of thousands of readings. Of 84,576 candidate 15-minute timestamps, 17,010 (20.1%) are complete and used. In effect only</w:t>
       </w:r>
       <w:r>
         <w:t xml:space="preserve"> </w:t>
@@ -1918,7 +2349,7 @@
         <w:t xml:space="preserve"> </w:t>
       </w:r>
       <w:r>
-        <w:t xml:space="preserve">of the record: runs of consecutive 15-minute bins with no gap. A row needs four bins of history (the 1-hour rolling mean) plus the next bin as its target, so any unbroken interval of at least 75 minutes contributes training data, and an interval of</w:t>
+        <w:t xml:space="preserve">are kept: runs of consecutive bins with no gap. A row needs four bins of history plus the next bin as target, so any interval of at least 75 minutes contributes, and an interval of</w:t>
       </w:r>
       <w:r>
         <w:t xml:space="preserve"> </w:t>
@@ -1955,7 +2386,25 @@
         <w:t xml:space="preserve"> </w:t>
       </w:r>
       <w:r>
-        <w:t xml:space="preserve">rows. For sensor</w:t>
+        <w:t xml:space="preserve">rows; sensor 0326 has 649 such intervals covering 4,978 hours. Section 4.2 counts 17,317 rows for the same sensor because those experiments do not use occupancy; the 307 extra rows are bins with no occupancy value.</w:t>
+      </w:r>
+    </w:p>
+    <w:p>
+      <w:pPr>
+        <w:pStyle w:val="BodyText"/>
+      </w:pPr>
+      <w:r>
+        <w:rPr>
+          <w:bCs/>
+          <w:b/>
+        </w:rPr>
+        <w:t xml:space="preserve">Invalid.</w:t>
+      </w:r>
+      <w:r>
+        <w:t xml:space="preserve"> </w:t>
+      </w:r>
+      <w:r>
+        <w:t xml:space="preserve">Three checks apply to the raw data. A reading received more than a day after its own timestamp is a re-sent stale packet, not a measurement; three sensors consist entirely of these (Section 4.2). Failed reads (no value) and malformed JSON payloads are skipped when the log is loaded. For a forecast query,</w:t>
       </w:r>
       <w:r>
         <w:t xml:space="preserve"> </w:t>
@@ -1964,23 +2413,41 @@
         <w:rPr>
           <w:rStyle w:val="VerbatimChar"/>
         </w:rPr>
-        <w:t xml:space="preserve">6012002000326</w:t>
-      </w:r>
-      <w:r>
-        <w:t xml:space="preserve"> </w:t>
-      </w:r>
-      <w:r>
-        <w:t xml:space="preserve">there are 649 such intervals covering 4,978 hours. Section 4.2 applies the same rule to every sensor.</w:t>
+        <w:t xml:space="preserve">validate_query</w:t>
+      </w:r>
+      <w:r>
+        <w:t xml:space="preserve"> </w:t>
+      </w:r>
+      <w:r>
+        <w:t xml:space="preserve">rejects values outside the valid domain with the reason, and the demonstration program refuses to predict from them.</w:t>
+      </w:r>
+    </w:p>
+    <w:p>
+      <w:pPr>
+        <w:pStyle w:val="BodyText"/>
+      </w:pPr>
+      <w:r>
+        <w:rPr>
+          <w:bCs/>
+          <w:b/>
+        </w:rPr>
+        <w:t xml:space="preserve">Unsupported.</w:t>
+      </w:r>
+      <w:r>
+        <w:t xml:space="preserve"> </w:t>
+      </w:r>
+      <w:r>
+        <w:t xml:space="preserve">Some inputs are valid but outside what the model was built for: CO₂ outside the trained range (flagged as extrapolation), a different room (a model trained on one room is worse than persistence on another, Section 4.2), and a different bin size or horizon (the model must be retrained). These cannot all be detected from one query, so they are stated here and in the README.</w:t>
       </w:r>
     </w:p>
     <w:bookmarkEnd w:id="29"/>
-    <w:bookmarkStart w:id="30" w:name="output"/>
+    <w:bookmarkStart w:id="30" w:name="outputs"/>
     <w:p>
       <w:pPr>
         <w:pStyle w:val="Heading3"/>
       </w:pPr>
       <w:r>
-        <w:t xml:space="preserve">2.4 Output</w:t>
+        <w:t xml:space="preserve">2.5 Outputs</w:t>
       </w:r>
     </w:p>
     <w:tbl>
@@ -1991,9 +2458,9 @@
         <w:jc w:val="start"/>
       </w:tblPr>
       <w:tblGrid>
-        <w:gridCol w:w="1188"/>
-        <w:gridCol w:w="792"/>
-        <w:gridCol w:w="5940"/>
+        <w:gridCol w:w="3168"/>
+        <w:gridCol w:w="739"/>
+        <w:gridCol w:w="4012"/>
       </w:tblGrid>
       <w:tr>
         <w:trPr>
@@ -2031,7 +2498,7 @@
               <w:jc w:val="left"/>
             </w:pPr>
             <w:r>
-              <w:t xml:space="preserve">Description</w:t>
+              <w:t xml:space="preserve">Meaning and intended use</w:t>
             </w:r>
           </w:p>
         </w:tc>
@@ -2045,31 +2512,277 @@
               <w:jc w:val="left"/>
             </w:pPr>
             <w:r>
-              <w:t xml:space="preserve">Predicted CO₂</w:t>
-            </w:r>
-          </w:p>
-        </w:tc>
-        <w:tc>
-          <w:tcPr/>
-          <w:p>
-            <w:pPr>
-              <w:pStyle w:val="Compact"/>
-              <w:jc w:val="left"/>
-            </w:pPr>
-            <w:r>
-              <w:t xml:space="preserve">ppm, continuous</w:t>
-            </w:r>
-          </w:p>
-        </w:tc>
-        <w:tc>
-          <w:tcPr/>
-          <w:p>
-            <w:pPr>
-              <w:pStyle w:val="Compact"/>
-              <w:jc w:val="left"/>
-            </w:pPr>
-            <w:r>
-              <w:t xml:space="preserve">Forecast CO₂ concentration 15 minutes ahead of the current reading</w:t>
+              <w:t xml:space="preserve">Forecast CO₂ for the next 15 minutes</w:t>
+            </w:r>
+          </w:p>
+        </w:tc>
+        <w:tc>
+          <w:tcPr/>
+          <w:p>
+            <w:pPr>
+              <w:pStyle w:val="Compact"/>
+              <w:jc w:val="left"/>
+            </w:pPr>
+            <w:r>
+              <w:t xml:space="preserve">ppm</w:t>
+            </w:r>
+          </w:p>
+        </w:tc>
+        <w:tc>
+          <w:tcPr/>
+          <w:p>
+            <w:pPr>
+              <w:pStyle w:val="Compact"/>
+              <w:jc w:val="left"/>
+            </w:pPr>
+            <w:r>
+              <w:t xml:space="preserve">The main output: an advisory input to the BMS. Typical error 8.35 ppm (MAE, SVR), larger above about 600 ppm, where the models under-predict (Section 4.1)</w:t>
+            </w:r>
+          </w:p>
+        </w:tc>
+      </w:tr>
+      <w:tr>
+        <w:tc>
+          <w:tcPr/>
+          <w:p>
+            <w:pPr>
+              <w:pStyle w:val="Compact"/>
+              <w:jc w:val="left"/>
+            </w:pPr>
+            <w:r>
+              <w:t xml:space="preserve">Extrapolation warning</w:t>
+            </w:r>
+          </w:p>
+        </w:tc>
+        <w:tc>
+          <w:tcPr/>
+          <w:p>
+            <w:pPr>
+              <w:pStyle w:val="Compact"/>
+              <w:jc w:val="left"/>
+            </w:pPr>
+            <w:r>
+              <w:t xml:space="preserve">text</w:t>
+            </w:r>
+          </w:p>
+        </w:tc>
+        <w:tc>
+          <w:tcPr/>
+          <w:p>
+            <w:pPr>
+              <w:pStyle w:val="Compact"/>
+              <w:jc w:val="left"/>
+            </w:pPr>
+            <w:r>
+              <w:t xml:space="preserve">Flags a forecast made outside the trained domain</w:t>
+            </w:r>
+          </w:p>
+        </w:tc>
+      </w:tr>
+      <w:tr>
+        <w:tc>
+          <w:tcPr/>
+          <w:p>
+            <w:pPr>
+              <w:pStyle w:val="Compact"/>
+              <w:jc w:val="left"/>
+            </w:pPr>
+            <w:r>
+              <w:t xml:space="preserve">Model metrics (JSON in</w:t>
+            </w:r>
+            <w:r>
+              <w:t xml:space="preserve"> </w:t>
+            </w:r>
+            <w:r>
+              <w:rPr>
+                <w:rStyle w:val="VerbatimChar"/>
+              </w:rPr>
+              <w:t xml:space="preserve">reports/</w:t>
+            </w:r>
+            <w:r>
+              <w:t xml:space="preserve">)</w:t>
+            </w:r>
+          </w:p>
+        </w:tc>
+        <w:tc>
+          <w:tcPr/>
+          <w:p>
+            <w:pPr>
+              <w:pStyle w:val="Compact"/>
+              <w:jc w:val="left"/>
+            </w:pPr>
+            <w:r>
+              <w:t xml:space="preserve">ppm, R²</w:t>
+            </w:r>
+          </w:p>
+        </w:tc>
+        <w:tc>
+          <w:tcPr/>
+          <w:p>
+            <w:pPr>
+              <w:pStyle w:val="Compact"/>
+              <w:jc w:val="left"/>
+            </w:pPr>
+            <w:r>
+              <w:t xml:space="preserve">Compare methods and select the model (Section 4)</w:t>
+            </w:r>
+          </w:p>
+        </w:tc>
+      </w:tr>
+      <w:tr>
+        <w:tc>
+          <w:tcPr/>
+          <w:p>
+            <w:pPr>
+              <w:pStyle w:val="Compact"/>
+              <w:jc w:val="left"/>
+            </w:pPr>
+            <w:r>
+              <w:t xml:space="preserve">Test-set predictions (CSV in</w:t>
+            </w:r>
+            <w:r>
+              <w:t xml:space="preserve"> </w:t>
+            </w:r>
+            <w:r>
+              <w:rPr>
+                <w:rStyle w:val="VerbatimChar"/>
+              </w:rPr>
+              <w:t xml:space="preserve">reports/</w:t>
+            </w:r>
+            <w:r>
+              <w:t xml:space="preserve">)</w:t>
+            </w:r>
+          </w:p>
+        </w:tc>
+        <w:tc>
+          <w:tcPr/>
+          <w:p>
+            <w:pPr>
+              <w:pStyle w:val="Compact"/>
+              <w:jc w:val="left"/>
+            </w:pPr>
+            <w:r>
+              <w:t xml:space="preserve">ppm</w:t>
+            </w:r>
+          </w:p>
+        </w:tc>
+        <w:tc>
+          <w:tcPr/>
+          <w:p>
+            <w:pPr>
+              <w:pStyle w:val="Compact"/>
+              <w:jc w:val="left"/>
+            </w:pPr>
+            <w:r>
+              <w:t xml:space="preserve">Residual and diagnostic analysis (Section 4.1)</w:t>
+            </w:r>
+          </w:p>
+        </w:tc>
+      </w:tr>
+      <w:tr>
+        <w:tc>
+          <w:tcPr/>
+          <w:p>
+            <w:pPr>
+              <w:pStyle w:val="Compact"/>
+              <w:jc w:val="left"/>
+            </w:pPr>
+            <w:r>
+              <w:t xml:space="preserve">Cumulative CO₂ exposure (JSON in</w:t>
+            </w:r>
+            <w:r>
+              <w:t xml:space="preserve"> </w:t>
+            </w:r>
+            <w:r>
+              <w:rPr>
+                <w:rStyle w:val="VerbatimChar"/>
+              </w:rPr>
+              <w:t xml:space="preserve">reports/</w:t>
+            </w:r>
+            <w:r>
+              <w:t xml:space="preserve">)</w:t>
+            </w:r>
+          </w:p>
+        </w:tc>
+        <w:tc>
+          <w:tcPr/>
+          <w:p>
+            <w:pPr>
+              <w:pStyle w:val="Compact"/>
+              <w:jc w:val="left"/>
+            </w:pPr>
+            <w:r>
+              <w:t xml:space="preserve">ppm·h</w:t>
+            </w:r>
+          </w:p>
+        </w:tc>
+        <w:tc>
+          <w:tcPr/>
+          <w:p>
+            <w:pPr>
+              <w:pStyle w:val="Compact"/>
+              <w:jc w:val="left"/>
+            </w:pPr>
+            <w:r>
+              <w:t xml:space="preserve">Occupant exposure over a period; verifies the integration methods (Section 5.4)</w:t>
+            </w:r>
+          </w:p>
+        </w:tc>
+      </w:tr>
+      <w:tr>
+        <w:tc>
+          <w:tcPr/>
+          <w:p>
+            <w:pPr>
+              <w:pStyle w:val="Compact"/>
+              <w:jc w:val="left"/>
+            </w:pPr>
+            <w:r>
+              <w:t xml:space="preserve">Sensor audit results (JSON in</w:t>
+            </w:r>
+            <w:r>
+              <w:t xml:space="preserve"> </w:t>
+            </w:r>
+            <w:r>
+              <w:rPr>
+                <w:rStyle w:val="VerbatimChar"/>
+              </w:rPr>
+              <w:t xml:space="preserve">reports/</w:t>
+            </w:r>
+            <w:r>
+              <w:t xml:space="preserve">)</w:t>
+            </w:r>
+          </w:p>
+        </w:tc>
+        <w:tc>
+          <w:tcPr/>
+          <w:p>
+            <w:pPr>
+              <w:pStyle w:val="Compact"/>
+              <w:jc w:val="left"/>
+            </w:pPr>
+            <w:r>
+              <w:t xml:space="preserve">Pearson</w:t>
+            </w:r>
+            <w:r>
+              <w:t xml:space="preserve"> </w:t>
+            </w:r>
+            <m:oMath>
+              <m:r>
+                <m:t>r</m:t>
+              </m:r>
+            </m:oMath>
+          </w:p>
+        </w:tc>
+        <w:tc>
+          <w:tcPr/>
+          <w:p>
+            <w:pPr>
+              <w:pStyle w:val="Compact"/>
+              <w:jc w:val="left"/>
+            </w:pPr>
+            <w:r>
+              <w:t xml:space="preserve">Whether a sensor measures real conditions and which zone it serves (Sections 5.3, 6)</w:t>
             </w:r>
           </w:p>
         </w:tc>
@@ -2080,7 +2793,7 @@
         <w:pStyle w:val="BodyText"/>
       </w:pPr>
       <w:r>
-        <w:t xml:space="preserve">The model only forecasts; thresholds and ventilation commands belong to the building management system. A practical deployment rule might set an early-warning trigger at 750 ppm — 50 ppm below 800 ppm, a common stricter indoor-air-quality target than the 1000 ppm guideline in Section 1.1. The 50 ppm margin is about six times the MAE and twice the RMSE (Section 4), and matters most at high CO₂, where the models under-predict (Section 4.1).</w:t>
+        <w:t xml:space="preserve">The model only forecasts; thresholds and ventilation commands belong to the BMS. A practical rule might set an early-warning trigger at 750 ppm, 50 ppm below 800 ppm, a common stricter target than the 1000 ppm guideline. The 50 ppm margin is about six times the MAE and twice the RMSE (Section 4). Inputs and outputs of each function (types, units and shapes) are documented in the docstrings and the generated HTML documentation.</w:t>
       </w:r>
     </w:p>
     <w:p>
@@ -4057,7 +4770,7 @@
         <w:pStyle w:val="BodyText"/>
       </w:pPr>
       <w:r>
-        <w:t xml:space="preserve">Predicted-vs-actual makes the R² numbers concrete: all four point clouds hug y=x below 550 ppm, then fall well short of it as actual CO2 rises past 600 ppm. The residual plots show the same effect directionally: residuals sit near zero typically but turn increasingly negative as predicted CO2 rises, rather than scattering symmetrically — a model under-responding to its most extreme inputs, consistent with the training data being dominated by the 400-550 ppm range (Section 2.3).</w:t>
+        <w:t xml:space="preserve">Predicted-vs-actual makes the R² numbers concrete: all four point clouds hug y=x below 550 ppm, then fall well short of it as actual CO2 rises past 600 ppm. The residual plots show the same effect directionally: residuals sit near zero typically but turn increasingly negative as predicted CO2 rises, rather than scattering symmetrically — a model under-responding to its most extreme inputs, consistent with the training data being dominated by the 400-550 ppm range (Section 2.4).</w:t>
       </w:r>
     </w:p>
     <w:bookmarkEnd w:id="45"/>
@@ -4075,7 +4788,7 @@
         <w:pStyle w:val="FirstParagraph"/>
       </w:pPr>
       <w:r>
-        <w:t xml:space="preserve">Rather than accepting or rejecting whole sensors, the unbroken-interval rule (Section 2.3) was applied to all five: any interval of at least 75 minutes is usable. Comparing each reading’s timestamp with the server receive time (</w:t>
+        <w:t xml:space="preserve">Rather than accepting or rejecting whole sensors, the unbroken-interval rule (Section 2.4) was applied to all five: any interval of at least 75 minutes is usable. Comparing each reading’s timestamp with the server receive time (</w:t>
       </w:r>
       <w:r>
         <w:rPr>
@@ -7068,7 +7781,7 @@
       <w:pPr>
         <w:numPr>
           <w:ilvl w:val="0"/>
-          <w:numId w:val="1001"/>
+          <w:numId w:val="1002"/>
         </w:numPr>
         <w:pStyle w:val="Compact"/>
       </w:pPr>
@@ -7080,7 +7793,7 @@
       <w:pPr>
         <w:numPr>
           <w:ilvl w:val="0"/>
-          <w:numId w:val="1001"/>
+          <w:numId w:val="1002"/>
         </w:numPr>
         <w:pStyle w:val="Compact"/>
       </w:pPr>
@@ -7092,7 +7805,7 @@
       <w:pPr>
         <w:numPr>
           <w:ilvl w:val="0"/>
-          <w:numId w:val="1001"/>
+          <w:numId w:val="1002"/>
         </w:numPr>
         <w:pStyle w:val="Compact"/>
       </w:pPr>
@@ -7104,7 +7817,7 @@
       <w:pPr>
         <w:numPr>
           <w:ilvl w:val="0"/>
-          <w:numId w:val="1001"/>
+          <w:numId w:val="1002"/>
         </w:numPr>
         <w:pStyle w:val="Compact"/>
       </w:pPr>
@@ -7116,31 +7829,80 @@
       <w:pPr>
         <w:numPr>
           <w:ilvl w:val="0"/>
-          <w:numId w:val="1001"/>
+          <w:numId w:val="1002"/>
         </w:numPr>
         <w:pStyle w:val="Compact"/>
       </w:pPr>
       <w:r>
-        <w:t xml:space="preserve">ASHRAE Standard 62.1: Ventilation and Acceptable Indoor Air Quality. American Society of Heating, Refrigerating and Air-Conditioning Engineers, 2022.</w:t>
+        <w:t xml:space="preserve">ACGIH. Carbon dioxide: TLV-TWA 5000 ppm. American Conference of Governmental Industrial Hygienists; also OSHA Permissible Exposure Limit, 29 CFR 1910.1000 Table Z-1 (5000 ppm, 8-hour TWA).</w:t>
       </w:r>
     </w:p>
     <w:p>
       <w:pPr>
         <w:numPr>
           <w:ilvl w:val="0"/>
-          <w:numId w:val="1001"/>
+          <w:numId w:val="1002"/>
         </w:numPr>
         <w:pStyle w:val="Compact"/>
       </w:pPr>
       <w:r>
-        <w:t xml:space="preserve">ASHRAE Position Document on Indoor Carbon Dioxide. American Society of Heating, Refrigerating and Air-Conditioning Engineers, 2022.</w:t>
+        <w:t xml:space="preserve">ASHRAE (2022a). Standard 62.1: Ventilation and Acceptable Indoor Air Quality. American Society of Heating, Refrigerating and Air-Conditioning Engineers.</w:t>
       </w:r>
     </w:p>
     <w:p>
       <w:pPr>
         <w:numPr>
           <w:ilvl w:val="0"/>
-          <w:numId w:val="1001"/>
+          <w:numId w:val="1002"/>
+        </w:numPr>
+        <w:pStyle w:val="Compact"/>
+      </w:pPr>
+      <w:r>
+        <w:t xml:space="preserve">ASHRAE (2022b). Position Document on Indoor Carbon Dioxide. American Society of Heating, Refrigerating and Air-Conditioning Engineers.</w:t>
+      </w:r>
+    </w:p>
+    <w:p>
+      <w:pPr>
+        <w:numPr>
+          <w:ilvl w:val="0"/>
+          <w:numId w:val="1002"/>
+        </w:numPr>
+        <w:pStyle w:val="Compact"/>
+      </w:pPr>
+      <w:r>
+        <w:t xml:space="preserve">Emmerich, S. J. &amp; Persily, A. K. (2001). State-of-the-Art Review of CO₂ Demand Controlled Ventilation Technology and Application. NISTIR 6729, National Institute of Standards and Technology.</w:t>
+      </w:r>
+    </w:p>
+    <w:p>
+      <w:pPr>
+        <w:numPr>
+          <w:ilvl w:val="0"/>
+          <w:numId w:val="1002"/>
+        </w:numPr>
+        <w:pStyle w:val="Compact"/>
+      </w:pPr>
+      <w:r>
+        <w:t xml:space="preserve">Pérez-Lombard, L., Ortiz, J. &amp; Pout, C. (2008). A review on buildings energy consumption information.</w:t>
+      </w:r>
+      <w:r>
+        <w:t xml:space="preserve"> </w:t>
+      </w:r>
+      <w:r>
+        <w:rPr>
+          <w:iCs/>
+          <w:i/>
+        </w:rPr>
+        <w:t xml:space="preserve">Energy and Buildings</w:t>
+      </w:r>
+      <w:r>
+        <w:t xml:space="preserve">, 40(3), 394–398.</w:t>
+      </w:r>
+    </w:p>
+    <w:p>
+      <w:pPr>
+        <w:numPr>
+          <w:ilvl w:val="0"/>
+          <w:numId w:val="1002"/>
         </w:numPr>
         <w:pStyle w:val="Compact"/>
       </w:pPr>
@@ -7165,7 +7927,7 @@
       <w:pPr>
         <w:numPr>
           <w:ilvl w:val="0"/>
-          <w:numId w:val="1001"/>
+          <w:numId w:val="1002"/>
         </w:numPr>
         <w:pStyle w:val="Compact"/>
       </w:pPr>
@@ -7190,7 +7952,7 @@
       <w:pPr>
         <w:numPr>
           <w:ilvl w:val="0"/>
-          <w:numId w:val="1001"/>
+          <w:numId w:val="1002"/>
         </w:numPr>
         <w:pStyle w:val="Compact"/>
       </w:pPr>
@@ -7202,7 +7964,7 @@
       <w:pPr>
         <w:numPr>
           <w:ilvl w:val="0"/>
-          <w:numId w:val="1001"/>
+          <w:numId w:val="1002"/>
         </w:numPr>
         <w:pStyle w:val="Compact"/>
       </w:pPr>
@@ -7211,7 +7973,72 @@
       </w:r>
     </w:p>
     <w:bookmarkEnd w:id="67"/>
-    <w:bookmarkEnd w:id="68"/>
+    <w:bookmarkStart w:id="71" w:name="appendix-a-data-pipeline"/>
+    <w:p>
+      <w:pPr>
+        <w:pStyle w:val="Heading2"/>
+      </w:pPr>
+      <w:r>
+        <w:t xml:space="preserve">Appendix A: Data Pipeline</w:t>
+      </w:r>
+    </w:p>
+    <w:p>
+      <w:pPr>
+        <w:pStyle w:val="CaptionedFigure"/>
+      </w:pPr>
+      <w:r>
+        <w:drawing>
+          <wp:inline>
+            <wp:extent cx="3291840" cy="1611195"/>
+            <wp:effectExtent b="0" l="0" r="0" t="0"/>
+            <wp:docPr descr="Data pipeline: raw candidate timestamps versus dropped rows versus rows retained for modelling (Section 2.4)" title="" id="69" name="Picture"/>
+            <a:graphic>
+              <a:graphicData uri="http://schemas.openxmlformats.org/drawingml/2006/picture">
+                <pic:pic>
+                  <pic:nvPicPr>
+                    <pic:cNvPr descr="chart_data_pipeline.png" id="70" name="Picture"/>
+                    <pic:cNvPicPr>
+                      <a:picLocks noChangeArrowheads="1" noChangeAspect="1"/>
+                    </pic:cNvPicPr>
+                  </pic:nvPicPr>
+                  <pic:blipFill>
+                    <a:blip r:embed="rId68"/>
+                    <a:stretch>
+                      <a:fillRect/>
+                    </a:stretch>
+                  </pic:blipFill>
+                  <pic:spPr bwMode="auto">
+                    <a:xfrm>
+                      <a:off x="0" y="0"/>
+                      <a:ext cx="3291840" cy="1611195"/>
+                    </a:xfrm>
+                    <a:prstGeom prst="rect">
+                      <a:avLst/>
+                    </a:prstGeom>
+                    <a:noFill/>
+                    <a:ln w="9525">
+                      <a:noFill/>
+                      <a:headEnd/>
+                      <a:tailEnd/>
+                    </a:ln>
+                  </pic:spPr>
+                </pic:pic>
+              </a:graphicData>
+            </a:graphic>
+          </wp:inline>
+        </w:drawing>
+      </w:r>
+    </w:p>
+    <w:p>
+      <w:pPr>
+        <w:pStyle w:val="ImageCaption"/>
+      </w:pPr>
+      <w:r>
+        <w:t xml:space="preserve">Data pipeline: raw candidate timestamps versus dropped rows versus rows retained for modelling (Section 2.4)</w:t>
+      </w:r>
+    </w:p>
+    <w:bookmarkEnd w:id="71"/>
+    <w:bookmarkEnd w:id="72"/>
     <w:sectPr>
       <w:pgSz w:h="16838" w:w="11906"/>
       <w:pgMar w:bottom="1080" w:footer="720" w:gutter="0" w:header="720" w:left="1080" w:right="1080" w:top="1080"/>
@@ -7401,6 +8228,9 @@
     <w:abstractNumId w:val="990"/>
   </w:num>
   <w:num w:numId="1001">
+    <w:abstractNumId w:val="991"/>
+  </w:num>
+  <w:num w:numId="1002">
     <w:abstractNumId w:val="991"/>
   </w:num>
 </w:numbering>

</xml_diff>